<commit_message>
fix: add requisitos documents
</commit_message>
<xml_diff>
--- a/docs/Projecto de um contador de energia.docx
+++ b/docs/Projecto de um contador de energia.docx
@@ -738,7 +738,6 @@
           </mc:Fallback>
         </mc:AlternateContent>
       </w:r>
-      <w:bookmarkStart w:id="0" w:name="_GoBack"/>
       <w:r>
         <w:rPr>
           <w:b/>
@@ -787,7 +786,3454 @@
           </wp:inline>
         </w:drawing>
       </w:r>
-      <w:bookmarkEnd w:id="0"/>
+    </w:p>
+    <w:p/>
+    <w:p/>
+    <w:p/>
+    <w:p/>
+    <w:p/>
+    <w:p/>
+    <w:p/>
+    <w:p/>
+    <w:p/>
+    <w:p/>
+    <w:p/>
+    <w:p>
+      <w:pPr>
+        <w:tabs>
+          <w:tab w:val="left" w:pos="930"/>
+        </w:tabs>
+      </w:pPr>
+      <w:r>
+        <w:tab/>
+      </w:r>
+    </w:p>
+    <w:p>
+      <w:r>
+        <w:br w:type="page"/>
+      </w:r>
+    </w:p>
+    <w:p>
+      <w:pPr>
+        <w:tabs>
+          <w:tab w:val="left" w:pos="930"/>
+        </w:tabs>
+        <w:jc w:val="center"/>
+        <w:rPr>
+          <w:b/>
+          <w:sz w:val="28"/>
+          <w:szCs w:val="28"/>
+        </w:rPr>
+      </w:pPr>
+      <w:r>
+        <w:rPr>
+          <w:b/>
+          <w:sz w:val="28"/>
+          <w:szCs w:val="28"/>
+        </w:rPr>
+        <w:lastRenderedPageBreak/>
+        <w:t>Descrição dos casos de uso do sistema</w:t>
+      </w:r>
+    </w:p>
+    <w:tbl>
+      <w:tblPr>
+        <w:tblStyle w:val="TabeladeGrelha4-Destaque12"/>
+        <w:tblW w:w="0" w:type="auto"/>
+        <w:tblInd w:w="0" w:type="dxa"/>
+        <w:tblLook w:val="04A0" w:firstRow="1" w:lastRow="0" w:firstColumn="1" w:lastColumn="0" w:noHBand="0" w:noVBand="1"/>
+      </w:tblPr>
+      <w:tblGrid>
+        <w:gridCol w:w="4499"/>
+        <w:gridCol w:w="4221"/>
+      </w:tblGrid>
+      <w:tr>
+        <w:trPr>
+          <w:cnfStyle w:val="100000000000" w:firstRow="1" w:lastRow="0" w:firstColumn="0" w:lastColumn="0" w:oddVBand="0" w:evenVBand="0" w:oddHBand="0" w:evenHBand="0" w:firstRowFirstColumn="0" w:firstRowLastColumn="0" w:lastRowFirstColumn="0" w:lastRowLastColumn="0"/>
+          <w:trHeight w:val="418"/>
+        </w:trPr>
+        <w:tc>
+          <w:tcPr>
+            <w:cnfStyle w:val="001000000000" w:firstRow="0" w:lastRow="0" w:firstColumn="1" w:lastColumn="0" w:oddVBand="0" w:evenVBand="0" w:oddHBand="0" w:evenHBand="0" w:firstRowFirstColumn="0" w:firstRowLastColumn="0" w:lastRowFirstColumn="0" w:lastRowLastColumn="0"/>
+            <w:tcW w:w="4508" w:type="dxa"/>
+            <w:tcBorders>
+              <w:right w:val="nil"/>
+            </w:tcBorders>
+            <w:vAlign w:val="center"/>
+            <w:hideMark/>
+          </w:tcPr>
+          <w:p>
+            <w:pPr>
+              <w:rPr>
+                <w:rFonts w:ascii="Arial" w:hAnsi="Arial"/>
+              </w:rPr>
+            </w:pPr>
+            <w:r>
+              <w:t>Nome do caso de uso</w:t>
+            </w:r>
+          </w:p>
+        </w:tc>
+        <w:tc>
+          <w:tcPr>
+            <w:tcW w:w="4508" w:type="dxa"/>
+            <w:tcBorders>
+              <w:left w:val="nil"/>
+            </w:tcBorders>
+            <w:vAlign w:val="center"/>
+            <w:hideMark/>
+          </w:tcPr>
+          <w:p>
+            <w:pPr>
+              <w:pStyle w:val="PargrafodaLista"/>
+              <w:numPr>
+                <w:ilvl w:val="0"/>
+                <w:numId w:val="4"/>
+              </w:numPr>
+              <w:jc w:val="both"/>
+              <w:cnfStyle w:val="100000000000" w:firstRow="1" w:lastRow="0" w:firstColumn="0" w:lastColumn="0" w:oddVBand="0" w:evenVBand="0" w:oddHBand="0" w:evenHBand="0" w:firstRowFirstColumn="0" w:firstRowLastColumn="0" w:lastRowFirstColumn="0" w:lastRowLastColumn="0"/>
+            </w:pPr>
+            <w:r>
+              <w:t>Registar funcionário</w:t>
+            </w:r>
+          </w:p>
+        </w:tc>
+      </w:tr>
+      <w:tr>
+        <w:trPr>
+          <w:cnfStyle w:val="000000100000" w:firstRow="0" w:lastRow="0" w:firstColumn="0" w:lastColumn="0" w:oddVBand="0" w:evenVBand="0" w:oddHBand="1" w:evenHBand="0" w:firstRowFirstColumn="0" w:firstRowLastColumn="0" w:lastRowFirstColumn="0" w:lastRowLastColumn="0"/>
+        </w:trPr>
+        <w:tc>
+          <w:tcPr>
+            <w:cnfStyle w:val="001000000000" w:firstRow="0" w:lastRow="0" w:firstColumn="1" w:lastColumn="0" w:oddVBand="0" w:evenVBand="0" w:oddHBand="0" w:evenHBand="0" w:firstRowFirstColumn="0" w:firstRowLastColumn="0" w:lastRowFirstColumn="0" w:lastRowLastColumn="0"/>
+            <w:tcW w:w="4508" w:type="dxa"/>
+            <w:tcBorders>
+              <w:top w:val="single" w:sz="4" w:space="0" w:color="95B3D7" w:themeColor="accent1" w:themeTint="99"/>
+              <w:left w:val="single" w:sz="4" w:space="0" w:color="95B3D7" w:themeColor="accent1" w:themeTint="99"/>
+              <w:bottom w:val="single" w:sz="4" w:space="0" w:color="95B3D7" w:themeColor="accent1" w:themeTint="99"/>
+              <w:right w:val="single" w:sz="4" w:space="0" w:color="95B3D7" w:themeColor="accent1" w:themeTint="99"/>
+            </w:tcBorders>
+            <w:vAlign w:val="center"/>
+            <w:hideMark/>
+          </w:tcPr>
+          <w:p>
+            <w:pPr>
+              <w:rPr>
+                <w:rFonts w:ascii="Arial" w:hAnsi="Arial"/>
+              </w:rPr>
+            </w:pPr>
+            <w:r>
+              <w:t>Autor</w:t>
+            </w:r>
+          </w:p>
+        </w:tc>
+        <w:tc>
+          <w:tcPr>
+            <w:tcW w:w="4508" w:type="dxa"/>
+            <w:tcBorders>
+              <w:top w:val="single" w:sz="4" w:space="0" w:color="95B3D7" w:themeColor="accent1" w:themeTint="99"/>
+              <w:left w:val="single" w:sz="4" w:space="0" w:color="95B3D7" w:themeColor="accent1" w:themeTint="99"/>
+              <w:bottom w:val="single" w:sz="4" w:space="0" w:color="95B3D7" w:themeColor="accent1" w:themeTint="99"/>
+              <w:right w:val="single" w:sz="4" w:space="0" w:color="95B3D7" w:themeColor="accent1" w:themeTint="99"/>
+            </w:tcBorders>
+            <w:vAlign w:val="center"/>
+            <w:hideMark/>
+          </w:tcPr>
+          <w:p>
+            <w:pPr>
+              <w:cnfStyle w:val="000000100000" w:firstRow="0" w:lastRow="0" w:firstColumn="0" w:lastColumn="0" w:oddVBand="0" w:evenVBand="0" w:oddHBand="1" w:evenHBand="0" w:firstRowFirstColumn="0" w:firstRowLastColumn="0" w:lastRowFirstColumn="0" w:lastRowLastColumn="0"/>
+              <w:rPr>
+                <w:rFonts w:ascii="Arial" w:hAnsi="Arial"/>
+              </w:rPr>
+            </w:pPr>
+            <w:proofErr w:type="spellStart"/>
+            <w:r>
+              <w:t>Diretor</w:t>
+            </w:r>
+            <w:proofErr w:type="spellEnd"/>
+          </w:p>
+        </w:tc>
+      </w:tr>
+      <w:tr>
+        <w:tc>
+          <w:tcPr>
+            <w:cnfStyle w:val="001000000000" w:firstRow="0" w:lastRow="0" w:firstColumn="1" w:lastColumn="0" w:oddVBand="0" w:evenVBand="0" w:oddHBand="0" w:evenHBand="0" w:firstRowFirstColumn="0" w:firstRowLastColumn="0" w:lastRowFirstColumn="0" w:lastRowLastColumn="0"/>
+            <w:tcW w:w="4508" w:type="dxa"/>
+            <w:tcBorders>
+              <w:top w:val="single" w:sz="4" w:space="0" w:color="95B3D7" w:themeColor="accent1" w:themeTint="99"/>
+              <w:left w:val="single" w:sz="4" w:space="0" w:color="95B3D7" w:themeColor="accent1" w:themeTint="99"/>
+              <w:bottom w:val="single" w:sz="4" w:space="0" w:color="95B3D7" w:themeColor="accent1" w:themeTint="99"/>
+              <w:right w:val="single" w:sz="4" w:space="0" w:color="95B3D7" w:themeColor="accent1" w:themeTint="99"/>
+            </w:tcBorders>
+            <w:vAlign w:val="center"/>
+            <w:hideMark/>
+          </w:tcPr>
+          <w:p>
+            <w:pPr>
+              <w:rPr>
+                <w:rFonts w:ascii="Arial" w:hAnsi="Arial"/>
+              </w:rPr>
+            </w:pPr>
+            <w:r>
+              <w:t>Propósito</w:t>
+            </w:r>
+          </w:p>
+        </w:tc>
+        <w:tc>
+          <w:tcPr>
+            <w:tcW w:w="4508" w:type="dxa"/>
+            <w:tcBorders>
+              <w:top w:val="single" w:sz="4" w:space="0" w:color="95B3D7" w:themeColor="accent1" w:themeTint="99"/>
+              <w:left w:val="single" w:sz="4" w:space="0" w:color="95B3D7" w:themeColor="accent1" w:themeTint="99"/>
+              <w:bottom w:val="single" w:sz="4" w:space="0" w:color="95B3D7" w:themeColor="accent1" w:themeTint="99"/>
+              <w:right w:val="single" w:sz="4" w:space="0" w:color="95B3D7" w:themeColor="accent1" w:themeTint="99"/>
+            </w:tcBorders>
+            <w:vAlign w:val="center"/>
+            <w:hideMark/>
+          </w:tcPr>
+          <w:p>
+            <w:pPr>
+              <w:cnfStyle w:val="000000000000" w:firstRow="0" w:lastRow="0" w:firstColumn="0" w:lastColumn="0" w:oddVBand="0" w:evenVBand="0" w:oddHBand="0" w:evenHBand="0" w:firstRowFirstColumn="0" w:firstRowLastColumn="0" w:lastRowFirstColumn="0" w:lastRowLastColumn="0"/>
+              <w:rPr>
+                <w:rFonts w:ascii="Arial" w:hAnsi="Arial"/>
+              </w:rPr>
+            </w:pPr>
+            <w:proofErr w:type="spellStart"/>
+            <w:r>
+              <w:t>Registrar</w:t>
+            </w:r>
+            <w:proofErr w:type="spellEnd"/>
+            <w:r>
+              <w:t xml:space="preserve"> os funcionários</w:t>
+            </w:r>
+          </w:p>
+        </w:tc>
+      </w:tr>
+      <w:tr>
+        <w:trPr>
+          <w:cnfStyle w:val="000000100000" w:firstRow="0" w:lastRow="0" w:firstColumn="0" w:lastColumn="0" w:oddVBand="0" w:evenVBand="0" w:oddHBand="1" w:evenHBand="0" w:firstRowFirstColumn="0" w:firstRowLastColumn="0" w:lastRowFirstColumn="0" w:lastRowLastColumn="0"/>
+          <w:trHeight w:val="1593"/>
+        </w:trPr>
+        <w:tc>
+          <w:tcPr>
+            <w:cnfStyle w:val="001000000000" w:firstRow="0" w:lastRow="0" w:firstColumn="1" w:lastColumn="0" w:oddVBand="0" w:evenVBand="0" w:oddHBand="0" w:evenHBand="0" w:firstRowFirstColumn="0" w:firstRowLastColumn="0" w:lastRowFirstColumn="0" w:lastRowLastColumn="0"/>
+            <w:tcW w:w="9016" w:type="dxa"/>
+            <w:gridSpan w:val="2"/>
+            <w:tcBorders>
+              <w:top w:val="single" w:sz="4" w:space="0" w:color="95B3D7" w:themeColor="accent1" w:themeTint="99"/>
+              <w:left w:val="single" w:sz="4" w:space="0" w:color="95B3D7" w:themeColor="accent1" w:themeTint="99"/>
+              <w:bottom w:val="single" w:sz="4" w:space="0" w:color="95B3D7" w:themeColor="accent1" w:themeTint="99"/>
+              <w:right w:val="single" w:sz="4" w:space="0" w:color="95B3D7" w:themeColor="accent1" w:themeTint="99"/>
+            </w:tcBorders>
+            <w:vAlign w:val="center"/>
+            <w:hideMark/>
+          </w:tcPr>
+          <w:p>
+            <w:pPr>
+              <w:rPr>
+                <w:rFonts w:ascii="Arial" w:hAnsi="Arial"/>
+              </w:rPr>
+            </w:pPr>
+            <w:r>
+              <w:t xml:space="preserve">Resumo: </w:t>
+            </w:r>
+            <w:r>
+              <w:rPr>
+                <w:b w:val="0"/>
+                <w:bCs w:val="0"/>
+              </w:rPr>
+              <w:t xml:space="preserve">O </w:t>
+            </w:r>
+            <w:proofErr w:type="spellStart"/>
+            <w:r>
+              <w:rPr>
+                <w:b w:val="0"/>
+                <w:bCs w:val="0"/>
+              </w:rPr>
+              <w:t>diretor</w:t>
+            </w:r>
+            <w:proofErr w:type="spellEnd"/>
+            <w:r>
+              <w:rPr>
+                <w:b w:val="0"/>
+                <w:bCs w:val="0"/>
+              </w:rPr>
+              <w:t xml:space="preserve"> precisa registar todos os funcionários</w:t>
+            </w:r>
+            <w:r>
+              <w:rPr>
+                <w:b w:val="0"/>
+                <w:bCs w:val="0"/>
+              </w:rPr>
+              <w:t xml:space="preserve">. </w:t>
+            </w:r>
+          </w:p>
+        </w:tc>
+      </w:tr>
+      <w:tr>
+        <w:trPr>
+          <w:trHeight w:val="566"/>
+        </w:trPr>
+        <w:tc>
+          <w:tcPr>
+            <w:cnfStyle w:val="001000000000" w:firstRow="0" w:lastRow="0" w:firstColumn="1" w:lastColumn="0" w:oddVBand="0" w:evenVBand="0" w:oddHBand="0" w:evenHBand="0" w:firstRowFirstColumn="0" w:firstRowLastColumn="0" w:lastRowFirstColumn="0" w:lastRowLastColumn="0"/>
+            <w:tcW w:w="4508" w:type="dxa"/>
+            <w:tcBorders>
+              <w:top w:val="single" w:sz="4" w:space="0" w:color="95B3D7" w:themeColor="accent1" w:themeTint="99"/>
+              <w:left w:val="single" w:sz="4" w:space="0" w:color="95B3D7" w:themeColor="accent1" w:themeTint="99"/>
+              <w:bottom w:val="single" w:sz="4" w:space="0" w:color="95B3D7" w:themeColor="accent1" w:themeTint="99"/>
+              <w:right w:val="single" w:sz="4" w:space="0" w:color="95B3D7" w:themeColor="accent1" w:themeTint="99"/>
+            </w:tcBorders>
+            <w:vAlign w:val="center"/>
+            <w:hideMark/>
+          </w:tcPr>
+          <w:p>
+            <w:pPr>
+              <w:rPr>
+                <w:rFonts w:ascii="Arial" w:hAnsi="Arial"/>
+              </w:rPr>
+            </w:pPr>
+            <w:r>
+              <w:t>Pré-condições</w:t>
+            </w:r>
+          </w:p>
+        </w:tc>
+        <w:tc>
+          <w:tcPr>
+            <w:tcW w:w="4508" w:type="dxa"/>
+            <w:tcBorders>
+              <w:top w:val="single" w:sz="4" w:space="0" w:color="95B3D7" w:themeColor="accent1" w:themeTint="99"/>
+              <w:left w:val="single" w:sz="4" w:space="0" w:color="95B3D7" w:themeColor="accent1" w:themeTint="99"/>
+              <w:bottom w:val="single" w:sz="4" w:space="0" w:color="95B3D7" w:themeColor="accent1" w:themeTint="99"/>
+              <w:right w:val="single" w:sz="4" w:space="0" w:color="95B3D7" w:themeColor="accent1" w:themeTint="99"/>
+            </w:tcBorders>
+            <w:vAlign w:val="center"/>
+            <w:hideMark/>
+          </w:tcPr>
+          <w:p>
+            <w:pPr>
+              <w:cnfStyle w:val="000000000000" w:firstRow="0" w:lastRow="0" w:firstColumn="0" w:lastColumn="0" w:oddVBand="0" w:evenVBand="0" w:oddHBand="0" w:evenHBand="0" w:firstRowFirstColumn="0" w:firstRowLastColumn="0" w:lastRowFirstColumn="0" w:lastRowLastColumn="0"/>
+              <w:rPr>
+                <w:rFonts w:ascii="Arial" w:hAnsi="Arial"/>
+              </w:rPr>
+            </w:pPr>
+            <w:r>
+              <w:t xml:space="preserve">Ser o </w:t>
+            </w:r>
+            <w:r>
+              <w:t>director da empresa</w:t>
+            </w:r>
+          </w:p>
+        </w:tc>
+      </w:tr>
+      <w:tr>
+        <w:trPr>
+          <w:cnfStyle w:val="000000100000" w:firstRow="0" w:lastRow="0" w:firstColumn="0" w:lastColumn="0" w:oddVBand="0" w:evenVBand="0" w:oddHBand="1" w:evenHBand="0" w:firstRowFirstColumn="0" w:firstRowLastColumn="0" w:lastRowFirstColumn="0" w:lastRowLastColumn="0"/>
+          <w:trHeight w:val="566"/>
+        </w:trPr>
+        <w:tc>
+          <w:tcPr>
+            <w:cnfStyle w:val="001000000000" w:firstRow="0" w:lastRow="0" w:firstColumn="1" w:lastColumn="0" w:oddVBand="0" w:evenVBand="0" w:oddHBand="0" w:evenHBand="0" w:firstRowFirstColumn="0" w:firstRowLastColumn="0" w:lastRowFirstColumn="0" w:lastRowLastColumn="0"/>
+            <w:tcW w:w="9016" w:type="dxa"/>
+            <w:gridSpan w:val="2"/>
+            <w:tcBorders>
+              <w:top w:val="single" w:sz="4" w:space="0" w:color="95B3D7" w:themeColor="accent1" w:themeTint="99"/>
+              <w:left w:val="single" w:sz="4" w:space="0" w:color="95B3D7" w:themeColor="accent1" w:themeTint="99"/>
+              <w:bottom w:val="single" w:sz="4" w:space="0" w:color="95B3D7" w:themeColor="accent1" w:themeTint="99"/>
+              <w:right w:val="single" w:sz="4" w:space="0" w:color="95B3D7" w:themeColor="accent1" w:themeTint="99"/>
+            </w:tcBorders>
+            <w:vAlign w:val="center"/>
+            <w:hideMark/>
+          </w:tcPr>
+          <w:p>
+            <w:pPr>
+              <w:jc w:val="center"/>
+              <w:rPr>
+                <w:rFonts w:ascii="Arial" w:hAnsi="Arial"/>
+              </w:rPr>
+            </w:pPr>
+            <w:r>
+              <w:t>Fluxo Básico</w:t>
+            </w:r>
+          </w:p>
+        </w:tc>
+      </w:tr>
+      <w:tr>
+        <w:trPr>
+          <w:trHeight w:val="566"/>
+        </w:trPr>
+        <w:tc>
+          <w:tcPr>
+            <w:cnfStyle w:val="001000000000" w:firstRow="0" w:lastRow="0" w:firstColumn="1" w:lastColumn="0" w:oddVBand="0" w:evenVBand="0" w:oddHBand="0" w:evenHBand="0" w:firstRowFirstColumn="0" w:firstRowLastColumn="0" w:lastRowFirstColumn="0" w:lastRowLastColumn="0"/>
+            <w:tcW w:w="4508" w:type="dxa"/>
+            <w:tcBorders>
+              <w:top w:val="single" w:sz="4" w:space="0" w:color="95B3D7" w:themeColor="accent1" w:themeTint="99"/>
+              <w:left w:val="single" w:sz="4" w:space="0" w:color="95B3D7" w:themeColor="accent1" w:themeTint="99"/>
+              <w:bottom w:val="single" w:sz="4" w:space="0" w:color="95B3D7" w:themeColor="accent1" w:themeTint="99"/>
+              <w:right w:val="single" w:sz="4" w:space="0" w:color="95B3D7" w:themeColor="accent1" w:themeTint="99"/>
+            </w:tcBorders>
+            <w:vAlign w:val="center"/>
+            <w:hideMark/>
+          </w:tcPr>
+          <w:p>
+            <w:pPr>
+              <w:rPr>
+                <w:rFonts w:ascii="Arial" w:hAnsi="Arial"/>
+              </w:rPr>
+            </w:pPr>
+            <w:r>
+              <w:t>Acção do actor</w:t>
+            </w:r>
+          </w:p>
+        </w:tc>
+        <w:tc>
+          <w:tcPr>
+            <w:tcW w:w="4508" w:type="dxa"/>
+            <w:tcBorders>
+              <w:top w:val="single" w:sz="4" w:space="0" w:color="95B3D7" w:themeColor="accent1" w:themeTint="99"/>
+              <w:left w:val="single" w:sz="4" w:space="0" w:color="95B3D7" w:themeColor="accent1" w:themeTint="99"/>
+              <w:bottom w:val="single" w:sz="4" w:space="0" w:color="95B3D7" w:themeColor="accent1" w:themeTint="99"/>
+              <w:right w:val="single" w:sz="4" w:space="0" w:color="95B3D7" w:themeColor="accent1" w:themeTint="99"/>
+            </w:tcBorders>
+            <w:vAlign w:val="center"/>
+            <w:hideMark/>
+          </w:tcPr>
+          <w:p>
+            <w:pPr>
+              <w:cnfStyle w:val="000000000000" w:firstRow="0" w:lastRow="0" w:firstColumn="0" w:lastColumn="0" w:oddVBand="0" w:evenVBand="0" w:oddHBand="0" w:evenHBand="0" w:firstRowFirstColumn="0" w:firstRowLastColumn="0" w:lastRowFirstColumn="0" w:lastRowLastColumn="0"/>
+              <w:rPr>
+                <w:rFonts w:ascii="Arial" w:hAnsi="Arial"/>
+                <w:b/>
+                <w:bCs/>
+              </w:rPr>
+            </w:pPr>
+            <w:r>
+              <w:rPr>
+                <w:b/>
+                <w:bCs/>
+              </w:rPr>
+              <w:t xml:space="preserve">Resposta </w:t>
+            </w:r>
+            <w:r>
+              <w:rPr>
+                <w:b/>
+                <w:bCs/>
+              </w:rPr>
+              <w:t>do Sistema</w:t>
+            </w:r>
+          </w:p>
+        </w:tc>
+      </w:tr>
+      <w:tr>
+        <w:trPr>
+          <w:cnfStyle w:val="000000100000" w:firstRow="0" w:lastRow="0" w:firstColumn="0" w:lastColumn="0" w:oddVBand="0" w:evenVBand="0" w:oddHBand="1" w:evenHBand="0" w:firstRowFirstColumn="0" w:firstRowLastColumn="0" w:lastRowFirstColumn="0" w:lastRowLastColumn="0"/>
+          <w:trHeight w:val="566"/>
+        </w:trPr>
+        <w:tc>
+          <w:tcPr>
+            <w:cnfStyle w:val="001000000000" w:firstRow="0" w:lastRow="0" w:firstColumn="1" w:lastColumn="0" w:oddVBand="0" w:evenVBand="0" w:oddHBand="0" w:evenHBand="0" w:firstRowFirstColumn="0" w:firstRowLastColumn="0" w:lastRowFirstColumn="0" w:lastRowLastColumn="0"/>
+            <w:tcW w:w="4508" w:type="dxa"/>
+            <w:tcBorders>
+              <w:top w:val="single" w:sz="4" w:space="0" w:color="95B3D7" w:themeColor="accent1" w:themeTint="99"/>
+              <w:left w:val="single" w:sz="4" w:space="0" w:color="95B3D7" w:themeColor="accent1" w:themeTint="99"/>
+              <w:bottom w:val="single" w:sz="4" w:space="0" w:color="95B3D7" w:themeColor="accent1" w:themeTint="99"/>
+              <w:right w:val="single" w:sz="4" w:space="0" w:color="95B3D7" w:themeColor="accent1" w:themeTint="99"/>
+            </w:tcBorders>
+            <w:vAlign w:val="center"/>
+          </w:tcPr>
+          <w:p>
+            <w:pPr>
+              <w:pStyle w:val="PargrafodaLista"/>
+              <w:numPr>
+                <w:ilvl w:val="2"/>
+                <w:numId w:val="5"/>
+              </w:numPr>
+              <w:rPr>
+                <w:rFonts w:cstheme="minorHAnsi"/>
+                <w:b w:val="0"/>
+                <w:bCs w:val="0"/>
+              </w:rPr>
+            </w:pPr>
+            <w:r>
+              <w:rPr>
+                <w:rFonts w:cstheme="minorHAnsi"/>
+                <w:b w:val="0"/>
+                <w:bCs w:val="0"/>
+              </w:rPr>
+              <w:t>Clicar em cadastrar funcionário</w:t>
+            </w:r>
+          </w:p>
+          <w:p>
+            <w:pPr>
+              <w:pStyle w:val="PargrafodaLista"/>
+              <w:numPr>
+                <w:ilvl w:val="2"/>
+                <w:numId w:val="5"/>
+              </w:numPr>
+              <w:rPr>
+                <w:rFonts w:cstheme="minorHAnsi"/>
+                <w:b w:val="0"/>
+                <w:bCs w:val="0"/>
+              </w:rPr>
+            </w:pPr>
+            <w:r>
+              <w:rPr>
+                <w:rFonts w:cstheme="minorHAnsi"/>
+                <w:b w:val="0"/>
+                <w:bCs w:val="0"/>
+              </w:rPr>
+              <w:t xml:space="preserve">Inserir os dados como: nome, idade, cargo, nº de identificação, email, contacto </w:t>
+            </w:r>
+          </w:p>
+          <w:p>
+            <w:pPr>
+              <w:pStyle w:val="PargrafodaLista"/>
+              <w:numPr>
+                <w:ilvl w:val="2"/>
+                <w:numId w:val="5"/>
+              </w:numPr>
+              <w:rPr>
+                <w:rFonts w:ascii="Arial" w:hAnsi="Arial"/>
+                <w:b w:val="0"/>
+                <w:bCs w:val="0"/>
+              </w:rPr>
+            </w:pPr>
+            <w:r>
+              <w:rPr>
+                <w:rFonts w:cstheme="minorHAnsi"/>
+                <w:b w:val="0"/>
+                <w:bCs w:val="0"/>
+              </w:rPr>
+              <w:t>Clicar em cadastrar</w:t>
+            </w:r>
+          </w:p>
+        </w:tc>
+        <w:tc>
+          <w:tcPr>
+            <w:tcW w:w="4508" w:type="dxa"/>
+            <w:tcBorders>
+              <w:top w:val="single" w:sz="4" w:space="0" w:color="95B3D7" w:themeColor="accent1" w:themeTint="99"/>
+              <w:left w:val="single" w:sz="4" w:space="0" w:color="95B3D7" w:themeColor="accent1" w:themeTint="99"/>
+              <w:bottom w:val="single" w:sz="4" w:space="0" w:color="95B3D7" w:themeColor="accent1" w:themeTint="99"/>
+              <w:right w:val="single" w:sz="4" w:space="0" w:color="95B3D7" w:themeColor="accent1" w:themeTint="99"/>
+            </w:tcBorders>
+            <w:vAlign w:val="center"/>
+          </w:tcPr>
+          <w:p>
+            <w:pPr>
+              <w:pStyle w:val="PargrafodaLista"/>
+              <w:numPr>
+                <w:ilvl w:val="0"/>
+                <w:numId w:val="6"/>
+              </w:numPr>
+              <w:cnfStyle w:val="000000100000" w:firstRow="0" w:lastRow="0" w:firstColumn="0" w:lastColumn="0" w:oddVBand="0" w:evenVBand="0" w:oddHBand="1" w:evenHBand="0" w:firstRowFirstColumn="0" w:firstRowLastColumn="0" w:lastRowFirstColumn="0" w:lastRowLastColumn="0"/>
+              <w:rPr>
+                <w:rFonts w:ascii="Arial" w:hAnsi="Arial"/>
+              </w:rPr>
+            </w:pPr>
+            <w:r>
+              <w:t>Apresentar o campo de cadastro</w:t>
+            </w:r>
+          </w:p>
+          <w:p>
+            <w:pPr>
+              <w:pStyle w:val="PargrafodaLista"/>
+              <w:numPr>
+                <w:ilvl w:val="0"/>
+                <w:numId w:val="6"/>
+              </w:numPr>
+              <w:cnfStyle w:val="000000100000" w:firstRow="0" w:lastRow="0" w:firstColumn="0" w:lastColumn="0" w:oddVBand="0" w:evenVBand="0" w:oddHBand="1" w:evenHBand="0" w:firstRowFirstColumn="0" w:firstRowLastColumn="0" w:lastRowFirstColumn="0" w:lastRowLastColumn="0"/>
+              <w:rPr>
+                <w:rFonts w:ascii="Arial" w:hAnsi="Arial"/>
+              </w:rPr>
+            </w:pPr>
+            <w:r>
+              <w:t>Validar os dados preenchidos</w:t>
+            </w:r>
+          </w:p>
+          <w:p>
+            <w:pPr>
+              <w:pStyle w:val="PargrafodaLista"/>
+              <w:numPr>
+                <w:ilvl w:val="0"/>
+                <w:numId w:val="6"/>
+              </w:numPr>
+              <w:cnfStyle w:val="000000100000" w:firstRow="0" w:lastRow="0" w:firstColumn="0" w:lastColumn="0" w:oddVBand="0" w:evenVBand="0" w:oddHBand="1" w:evenHBand="0" w:firstRowFirstColumn="0" w:firstRowLastColumn="0" w:lastRowFirstColumn="0" w:lastRowLastColumn="0"/>
+              <w:rPr>
+                <w:rFonts w:ascii="Arial" w:hAnsi="Arial"/>
+              </w:rPr>
+            </w:pPr>
+            <w:r>
+              <w:t xml:space="preserve">Validar o cadastro e </w:t>
+            </w:r>
+            <w:r>
+              <w:t>Imprimir a mensagem sucesso!</w:t>
+            </w:r>
+            <w:r>
+              <w:t xml:space="preserve"> </w:t>
+            </w:r>
+          </w:p>
+          <w:p>
+            <w:pPr>
+              <w:cnfStyle w:val="000000100000" w:firstRow="0" w:lastRow="0" w:firstColumn="0" w:lastColumn="0" w:oddVBand="0" w:evenVBand="0" w:oddHBand="1" w:evenHBand="0" w:firstRowFirstColumn="0" w:firstRowLastColumn="0" w:lastRowFirstColumn="0" w:lastRowLastColumn="0"/>
+              <w:rPr>
+                <w:rFonts w:ascii="Arial" w:hAnsi="Arial"/>
+              </w:rPr>
+            </w:pPr>
+          </w:p>
+        </w:tc>
+      </w:tr>
+    </w:tbl>
+    <w:p>
+      <w:pPr>
+        <w:tabs>
+          <w:tab w:val="left" w:pos="930"/>
+        </w:tabs>
+        <w:jc w:val="center"/>
+        <w:rPr>
+          <w:b/>
+          <w:sz w:val="28"/>
+          <w:szCs w:val="28"/>
+        </w:rPr>
+      </w:pPr>
+    </w:p>
+    <w:p>
+      <w:pPr>
+        <w:rPr>
+          <w:b/>
+          <w:sz w:val="28"/>
+          <w:szCs w:val="28"/>
+        </w:rPr>
+      </w:pPr>
+      <w:r>
+        <w:rPr>
+          <w:b/>
+          <w:sz w:val="28"/>
+          <w:szCs w:val="28"/>
+        </w:rPr>
+        <w:br w:type="page"/>
+      </w:r>
+    </w:p>
+    <w:p>
+      <w:pPr>
+        <w:tabs>
+          <w:tab w:val="left" w:pos="930"/>
+        </w:tabs>
+        <w:jc w:val="center"/>
+        <w:rPr>
+          <w:b/>
+          <w:sz w:val="28"/>
+          <w:szCs w:val="28"/>
+        </w:rPr>
+      </w:pPr>
+    </w:p>
+    <w:p>
+      <w:pPr>
+        <w:tabs>
+          <w:tab w:val="left" w:pos="930"/>
+        </w:tabs>
+        <w:jc w:val="center"/>
+        <w:rPr>
+          <w:b/>
+          <w:sz w:val="28"/>
+          <w:szCs w:val="28"/>
+        </w:rPr>
+      </w:pPr>
+    </w:p>
+    <w:tbl>
+      <w:tblPr>
+        <w:tblStyle w:val="TabeladeGrelha4-Destaque12"/>
+        <w:tblW w:w="0" w:type="auto"/>
+        <w:tblInd w:w="0" w:type="dxa"/>
+        <w:tblLook w:val="04A0" w:firstRow="1" w:lastRow="0" w:firstColumn="1" w:lastColumn="0" w:noHBand="0" w:noVBand="1"/>
+      </w:tblPr>
+      <w:tblGrid>
+        <w:gridCol w:w="4345"/>
+        <w:gridCol w:w="4375"/>
+      </w:tblGrid>
+      <w:tr>
+        <w:trPr>
+          <w:cnfStyle w:val="100000000000" w:firstRow="1" w:lastRow="0" w:firstColumn="0" w:lastColumn="0" w:oddVBand="0" w:evenVBand="0" w:oddHBand="0" w:evenHBand="0" w:firstRowFirstColumn="0" w:firstRowLastColumn="0" w:lastRowFirstColumn="0" w:lastRowLastColumn="0"/>
+          <w:trHeight w:val="418"/>
+        </w:trPr>
+        <w:tc>
+          <w:tcPr>
+            <w:cnfStyle w:val="001000000000" w:firstRow="0" w:lastRow="0" w:firstColumn="1" w:lastColumn="0" w:oddVBand="0" w:evenVBand="0" w:oddHBand="0" w:evenHBand="0" w:firstRowFirstColumn="0" w:firstRowLastColumn="0" w:lastRowFirstColumn="0" w:lastRowLastColumn="0"/>
+            <w:tcW w:w="4508" w:type="dxa"/>
+            <w:tcBorders>
+              <w:right w:val="nil"/>
+            </w:tcBorders>
+            <w:vAlign w:val="center"/>
+            <w:hideMark/>
+          </w:tcPr>
+          <w:p>
+            <w:pPr>
+              <w:rPr>
+                <w:rFonts w:ascii="Arial" w:hAnsi="Arial"/>
+              </w:rPr>
+            </w:pPr>
+            <w:r>
+              <w:t>Nome do caso de uso</w:t>
+            </w:r>
+          </w:p>
+        </w:tc>
+        <w:tc>
+          <w:tcPr>
+            <w:tcW w:w="4508" w:type="dxa"/>
+            <w:tcBorders>
+              <w:left w:val="nil"/>
+            </w:tcBorders>
+            <w:vAlign w:val="center"/>
+            <w:hideMark/>
+          </w:tcPr>
+          <w:p>
+            <w:pPr>
+              <w:pStyle w:val="PargrafodaLista"/>
+              <w:numPr>
+                <w:ilvl w:val="0"/>
+                <w:numId w:val="4"/>
+              </w:numPr>
+              <w:jc w:val="both"/>
+              <w:cnfStyle w:val="100000000000" w:firstRow="1" w:lastRow="0" w:firstColumn="0" w:lastColumn="0" w:oddVBand="0" w:evenVBand="0" w:oddHBand="0" w:evenHBand="0" w:firstRowFirstColumn="0" w:firstRowLastColumn="0" w:lastRowFirstColumn="0" w:lastRowLastColumn="0"/>
+            </w:pPr>
+            <w:r>
+              <w:t>Entrar no sistema</w:t>
+            </w:r>
+          </w:p>
+        </w:tc>
+      </w:tr>
+      <w:tr>
+        <w:trPr>
+          <w:cnfStyle w:val="000000100000" w:firstRow="0" w:lastRow="0" w:firstColumn="0" w:lastColumn="0" w:oddVBand="0" w:evenVBand="0" w:oddHBand="1" w:evenHBand="0" w:firstRowFirstColumn="0" w:firstRowLastColumn="0" w:lastRowFirstColumn="0" w:lastRowLastColumn="0"/>
+        </w:trPr>
+        <w:tc>
+          <w:tcPr>
+            <w:cnfStyle w:val="001000000000" w:firstRow="0" w:lastRow="0" w:firstColumn="1" w:lastColumn="0" w:oddVBand="0" w:evenVBand="0" w:oddHBand="0" w:evenHBand="0" w:firstRowFirstColumn="0" w:firstRowLastColumn="0" w:lastRowFirstColumn="0" w:lastRowLastColumn="0"/>
+            <w:tcW w:w="4508" w:type="dxa"/>
+            <w:tcBorders>
+              <w:top w:val="single" w:sz="4" w:space="0" w:color="95B3D7" w:themeColor="accent1" w:themeTint="99"/>
+              <w:left w:val="single" w:sz="4" w:space="0" w:color="95B3D7" w:themeColor="accent1" w:themeTint="99"/>
+              <w:bottom w:val="single" w:sz="4" w:space="0" w:color="95B3D7" w:themeColor="accent1" w:themeTint="99"/>
+              <w:right w:val="single" w:sz="4" w:space="0" w:color="95B3D7" w:themeColor="accent1" w:themeTint="99"/>
+            </w:tcBorders>
+            <w:vAlign w:val="center"/>
+            <w:hideMark/>
+          </w:tcPr>
+          <w:p>
+            <w:pPr>
+              <w:rPr>
+                <w:rFonts w:ascii="Arial" w:hAnsi="Arial"/>
+              </w:rPr>
+            </w:pPr>
+            <w:r>
+              <w:t>Autor</w:t>
+            </w:r>
+          </w:p>
+        </w:tc>
+        <w:tc>
+          <w:tcPr>
+            <w:tcW w:w="4508" w:type="dxa"/>
+            <w:tcBorders>
+              <w:top w:val="single" w:sz="4" w:space="0" w:color="95B3D7" w:themeColor="accent1" w:themeTint="99"/>
+              <w:left w:val="single" w:sz="4" w:space="0" w:color="95B3D7" w:themeColor="accent1" w:themeTint="99"/>
+              <w:bottom w:val="single" w:sz="4" w:space="0" w:color="95B3D7" w:themeColor="accent1" w:themeTint="99"/>
+              <w:right w:val="single" w:sz="4" w:space="0" w:color="95B3D7" w:themeColor="accent1" w:themeTint="99"/>
+            </w:tcBorders>
+            <w:vAlign w:val="center"/>
+            <w:hideMark/>
+          </w:tcPr>
+          <w:p>
+            <w:pPr>
+              <w:cnfStyle w:val="000000100000" w:firstRow="0" w:lastRow="0" w:firstColumn="0" w:lastColumn="0" w:oddVBand="0" w:evenVBand="0" w:oddHBand="1" w:evenHBand="0" w:firstRowFirstColumn="0" w:firstRowLastColumn="0" w:lastRowFirstColumn="0" w:lastRowLastColumn="0"/>
+              <w:rPr>
+                <w:rFonts w:ascii="Arial" w:hAnsi="Arial"/>
+              </w:rPr>
+            </w:pPr>
+            <w:proofErr w:type="spellStart"/>
+            <w:r>
+              <w:t>Diretor</w:t>
+            </w:r>
+            <w:proofErr w:type="spellEnd"/>
+            <w:r>
+              <w:t xml:space="preserve"> e secretaria</w:t>
+            </w:r>
+          </w:p>
+        </w:tc>
+      </w:tr>
+      <w:tr>
+        <w:tc>
+          <w:tcPr>
+            <w:cnfStyle w:val="001000000000" w:firstRow="0" w:lastRow="0" w:firstColumn="1" w:lastColumn="0" w:oddVBand="0" w:evenVBand="0" w:oddHBand="0" w:evenHBand="0" w:firstRowFirstColumn="0" w:firstRowLastColumn="0" w:lastRowFirstColumn="0" w:lastRowLastColumn="0"/>
+            <w:tcW w:w="4508" w:type="dxa"/>
+            <w:tcBorders>
+              <w:top w:val="single" w:sz="4" w:space="0" w:color="95B3D7" w:themeColor="accent1" w:themeTint="99"/>
+              <w:left w:val="single" w:sz="4" w:space="0" w:color="95B3D7" w:themeColor="accent1" w:themeTint="99"/>
+              <w:bottom w:val="single" w:sz="4" w:space="0" w:color="95B3D7" w:themeColor="accent1" w:themeTint="99"/>
+              <w:right w:val="single" w:sz="4" w:space="0" w:color="95B3D7" w:themeColor="accent1" w:themeTint="99"/>
+            </w:tcBorders>
+            <w:vAlign w:val="center"/>
+            <w:hideMark/>
+          </w:tcPr>
+          <w:p>
+            <w:pPr>
+              <w:rPr>
+                <w:rFonts w:ascii="Arial" w:hAnsi="Arial"/>
+              </w:rPr>
+            </w:pPr>
+            <w:r>
+              <w:t>Propósito</w:t>
+            </w:r>
+          </w:p>
+        </w:tc>
+        <w:tc>
+          <w:tcPr>
+            <w:tcW w:w="4508" w:type="dxa"/>
+            <w:tcBorders>
+              <w:top w:val="single" w:sz="4" w:space="0" w:color="95B3D7" w:themeColor="accent1" w:themeTint="99"/>
+              <w:left w:val="single" w:sz="4" w:space="0" w:color="95B3D7" w:themeColor="accent1" w:themeTint="99"/>
+              <w:bottom w:val="single" w:sz="4" w:space="0" w:color="95B3D7" w:themeColor="accent1" w:themeTint="99"/>
+              <w:right w:val="single" w:sz="4" w:space="0" w:color="95B3D7" w:themeColor="accent1" w:themeTint="99"/>
+            </w:tcBorders>
+            <w:vAlign w:val="center"/>
+            <w:hideMark/>
+          </w:tcPr>
+          <w:p>
+            <w:pPr>
+              <w:cnfStyle w:val="000000000000" w:firstRow="0" w:lastRow="0" w:firstColumn="0" w:lastColumn="0" w:oddVBand="0" w:evenVBand="0" w:oddHBand="0" w:evenHBand="0" w:firstRowFirstColumn="0" w:firstRowLastColumn="0" w:lastRowFirstColumn="0" w:lastRowLastColumn="0"/>
+              <w:rPr>
+                <w:rFonts w:ascii="Arial" w:hAnsi="Arial"/>
+              </w:rPr>
+            </w:pPr>
+            <w:r>
+              <w:t>Ter acesso ao sistema</w:t>
+            </w:r>
+          </w:p>
+        </w:tc>
+      </w:tr>
+      <w:tr>
+        <w:trPr>
+          <w:cnfStyle w:val="000000100000" w:firstRow="0" w:lastRow="0" w:firstColumn="0" w:lastColumn="0" w:oddVBand="0" w:evenVBand="0" w:oddHBand="1" w:evenHBand="0" w:firstRowFirstColumn="0" w:firstRowLastColumn="0" w:lastRowFirstColumn="0" w:lastRowLastColumn="0"/>
+          <w:trHeight w:val="1593"/>
+        </w:trPr>
+        <w:tc>
+          <w:tcPr>
+            <w:cnfStyle w:val="001000000000" w:firstRow="0" w:lastRow="0" w:firstColumn="1" w:lastColumn="0" w:oddVBand="0" w:evenVBand="0" w:oddHBand="0" w:evenHBand="0" w:firstRowFirstColumn="0" w:firstRowLastColumn="0" w:lastRowFirstColumn="0" w:lastRowLastColumn="0"/>
+            <w:tcW w:w="9016" w:type="dxa"/>
+            <w:gridSpan w:val="2"/>
+            <w:tcBorders>
+              <w:top w:val="single" w:sz="4" w:space="0" w:color="95B3D7" w:themeColor="accent1" w:themeTint="99"/>
+              <w:left w:val="single" w:sz="4" w:space="0" w:color="95B3D7" w:themeColor="accent1" w:themeTint="99"/>
+              <w:bottom w:val="single" w:sz="4" w:space="0" w:color="95B3D7" w:themeColor="accent1" w:themeTint="99"/>
+              <w:right w:val="single" w:sz="4" w:space="0" w:color="95B3D7" w:themeColor="accent1" w:themeTint="99"/>
+            </w:tcBorders>
+            <w:vAlign w:val="center"/>
+            <w:hideMark/>
+          </w:tcPr>
+          <w:p>
+            <w:pPr>
+              <w:rPr>
+                <w:rFonts w:ascii="Arial" w:hAnsi="Arial"/>
+              </w:rPr>
+            </w:pPr>
+            <w:r>
+              <w:t xml:space="preserve">Resumo: </w:t>
+            </w:r>
+            <w:r>
+              <w:rPr>
+                <w:b w:val="0"/>
+                <w:bCs w:val="0"/>
+              </w:rPr>
+              <w:t xml:space="preserve">O </w:t>
+            </w:r>
+            <w:proofErr w:type="spellStart"/>
+            <w:r>
+              <w:rPr>
+                <w:b w:val="0"/>
+                <w:bCs w:val="0"/>
+              </w:rPr>
+              <w:t>diretor</w:t>
+            </w:r>
+            <w:proofErr w:type="spellEnd"/>
+            <w:r>
+              <w:rPr>
+                <w:b w:val="0"/>
+                <w:bCs w:val="0"/>
+              </w:rPr>
+              <w:t xml:space="preserve"> e a secretaria precisam ter acesso ao sistema. </w:t>
+            </w:r>
+          </w:p>
+        </w:tc>
+      </w:tr>
+      <w:tr>
+        <w:trPr>
+          <w:trHeight w:val="566"/>
+        </w:trPr>
+        <w:tc>
+          <w:tcPr>
+            <w:cnfStyle w:val="001000000000" w:firstRow="0" w:lastRow="0" w:firstColumn="1" w:lastColumn="0" w:oddVBand="0" w:evenVBand="0" w:oddHBand="0" w:evenHBand="0" w:firstRowFirstColumn="0" w:firstRowLastColumn="0" w:lastRowFirstColumn="0" w:lastRowLastColumn="0"/>
+            <w:tcW w:w="4508" w:type="dxa"/>
+            <w:tcBorders>
+              <w:top w:val="single" w:sz="4" w:space="0" w:color="95B3D7" w:themeColor="accent1" w:themeTint="99"/>
+              <w:left w:val="single" w:sz="4" w:space="0" w:color="95B3D7" w:themeColor="accent1" w:themeTint="99"/>
+              <w:bottom w:val="single" w:sz="4" w:space="0" w:color="95B3D7" w:themeColor="accent1" w:themeTint="99"/>
+              <w:right w:val="single" w:sz="4" w:space="0" w:color="95B3D7" w:themeColor="accent1" w:themeTint="99"/>
+            </w:tcBorders>
+            <w:vAlign w:val="center"/>
+            <w:hideMark/>
+          </w:tcPr>
+          <w:p>
+            <w:pPr>
+              <w:rPr>
+                <w:rFonts w:ascii="Arial" w:hAnsi="Arial"/>
+              </w:rPr>
+            </w:pPr>
+            <w:r>
+              <w:t>Pré-condições</w:t>
+            </w:r>
+          </w:p>
+        </w:tc>
+        <w:tc>
+          <w:tcPr>
+            <w:tcW w:w="4508" w:type="dxa"/>
+            <w:tcBorders>
+              <w:top w:val="single" w:sz="4" w:space="0" w:color="95B3D7" w:themeColor="accent1" w:themeTint="99"/>
+              <w:left w:val="single" w:sz="4" w:space="0" w:color="95B3D7" w:themeColor="accent1" w:themeTint="99"/>
+              <w:bottom w:val="single" w:sz="4" w:space="0" w:color="95B3D7" w:themeColor="accent1" w:themeTint="99"/>
+              <w:right w:val="single" w:sz="4" w:space="0" w:color="95B3D7" w:themeColor="accent1" w:themeTint="99"/>
+            </w:tcBorders>
+            <w:vAlign w:val="center"/>
+            <w:hideMark/>
+          </w:tcPr>
+          <w:p>
+            <w:pPr>
+              <w:cnfStyle w:val="000000000000" w:firstRow="0" w:lastRow="0" w:firstColumn="0" w:lastColumn="0" w:oddVBand="0" w:evenVBand="0" w:oddHBand="0" w:evenHBand="0" w:firstRowFirstColumn="0" w:firstRowLastColumn="0" w:lastRowFirstColumn="0" w:lastRowLastColumn="0"/>
+              <w:rPr>
+                <w:rFonts w:ascii="Arial" w:hAnsi="Arial"/>
+              </w:rPr>
+            </w:pPr>
+            <w:r>
+              <w:t>Ser o director da empresa ou a secretaria</w:t>
+            </w:r>
+          </w:p>
+        </w:tc>
+      </w:tr>
+      <w:tr>
+        <w:trPr>
+          <w:cnfStyle w:val="000000100000" w:firstRow="0" w:lastRow="0" w:firstColumn="0" w:lastColumn="0" w:oddVBand="0" w:evenVBand="0" w:oddHBand="1" w:evenHBand="0" w:firstRowFirstColumn="0" w:firstRowLastColumn="0" w:lastRowFirstColumn="0" w:lastRowLastColumn="0"/>
+          <w:trHeight w:val="566"/>
+        </w:trPr>
+        <w:tc>
+          <w:tcPr>
+            <w:cnfStyle w:val="001000000000" w:firstRow="0" w:lastRow="0" w:firstColumn="1" w:lastColumn="0" w:oddVBand="0" w:evenVBand="0" w:oddHBand="0" w:evenHBand="0" w:firstRowFirstColumn="0" w:firstRowLastColumn="0" w:lastRowFirstColumn="0" w:lastRowLastColumn="0"/>
+            <w:tcW w:w="9016" w:type="dxa"/>
+            <w:gridSpan w:val="2"/>
+            <w:tcBorders>
+              <w:top w:val="single" w:sz="4" w:space="0" w:color="95B3D7" w:themeColor="accent1" w:themeTint="99"/>
+              <w:left w:val="single" w:sz="4" w:space="0" w:color="95B3D7" w:themeColor="accent1" w:themeTint="99"/>
+              <w:bottom w:val="single" w:sz="4" w:space="0" w:color="95B3D7" w:themeColor="accent1" w:themeTint="99"/>
+              <w:right w:val="single" w:sz="4" w:space="0" w:color="95B3D7" w:themeColor="accent1" w:themeTint="99"/>
+            </w:tcBorders>
+            <w:vAlign w:val="center"/>
+            <w:hideMark/>
+          </w:tcPr>
+          <w:p>
+            <w:pPr>
+              <w:jc w:val="center"/>
+              <w:rPr>
+                <w:rFonts w:ascii="Arial" w:hAnsi="Arial"/>
+              </w:rPr>
+            </w:pPr>
+            <w:r>
+              <w:t>Fluxo Básico</w:t>
+            </w:r>
+          </w:p>
+        </w:tc>
+      </w:tr>
+      <w:tr>
+        <w:trPr>
+          <w:trHeight w:val="566"/>
+        </w:trPr>
+        <w:tc>
+          <w:tcPr>
+            <w:cnfStyle w:val="001000000000" w:firstRow="0" w:lastRow="0" w:firstColumn="1" w:lastColumn="0" w:oddVBand="0" w:evenVBand="0" w:oddHBand="0" w:evenHBand="0" w:firstRowFirstColumn="0" w:firstRowLastColumn="0" w:lastRowFirstColumn="0" w:lastRowLastColumn="0"/>
+            <w:tcW w:w="4508" w:type="dxa"/>
+            <w:tcBorders>
+              <w:top w:val="single" w:sz="4" w:space="0" w:color="95B3D7" w:themeColor="accent1" w:themeTint="99"/>
+              <w:left w:val="single" w:sz="4" w:space="0" w:color="95B3D7" w:themeColor="accent1" w:themeTint="99"/>
+              <w:bottom w:val="single" w:sz="4" w:space="0" w:color="95B3D7" w:themeColor="accent1" w:themeTint="99"/>
+              <w:right w:val="single" w:sz="4" w:space="0" w:color="95B3D7" w:themeColor="accent1" w:themeTint="99"/>
+            </w:tcBorders>
+            <w:vAlign w:val="center"/>
+            <w:hideMark/>
+          </w:tcPr>
+          <w:p>
+            <w:pPr>
+              <w:rPr>
+                <w:rFonts w:ascii="Arial" w:hAnsi="Arial"/>
+              </w:rPr>
+            </w:pPr>
+            <w:r>
+              <w:t>Acção do actor</w:t>
+            </w:r>
+          </w:p>
+        </w:tc>
+        <w:tc>
+          <w:tcPr>
+            <w:tcW w:w="4508" w:type="dxa"/>
+            <w:tcBorders>
+              <w:top w:val="single" w:sz="4" w:space="0" w:color="95B3D7" w:themeColor="accent1" w:themeTint="99"/>
+              <w:left w:val="single" w:sz="4" w:space="0" w:color="95B3D7" w:themeColor="accent1" w:themeTint="99"/>
+              <w:bottom w:val="single" w:sz="4" w:space="0" w:color="95B3D7" w:themeColor="accent1" w:themeTint="99"/>
+              <w:right w:val="single" w:sz="4" w:space="0" w:color="95B3D7" w:themeColor="accent1" w:themeTint="99"/>
+            </w:tcBorders>
+            <w:vAlign w:val="center"/>
+            <w:hideMark/>
+          </w:tcPr>
+          <w:p>
+            <w:pPr>
+              <w:cnfStyle w:val="000000000000" w:firstRow="0" w:lastRow="0" w:firstColumn="0" w:lastColumn="0" w:oddVBand="0" w:evenVBand="0" w:oddHBand="0" w:evenHBand="0" w:firstRowFirstColumn="0" w:firstRowLastColumn="0" w:lastRowFirstColumn="0" w:lastRowLastColumn="0"/>
+              <w:rPr>
+                <w:rFonts w:ascii="Arial" w:hAnsi="Arial"/>
+                <w:b/>
+                <w:bCs/>
+              </w:rPr>
+            </w:pPr>
+            <w:r>
+              <w:rPr>
+                <w:b/>
+                <w:bCs/>
+              </w:rPr>
+              <w:t>Resposta do Sistema</w:t>
+            </w:r>
+          </w:p>
+        </w:tc>
+      </w:tr>
+      <w:tr>
+        <w:trPr>
+          <w:cnfStyle w:val="000000100000" w:firstRow="0" w:lastRow="0" w:firstColumn="0" w:lastColumn="0" w:oddVBand="0" w:evenVBand="0" w:oddHBand="1" w:evenHBand="0" w:firstRowFirstColumn="0" w:firstRowLastColumn="0" w:lastRowFirstColumn="0" w:lastRowLastColumn="0"/>
+          <w:trHeight w:val="566"/>
+        </w:trPr>
+        <w:tc>
+          <w:tcPr>
+            <w:cnfStyle w:val="001000000000" w:firstRow="0" w:lastRow="0" w:firstColumn="1" w:lastColumn="0" w:oddVBand="0" w:evenVBand="0" w:oddHBand="0" w:evenHBand="0" w:firstRowFirstColumn="0" w:firstRowLastColumn="0" w:lastRowFirstColumn="0" w:lastRowLastColumn="0"/>
+            <w:tcW w:w="4508" w:type="dxa"/>
+            <w:tcBorders>
+              <w:top w:val="single" w:sz="4" w:space="0" w:color="95B3D7" w:themeColor="accent1" w:themeTint="99"/>
+              <w:left w:val="single" w:sz="4" w:space="0" w:color="95B3D7" w:themeColor="accent1" w:themeTint="99"/>
+              <w:bottom w:val="single" w:sz="4" w:space="0" w:color="95B3D7" w:themeColor="accent1" w:themeTint="99"/>
+              <w:right w:val="single" w:sz="4" w:space="0" w:color="95B3D7" w:themeColor="accent1" w:themeTint="99"/>
+            </w:tcBorders>
+            <w:vAlign w:val="center"/>
+          </w:tcPr>
+          <w:p>
+            <w:pPr>
+              <w:pStyle w:val="PargrafodaLista"/>
+              <w:numPr>
+                <w:ilvl w:val="0"/>
+                <w:numId w:val="8"/>
+              </w:numPr>
+              <w:rPr>
+                <w:rFonts w:ascii="Arial" w:hAnsi="Arial"/>
+              </w:rPr>
+            </w:pPr>
+            <w:r>
+              <w:rPr>
+                <w:rFonts w:cstheme="minorHAnsi"/>
+              </w:rPr>
+              <w:t>Clicar em iniciar sessão</w:t>
+            </w:r>
+          </w:p>
+          <w:p>
+            <w:pPr>
+              <w:pStyle w:val="PargrafodaLista"/>
+              <w:numPr>
+                <w:ilvl w:val="0"/>
+                <w:numId w:val="8"/>
+              </w:numPr>
+              <w:rPr>
+                <w:rFonts w:cstheme="minorHAnsi"/>
+              </w:rPr>
+            </w:pPr>
+            <w:r>
+              <w:rPr>
+                <w:rFonts w:cstheme="minorHAnsi"/>
+              </w:rPr>
+              <w:t>Entrar com nome de usuário e palavra passe</w:t>
+            </w:r>
+          </w:p>
+          <w:p>
+            <w:pPr>
+              <w:pStyle w:val="PargrafodaLista"/>
+              <w:numPr>
+                <w:ilvl w:val="0"/>
+                <w:numId w:val="8"/>
+              </w:numPr>
+              <w:rPr>
+                <w:rFonts w:cstheme="minorHAnsi"/>
+              </w:rPr>
+            </w:pPr>
+            <w:r>
+              <w:rPr>
+                <w:rFonts w:cstheme="minorHAnsi"/>
+              </w:rPr>
+              <w:t>Clicar em entrar</w:t>
+            </w:r>
+          </w:p>
+        </w:tc>
+        <w:tc>
+          <w:tcPr>
+            <w:tcW w:w="4508" w:type="dxa"/>
+            <w:tcBorders>
+              <w:top w:val="single" w:sz="4" w:space="0" w:color="95B3D7" w:themeColor="accent1" w:themeTint="99"/>
+              <w:left w:val="single" w:sz="4" w:space="0" w:color="95B3D7" w:themeColor="accent1" w:themeTint="99"/>
+              <w:bottom w:val="single" w:sz="4" w:space="0" w:color="95B3D7" w:themeColor="accent1" w:themeTint="99"/>
+              <w:right w:val="single" w:sz="4" w:space="0" w:color="95B3D7" w:themeColor="accent1" w:themeTint="99"/>
+            </w:tcBorders>
+            <w:vAlign w:val="center"/>
+          </w:tcPr>
+          <w:p>
+            <w:pPr>
+              <w:pStyle w:val="PargrafodaLista"/>
+              <w:numPr>
+                <w:ilvl w:val="0"/>
+                <w:numId w:val="7"/>
+              </w:numPr>
+              <w:cnfStyle w:val="000000100000" w:firstRow="0" w:lastRow="0" w:firstColumn="0" w:lastColumn="0" w:oddVBand="0" w:evenVBand="0" w:oddHBand="1" w:evenHBand="0" w:firstRowFirstColumn="0" w:firstRowLastColumn="0" w:lastRowFirstColumn="0" w:lastRowLastColumn="0"/>
+              <w:rPr>
+                <w:rFonts w:ascii="Arial" w:hAnsi="Arial"/>
+              </w:rPr>
+            </w:pPr>
+            <w:r>
+              <w:t xml:space="preserve">Apresentar o campo de </w:t>
+            </w:r>
+            <w:r>
+              <w:t>in</w:t>
+            </w:r>
+            <w:r>
+              <w:t>í</w:t>
+            </w:r>
+            <w:r>
+              <w:t>cio de sessão</w:t>
+            </w:r>
+          </w:p>
+          <w:p>
+            <w:pPr>
+              <w:pStyle w:val="PargrafodaLista"/>
+              <w:numPr>
+                <w:ilvl w:val="0"/>
+                <w:numId w:val="7"/>
+              </w:numPr>
+              <w:cnfStyle w:val="000000100000" w:firstRow="0" w:lastRow="0" w:firstColumn="0" w:lastColumn="0" w:oddVBand="0" w:evenVBand="0" w:oddHBand="1" w:evenHBand="0" w:firstRowFirstColumn="0" w:firstRowLastColumn="0" w:lastRowFirstColumn="0" w:lastRowLastColumn="0"/>
+              <w:rPr>
+                <w:rFonts w:ascii="Arial" w:hAnsi="Arial"/>
+              </w:rPr>
+            </w:pPr>
+            <w:r>
+              <w:t>Validar os dados preenchidos</w:t>
+            </w:r>
+          </w:p>
+          <w:p>
+            <w:pPr>
+              <w:pStyle w:val="PargrafodaLista"/>
+              <w:numPr>
+                <w:ilvl w:val="0"/>
+                <w:numId w:val="7"/>
+              </w:numPr>
+              <w:cnfStyle w:val="000000100000" w:firstRow="0" w:lastRow="0" w:firstColumn="0" w:lastColumn="0" w:oddVBand="0" w:evenVBand="0" w:oddHBand="1" w:evenHBand="0" w:firstRowFirstColumn="0" w:firstRowLastColumn="0" w:lastRowFirstColumn="0" w:lastRowLastColumn="0"/>
+              <w:rPr>
+                <w:rFonts w:ascii="Arial" w:hAnsi="Arial"/>
+              </w:rPr>
+            </w:pPr>
+            <w:r>
+              <w:t xml:space="preserve">Validar </w:t>
+            </w:r>
+            <w:r>
+              <w:t>a sessão</w:t>
+            </w:r>
+            <w:r>
+              <w:t xml:space="preserve"> e </w:t>
+            </w:r>
+            <w:r>
+              <w:t>entrar no sistema</w:t>
+            </w:r>
+            <w:r>
+              <w:t xml:space="preserve"> </w:t>
+            </w:r>
+          </w:p>
+          <w:p>
+            <w:pPr>
+              <w:cnfStyle w:val="000000100000" w:firstRow="0" w:lastRow="0" w:firstColumn="0" w:lastColumn="0" w:oddVBand="0" w:evenVBand="0" w:oddHBand="1" w:evenHBand="0" w:firstRowFirstColumn="0" w:firstRowLastColumn="0" w:lastRowFirstColumn="0" w:lastRowLastColumn="0"/>
+              <w:rPr>
+                <w:rFonts w:ascii="Arial" w:hAnsi="Arial"/>
+              </w:rPr>
+            </w:pPr>
+          </w:p>
+        </w:tc>
+      </w:tr>
+    </w:tbl>
+    <w:p>
+      <w:pPr>
+        <w:tabs>
+          <w:tab w:val="left" w:pos="930"/>
+        </w:tabs>
+        <w:jc w:val="center"/>
+        <w:rPr>
+          <w:b/>
+          <w:sz w:val="28"/>
+          <w:szCs w:val="28"/>
+        </w:rPr>
+      </w:pPr>
+    </w:p>
+    <w:p>
+      <w:pPr>
+        <w:rPr>
+          <w:b/>
+          <w:sz w:val="28"/>
+          <w:szCs w:val="28"/>
+        </w:rPr>
+      </w:pPr>
+      <w:r>
+        <w:rPr>
+          <w:b/>
+          <w:sz w:val="28"/>
+          <w:szCs w:val="28"/>
+        </w:rPr>
+        <w:br w:type="page"/>
+      </w:r>
+    </w:p>
+    <w:p>
+      <w:pPr>
+        <w:tabs>
+          <w:tab w:val="left" w:pos="930"/>
+        </w:tabs>
+        <w:jc w:val="center"/>
+        <w:rPr>
+          <w:b/>
+          <w:sz w:val="28"/>
+          <w:szCs w:val="28"/>
+        </w:rPr>
+      </w:pPr>
+    </w:p>
+    <w:p>
+      <w:pPr>
+        <w:tabs>
+          <w:tab w:val="left" w:pos="930"/>
+        </w:tabs>
+        <w:jc w:val="center"/>
+        <w:rPr>
+          <w:b/>
+          <w:sz w:val="28"/>
+          <w:szCs w:val="28"/>
+        </w:rPr>
+      </w:pPr>
+    </w:p>
+    <w:tbl>
+      <w:tblPr>
+        <w:tblStyle w:val="TabeladeGrelha4-Destaque12"/>
+        <w:tblW w:w="0" w:type="auto"/>
+        <w:tblInd w:w="0" w:type="dxa"/>
+        <w:tblLook w:val="04A0" w:firstRow="1" w:lastRow="0" w:firstColumn="1" w:lastColumn="0" w:noHBand="0" w:noVBand="1"/>
+      </w:tblPr>
+      <w:tblGrid>
+        <w:gridCol w:w="5360"/>
+        <w:gridCol w:w="3360"/>
+      </w:tblGrid>
+      <w:tr>
+        <w:trPr>
+          <w:cnfStyle w:val="100000000000" w:firstRow="1" w:lastRow="0" w:firstColumn="0" w:lastColumn="0" w:oddVBand="0" w:evenVBand="0" w:oddHBand="0" w:evenHBand="0" w:firstRowFirstColumn="0" w:firstRowLastColumn="0" w:lastRowFirstColumn="0" w:lastRowLastColumn="0"/>
+          <w:trHeight w:val="418"/>
+        </w:trPr>
+        <w:tc>
+          <w:tcPr>
+            <w:cnfStyle w:val="001000000000" w:firstRow="0" w:lastRow="0" w:firstColumn="1" w:lastColumn="0" w:oddVBand="0" w:evenVBand="0" w:oddHBand="0" w:evenHBand="0" w:firstRowFirstColumn="0" w:firstRowLastColumn="0" w:lastRowFirstColumn="0" w:lastRowLastColumn="0"/>
+            <w:tcW w:w="4508" w:type="dxa"/>
+            <w:tcBorders>
+              <w:right w:val="nil"/>
+            </w:tcBorders>
+            <w:vAlign w:val="center"/>
+            <w:hideMark/>
+          </w:tcPr>
+          <w:p>
+            <w:pPr>
+              <w:rPr>
+                <w:rFonts w:ascii="Arial" w:hAnsi="Arial"/>
+              </w:rPr>
+            </w:pPr>
+            <w:r>
+              <w:t>Nome do caso de uso</w:t>
+            </w:r>
+          </w:p>
+        </w:tc>
+        <w:tc>
+          <w:tcPr>
+            <w:tcW w:w="4508" w:type="dxa"/>
+            <w:tcBorders>
+              <w:left w:val="nil"/>
+            </w:tcBorders>
+            <w:vAlign w:val="center"/>
+            <w:hideMark/>
+          </w:tcPr>
+          <w:p>
+            <w:pPr>
+              <w:pStyle w:val="PargrafodaLista"/>
+              <w:numPr>
+                <w:ilvl w:val="0"/>
+                <w:numId w:val="4"/>
+              </w:numPr>
+              <w:jc w:val="both"/>
+              <w:cnfStyle w:val="100000000000" w:firstRow="1" w:lastRow="0" w:firstColumn="0" w:lastColumn="0" w:oddVBand="0" w:evenVBand="0" w:oddHBand="0" w:evenHBand="0" w:firstRowFirstColumn="0" w:firstRowLastColumn="0" w:lastRowFirstColumn="0" w:lastRowLastColumn="0"/>
+            </w:pPr>
+            <w:r>
+              <w:t>Registar o consumo de energia</w:t>
+            </w:r>
+          </w:p>
+        </w:tc>
+      </w:tr>
+      <w:tr>
+        <w:trPr>
+          <w:cnfStyle w:val="000000100000" w:firstRow="0" w:lastRow="0" w:firstColumn="0" w:lastColumn="0" w:oddVBand="0" w:evenVBand="0" w:oddHBand="1" w:evenHBand="0" w:firstRowFirstColumn="0" w:firstRowLastColumn="0" w:lastRowFirstColumn="0" w:lastRowLastColumn="0"/>
+        </w:trPr>
+        <w:tc>
+          <w:tcPr>
+            <w:cnfStyle w:val="001000000000" w:firstRow="0" w:lastRow="0" w:firstColumn="1" w:lastColumn="0" w:oddVBand="0" w:evenVBand="0" w:oddHBand="0" w:evenHBand="0" w:firstRowFirstColumn="0" w:firstRowLastColumn="0" w:lastRowFirstColumn="0" w:lastRowLastColumn="0"/>
+            <w:tcW w:w="4508" w:type="dxa"/>
+            <w:tcBorders>
+              <w:top w:val="single" w:sz="4" w:space="0" w:color="95B3D7" w:themeColor="accent1" w:themeTint="99"/>
+              <w:left w:val="single" w:sz="4" w:space="0" w:color="95B3D7" w:themeColor="accent1" w:themeTint="99"/>
+              <w:bottom w:val="single" w:sz="4" w:space="0" w:color="95B3D7" w:themeColor="accent1" w:themeTint="99"/>
+              <w:right w:val="single" w:sz="4" w:space="0" w:color="95B3D7" w:themeColor="accent1" w:themeTint="99"/>
+            </w:tcBorders>
+            <w:vAlign w:val="center"/>
+            <w:hideMark/>
+          </w:tcPr>
+          <w:p>
+            <w:pPr>
+              <w:rPr>
+                <w:rFonts w:ascii="Arial" w:hAnsi="Arial"/>
+              </w:rPr>
+            </w:pPr>
+            <w:r>
+              <w:t>Autor</w:t>
+            </w:r>
+          </w:p>
+        </w:tc>
+        <w:tc>
+          <w:tcPr>
+            <w:tcW w:w="4508" w:type="dxa"/>
+            <w:tcBorders>
+              <w:top w:val="single" w:sz="4" w:space="0" w:color="95B3D7" w:themeColor="accent1" w:themeTint="99"/>
+              <w:left w:val="single" w:sz="4" w:space="0" w:color="95B3D7" w:themeColor="accent1" w:themeTint="99"/>
+              <w:bottom w:val="single" w:sz="4" w:space="0" w:color="95B3D7" w:themeColor="accent1" w:themeTint="99"/>
+              <w:right w:val="single" w:sz="4" w:space="0" w:color="95B3D7" w:themeColor="accent1" w:themeTint="99"/>
+            </w:tcBorders>
+            <w:vAlign w:val="center"/>
+            <w:hideMark/>
+          </w:tcPr>
+          <w:p>
+            <w:pPr>
+              <w:cnfStyle w:val="000000100000" w:firstRow="0" w:lastRow="0" w:firstColumn="0" w:lastColumn="0" w:oddVBand="0" w:evenVBand="0" w:oddHBand="1" w:evenHBand="0" w:firstRowFirstColumn="0" w:firstRowLastColumn="0" w:lastRowFirstColumn="0" w:lastRowLastColumn="0"/>
+              <w:rPr>
+                <w:rFonts w:ascii="Arial" w:hAnsi="Arial"/>
+              </w:rPr>
+            </w:pPr>
+            <w:r>
+              <w:t>secretaria</w:t>
+            </w:r>
+          </w:p>
+        </w:tc>
+      </w:tr>
+      <w:tr>
+        <w:tc>
+          <w:tcPr>
+            <w:cnfStyle w:val="001000000000" w:firstRow="0" w:lastRow="0" w:firstColumn="1" w:lastColumn="0" w:oddVBand="0" w:evenVBand="0" w:oddHBand="0" w:evenHBand="0" w:firstRowFirstColumn="0" w:firstRowLastColumn="0" w:lastRowFirstColumn="0" w:lastRowLastColumn="0"/>
+            <w:tcW w:w="4508" w:type="dxa"/>
+            <w:tcBorders>
+              <w:top w:val="single" w:sz="4" w:space="0" w:color="95B3D7" w:themeColor="accent1" w:themeTint="99"/>
+              <w:left w:val="single" w:sz="4" w:space="0" w:color="95B3D7" w:themeColor="accent1" w:themeTint="99"/>
+              <w:bottom w:val="single" w:sz="4" w:space="0" w:color="95B3D7" w:themeColor="accent1" w:themeTint="99"/>
+              <w:right w:val="single" w:sz="4" w:space="0" w:color="95B3D7" w:themeColor="accent1" w:themeTint="99"/>
+            </w:tcBorders>
+            <w:vAlign w:val="center"/>
+            <w:hideMark/>
+          </w:tcPr>
+          <w:p>
+            <w:pPr>
+              <w:rPr>
+                <w:rFonts w:ascii="Arial" w:hAnsi="Arial"/>
+              </w:rPr>
+            </w:pPr>
+            <w:r>
+              <w:t>Propósito</w:t>
+            </w:r>
+          </w:p>
+        </w:tc>
+        <w:tc>
+          <w:tcPr>
+            <w:tcW w:w="4508" w:type="dxa"/>
+            <w:tcBorders>
+              <w:top w:val="single" w:sz="4" w:space="0" w:color="95B3D7" w:themeColor="accent1" w:themeTint="99"/>
+              <w:left w:val="single" w:sz="4" w:space="0" w:color="95B3D7" w:themeColor="accent1" w:themeTint="99"/>
+              <w:bottom w:val="single" w:sz="4" w:space="0" w:color="95B3D7" w:themeColor="accent1" w:themeTint="99"/>
+              <w:right w:val="single" w:sz="4" w:space="0" w:color="95B3D7" w:themeColor="accent1" w:themeTint="99"/>
+            </w:tcBorders>
+            <w:vAlign w:val="center"/>
+            <w:hideMark/>
+          </w:tcPr>
+          <w:p>
+            <w:pPr>
+              <w:cnfStyle w:val="000000000000" w:firstRow="0" w:lastRow="0" w:firstColumn="0" w:lastColumn="0" w:oddVBand="0" w:evenVBand="0" w:oddHBand="0" w:evenHBand="0" w:firstRowFirstColumn="0" w:firstRowLastColumn="0" w:lastRowFirstColumn="0" w:lastRowLastColumn="0"/>
+              <w:rPr>
+                <w:rFonts w:ascii="Arial" w:hAnsi="Arial"/>
+              </w:rPr>
+            </w:pPr>
+            <w:r>
+              <w:t>Registar o consumo de energia</w:t>
+            </w:r>
+          </w:p>
+        </w:tc>
+      </w:tr>
+      <w:tr>
+        <w:trPr>
+          <w:cnfStyle w:val="000000100000" w:firstRow="0" w:lastRow="0" w:firstColumn="0" w:lastColumn="0" w:oddVBand="0" w:evenVBand="0" w:oddHBand="1" w:evenHBand="0" w:firstRowFirstColumn="0" w:firstRowLastColumn="0" w:lastRowFirstColumn="0" w:lastRowLastColumn="0"/>
+          <w:trHeight w:val="1593"/>
+        </w:trPr>
+        <w:tc>
+          <w:tcPr>
+            <w:cnfStyle w:val="001000000000" w:firstRow="0" w:lastRow="0" w:firstColumn="1" w:lastColumn="0" w:oddVBand="0" w:evenVBand="0" w:oddHBand="0" w:evenHBand="0" w:firstRowFirstColumn="0" w:firstRowLastColumn="0" w:lastRowFirstColumn="0" w:lastRowLastColumn="0"/>
+            <w:tcW w:w="9016" w:type="dxa"/>
+            <w:gridSpan w:val="2"/>
+            <w:tcBorders>
+              <w:top w:val="single" w:sz="4" w:space="0" w:color="95B3D7" w:themeColor="accent1" w:themeTint="99"/>
+              <w:left w:val="single" w:sz="4" w:space="0" w:color="95B3D7" w:themeColor="accent1" w:themeTint="99"/>
+              <w:bottom w:val="single" w:sz="4" w:space="0" w:color="95B3D7" w:themeColor="accent1" w:themeTint="99"/>
+              <w:right w:val="single" w:sz="4" w:space="0" w:color="95B3D7" w:themeColor="accent1" w:themeTint="99"/>
+            </w:tcBorders>
+            <w:vAlign w:val="center"/>
+            <w:hideMark/>
+          </w:tcPr>
+          <w:p>
+            <w:pPr>
+              <w:rPr>
+                <w:rFonts w:ascii="Arial" w:hAnsi="Arial"/>
+              </w:rPr>
+            </w:pPr>
+            <w:r>
+              <w:t xml:space="preserve">Resumo: </w:t>
+            </w:r>
+            <w:r>
+              <w:rPr>
+                <w:b w:val="0"/>
+                <w:bCs w:val="0"/>
+              </w:rPr>
+              <w:t xml:space="preserve">A secretaria precisa de registar o consumo de </w:t>
+            </w:r>
+            <w:proofErr w:type="spellStart"/>
+            <w:r>
+              <w:rPr>
+                <w:b w:val="0"/>
+                <w:bCs w:val="0"/>
+              </w:rPr>
+              <w:t>enrgia</w:t>
+            </w:r>
+            <w:proofErr w:type="spellEnd"/>
+            <w:r>
+              <w:rPr>
+                <w:b w:val="0"/>
+                <w:bCs w:val="0"/>
+              </w:rPr>
+              <w:t xml:space="preserve">. </w:t>
+            </w:r>
+          </w:p>
+        </w:tc>
+      </w:tr>
+      <w:tr>
+        <w:trPr>
+          <w:trHeight w:val="566"/>
+        </w:trPr>
+        <w:tc>
+          <w:tcPr>
+            <w:cnfStyle w:val="001000000000" w:firstRow="0" w:lastRow="0" w:firstColumn="1" w:lastColumn="0" w:oddVBand="0" w:evenVBand="0" w:oddHBand="0" w:evenHBand="0" w:firstRowFirstColumn="0" w:firstRowLastColumn="0" w:lastRowFirstColumn="0" w:lastRowLastColumn="0"/>
+            <w:tcW w:w="4508" w:type="dxa"/>
+            <w:tcBorders>
+              <w:top w:val="single" w:sz="4" w:space="0" w:color="95B3D7" w:themeColor="accent1" w:themeTint="99"/>
+              <w:left w:val="single" w:sz="4" w:space="0" w:color="95B3D7" w:themeColor="accent1" w:themeTint="99"/>
+              <w:bottom w:val="single" w:sz="4" w:space="0" w:color="95B3D7" w:themeColor="accent1" w:themeTint="99"/>
+              <w:right w:val="single" w:sz="4" w:space="0" w:color="95B3D7" w:themeColor="accent1" w:themeTint="99"/>
+            </w:tcBorders>
+            <w:vAlign w:val="center"/>
+            <w:hideMark/>
+          </w:tcPr>
+          <w:p>
+            <w:pPr>
+              <w:rPr>
+                <w:rFonts w:ascii="Arial" w:hAnsi="Arial"/>
+              </w:rPr>
+            </w:pPr>
+            <w:r>
+              <w:t>Pré-condições</w:t>
+            </w:r>
+          </w:p>
+        </w:tc>
+        <w:tc>
+          <w:tcPr>
+            <w:tcW w:w="4508" w:type="dxa"/>
+            <w:tcBorders>
+              <w:top w:val="single" w:sz="4" w:space="0" w:color="95B3D7" w:themeColor="accent1" w:themeTint="99"/>
+              <w:left w:val="single" w:sz="4" w:space="0" w:color="95B3D7" w:themeColor="accent1" w:themeTint="99"/>
+              <w:bottom w:val="single" w:sz="4" w:space="0" w:color="95B3D7" w:themeColor="accent1" w:themeTint="99"/>
+              <w:right w:val="single" w:sz="4" w:space="0" w:color="95B3D7" w:themeColor="accent1" w:themeTint="99"/>
+            </w:tcBorders>
+            <w:vAlign w:val="center"/>
+            <w:hideMark/>
+          </w:tcPr>
+          <w:p>
+            <w:pPr>
+              <w:cnfStyle w:val="000000000000" w:firstRow="0" w:lastRow="0" w:firstColumn="0" w:lastColumn="0" w:oddVBand="0" w:evenVBand="0" w:oddHBand="0" w:evenHBand="0" w:firstRowFirstColumn="0" w:firstRowLastColumn="0" w:lastRowFirstColumn="0" w:lastRowLastColumn="0"/>
+              <w:rPr>
+                <w:rFonts w:ascii="Arial" w:hAnsi="Arial"/>
+              </w:rPr>
+            </w:pPr>
+            <w:r>
+              <w:t xml:space="preserve">Ser </w:t>
+            </w:r>
+            <w:r>
+              <w:t>a</w:t>
+            </w:r>
+            <w:r>
+              <w:t xml:space="preserve"> secretaria</w:t>
+            </w:r>
+          </w:p>
+        </w:tc>
+      </w:tr>
+      <w:tr>
+        <w:trPr>
+          <w:cnfStyle w:val="000000100000" w:firstRow="0" w:lastRow="0" w:firstColumn="0" w:lastColumn="0" w:oddVBand="0" w:evenVBand="0" w:oddHBand="1" w:evenHBand="0" w:firstRowFirstColumn="0" w:firstRowLastColumn="0" w:lastRowFirstColumn="0" w:lastRowLastColumn="0"/>
+          <w:trHeight w:val="566"/>
+        </w:trPr>
+        <w:tc>
+          <w:tcPr>
+            <w:cnfStyle w:val="001000000000" w:firstRow="0" w:lastRow="0" w:firstColumn="1" w:lastColumn="0" w:oddVBand="0" w:evenVBand="0" w:oddHBand="0" w:evenHBand="0" w:firstRowFirstColumn="0" w:firstRowLastColumn="0" w:lastRowFirstColumn="0" w:lastRowLastColumn="0"/>
+            <w:tcW w:w="9016" w:type="dxa"/>
+            <w:gridSpan w:val="2"/>
+            <w:tcBorders>
+              <w:top w:val="single" w:sz="4" w:space="0" w:color="95B3D7" w:themeColor="accent1" w:themeTint="99"/>
+              <w:left w:val="single" w:sz="4" w:space="0" w:color="95B3D7" w:themeColor="accent1" w:themeTint="99"/>
+              <w:bottom w:val="single" w:sz="4" w:space="0" w:color="95B3D7" w:themeColor="accent1" w:themeTint="99"/>
+              <w:right w:val="single" w:sz="4" w:space="0" w:color="95B3D7" w:themeColor="accent1" w:themeTint="99"/>
+            </w:tcBorders>
+            <w:vAlign w:val="center"/>
+            <w:hideMark/>
+          </w:tcPr>
+          <w:p>
+            <w:pPr>
+              <w:jc w:val="center"/>
+              <w:rPr>
+                <w:rFonts w:ascii="Arial" w:hAnsi="Arial"/>
+              </w:rPr>
+            </w:pPr>
+            <w:r>
+              <w:t>Fluxo Básico</w:t>
+            </w:r>
+          </w:p>
+        </w:tc>
+      </w:tr>
+      <w:tr>
+        <w:trPr>
+          <w:trHeight w:val="566"/>
+        </w:trPr>
+        <w:tc>
+          <w:tcPr>
+            <w:cnfStyle w:val="001000000000" w:firstRow="0" w:lastRow="0" w:firstColumn="1" w:lastColumn="0" w:oddVBand="0" w:evenVBand="0" w:oddHBand="0" w:evenHBand="0" w:firstRowFirstColumn="0" w:firstRowLastColumn="0" w:lastRowFirstColumn="0" w:lastRowLastColumn="0"/>
+            <w:tcW w:w="4508" w:type="dxa"/>
+            <w:tcBorders>
+              <w:top w:val="single" w:sz="4" w:space="0" w:color="95B3D7" w:themeColor="accent1" w:themeTint="99"/>
+              <w:left w:val="single" w:sz="4" w:space="0" w:color="95B3D7" w:themeColor="accent1" w:themeTint="99"/>
+              <w:bottom w:val="single" w:sz="4" w:space="0" w:color="95B3D7" w:themeColor="accent1" w:themeTint="99"/>
+              <w:right w:val="single" w:sz="4" w:space="0" w:color="95B3D7" w:themeColor="accent1" w:themeTint="99"/>
+            </w:tcBorders>
+            <w:vAlign w:val="center"/>
+            <w:hideMark/>
+          </w:tcPr>
+          <w:p>
+            <w:pPr>
+              <w:rPr>
+                <w:rFonts w:ascii="Arial" w:hAnsi="Arial"/>
+              </w:rPr>
+            </w:pPr>
+            <w:r>
+              <w:t>Acção do actor</w:t>
+            </w:r>
+          </w:p>
+        </w:tc>
+        <w:tc>
+          <w:tcPr>
+            <w:tcW w:w="4508" w:type="dxa"/>
+            <w:tcBorders>
+              <w:top w:val="single" w:sz="4" w:space="0" w:color="95B3D7" w:themeColor="accent1" w:themeTint="99"/>
+              <w:left w:val="single" w:sz="4" w:space="0" w:color="95B3D7" w:themeColor="accent1" w:themeTint="99"/>
+              <w:bottom w:val="single" w:sz="4" w:space="0" w:color="95B3D7" w:themeColor="accent1" w:themeTint="99"/>
+              <w:right w:val="single" w:sz="4" w:space="0" w:color="95B3D7" w:themeColor="accent1" w:themeTint="99"/>
+            </w:tcBorders>
+            <w:vAlign w:val="center"/>
+            <w:hideMark/>
+          </w:tcPr>
+          <w:p>
+            <w:pPr>
+              <w:cnfStyle w:val="000000000000" w:firstRow="0" w:lastRow="0" w:firstColumn="0" w:lastColumn="0" w:oddVBand="0" w:evenVBand="0" w:oddHBand="0" w:evenHBand="0" w:firstRowFirstColumn="0" w:firstRowLastColumn="0" w:lastRowFirstColumn="0" w:lastRowLastColumn="0"/>
+              <w:rPr>
+                <w:rFonts w:ascii="Arial" w:hAnsi="Arial"/>
+                <w:b/>
+                <w:bCs/>
+              </w:rPr>
+            </w:pPr>
+            <w:r>
+              <w:rPr>
+                <w:b/>
+                <w:bCs/>
+              </w:rPr>
+              <w:t>Resposta do Sistema</w:t>
+            </w:r>
+          </w:p>
+        </w:tc>
+      </w:tr>
+      <w:tr>
+        <w:trPr>
+          <w:cnfStyle w:val="000000100000" w:firstRow="0" w:lastRow="0" w:firstColumn="0" w:lastColumn="0" w:oddVBand="0" w:evenVBand="0" w:oddHBand="1" w:evenHBand="0" w:firstRowFirstColumn="0" w:firstRowLastColumn="0" w:lastRowFirstColumn="0" w:lastRowLastColumn="0"/>
+          <w:trHeight w:val="566"/>
+        </w:trPr>
+        <w:tc>
+          <w:tcPr>
+            <w:cnfStyle w:val="001000000000" w:firstRow="0" w:lastRow="0" w:firstColumn="1" w:lastColumn="0" w:oddVBand="0" w:evenVBand="0" w:oddHBand="0" w:evenHBand="0" w:firstRowFirstColumn="0" w:firstRowLastColumn="0" w:lastRowFirstColumn="0" w:lastRowLastColumn="0"/>
+            <w:tcW w:w="4508" w:type="dxa"/>
+            <w:tcBorders>
+              <w:top w:val="single" w:sz="4" w:space="0" w:color="95B3D7" w:themeColor="accent1" w:themeTint="99"/>
+              <w:left w:val="single" w:sz="4" w:space="0" w:color="95B3D7" w:themeColor="accent1" w:themeTint="99"/>
+              <w:bottom w:val="single" w:sz="4" w:space="0" w:color="95B3D7" w:themeColor="accent1" w:themeTint="99"/>
+              <w:right w:val="single" w:sz="4" w:space="0" w:color="95B3D7" w:themeColor="accent1" w:themeTint="99"/>
+            </w:tcBorders>
+            <w:vAlign w:val="center"/>
+          </w:tcPr>
+          <w:p>
+            <w:pPr>
+              <w:pStyle w:val="PargrafodaLista"/>
+              <w:numPr>
+                <w:ilvl w:val="2"/>
+                <w:numId w:val="7"/>
+              </w:numPr>
+              <w:rPr>
+                <w:rFonts w:ascii="Arial" w:hAnsi="Arial"/>
+              </w:rPr>
+            </w:pPr>
+            <w:r>
+              <w:rPr>
+                <w:rFonts w:cstheme="minorHAnsi"/>
+              </w:rPr>
+              <w:t xml:space="preserve">Clicar </w:t>
+            </w:r>
+            <w:r>
+              <w:rPr>
+                <w:rFonts w:cstheme="minorHAnsi"/>
+              </w:rPr>
+              <w:t>em registo de consumo de energia</w:t>
+            </w:r>
+          </w:p>
+          <w:p>
+            <w:pPr>
+              <w:pStyle w:val="PargrafodaLista"/>
+              <w:numPr>
+                <w:ilvl w:val="2"/>
+                <w:numId w:val="7"/>
+              </w:numPr>
+              <w:rPr>
+                <w:rFonts w:cstheme="minorHAnsi"/>
+                <w:b w:val="0"/>
+                <w:bCs w:val="0"/>
+              </w:rPr>
+            </w:pPr>
+            <w:r>
+              <w:rPr>
+                <w:rFonts w:cstheme="minorHAnsi"/>
+                <w:b w:val="0"/>
+                <w:bCs w:val="0"/>
+              </w:rPr>
+              <w:t xml:space="preserve">Preencher o </w:t>
+            </w:r>
+            <w:proofErr w:type="spellStart"/>
+            <w:r>
+              <w:rPr>
+                <w:rFonts w:cstheme="minorHAnsi"/>
+                <w:b w:val="0"/>
+                <w:bCs w:val="0"/>
+              </w:rPr>
+              <w:t>cosnumo</w:t>
+            </w:r>
+            <w:proofErr w:type="spellEnd"/>
+            <w:r>
+              <w:rPr>
+                <w:rFonts w:cstheme="minorHAnsi"/>
+                <w:b w:val="0"/>
+                <w:bCs w:val="0"/>
+              </w:rPr>
+              <w:t xml:space="preserve"> de </w:t>
+            </w:r>
+            <w:proofErr w:type="spellStart"/>
+            <w:r>
+              <w:rPr>
+                <w:rFonts w:cstheme="minorHAnsi"/>
+                <w:b w:val="0"/>
+                <w:bCs w:val="0"/>
+              </w:rPr>
+              <w:t>enrgia</w:t>
+            </w:r>
+            <w:proofErr w:type="spellEnd"/>
+            <w:r>
+              <w:rPr>
+                <w:rFonts w:cstheme="minorHAnsi"/>
+                <w:b w:val="0"/>
+                <w:bCs w:val="0"/>
+              </w:rPr>
+              <w:t xml:space="preserve">, entrando com </w:t>
+            </w:r>
+            <w:proofErr w:type="spellStart"/>
+            <w:r>
+              <w:rPr>
+                <w:rFonts w:cstheme="minorHAnsi"/>
+                <w:b w:val="0"/>
+                <w:bCs w:val="0"/>
+              </w:rPr>
+              <w:t>kw</w:t>
+            </w:r>
+            <w:proofErr w:type="spellEnd"/>
+            <w:r>
+              <w:rPr>
+                <w:rFonts w:cstheme="minorHAnsi"/>
+                <w:b w:val="0"/>
+                <w:bCs w:val="0"/>
+              </w:rPr>
+              <w:t>/h</w:t>
+            </w:r>
+          </w:p>
+        </w:tc>
+        <w:tc>
+          <w:tcPr>
+            <w:tcW w:w="4508" w:type="dxa"/>
+            <w:tcBorders>
+              <w:top w:val="single" w:sz="4" w:space="0" w:color="95B3D7" w:themeColor="accent1" w:themeTint="99"/>
+              <w:left w:val="single" w:sz="4" w:space="0" w:color="95B3D7" w:themeColor="accent1" w:themeTint="99"/>
+              <w:bottom w:val="single" w:sz="4" w:space="0" w:color="95B3D7" w:themeColor="accent1" w:themeTint="99"/>
+              <w:right w:val="single" w:sz="4" w:space="0" w:color="95B3D7" w:themeColor="accent1" w:themeTint="99"/>
+            </w:tcBorders>
+            <w:vAlign w:val="center"/>
+          </w:tcPr>
+          <w:p>
+            <w:pPr>
+              <w:pStyle w:val="PargrafodaLista"/>
+              <w:numPr>
+                <w:ilvl w:val="0"/>
+                <w:numId w:val="9"/>
+              </w:numPr>
+              <w:cnfStyle w:val="000000100000" w:firstRow="0" w:lastRow="0" w:firstColumn="0" w:lastColumn="0" w:oddVBand="0" w:evenVBand="0" w:oddHBand="1" w:evenHBand="0" w:firstRowFirstColumn="0" w:firstRowLastColumn="0" w:lastRowFirstColumn="0" w:lastRowLastColumn="0"/>
+              <w:rPr>
+                <w:rFonts w:ascii="Arial" w:hAnsi="Arial"/>
+              </w:rPr>
+            </w:pPr>
+            <w:r>
+              <w:t xml:space="preserve">Apresentar o campo de </w:t>
+            </w:r>
+            <w:r>
+              <w:t xml:space="preserve">registo de consumo de </w:t>
+            </w:r>
+            <w:proofErr w:type="spellStart"/>
+            <w:r>
+              <w:t>enrgia</w:t>
+            </w:r>
+            <w:proofErr w:type="spellEnd"/>
+          </w:p>
+          <w:p>
+            <w:pPr>
+              <w:pStyle w:val="PargrafodaLista"/>
+              <w:numPr>
+                <w:ilvl w:val="0"/>
+                <w:numId w:val="9"/>
+              </w:numPr>
+              <w:cnfStyle w:val="000000100000" w:firstRow="0" w:lastRow="0" w:firstColumn="0" w:lastColumn="0" w:oddVBand="0" w:evenVBand="0" w:oddHBand="1" w:evenHBand="0" w:firstRowFirstColumn="0" w:firstRowLastColumn="0" w:lastRowFirstColumn="0" w:lastRowLastColumn="0"/>
+              <w:rPr>
+                <w:rFonts w:ascii="Arial" w:hAnsi="Arial"/>
+              </w:rPr>
+            </w:pPr>
+            <w:r>
+              <w:t>Validar os dados preenchidos</w:t>
+            </w:r>
+            <w:r>
+              <w:t>, fazendo análise do consumo anterior determinando se ouve um aumento ou queda no consumo</w:t>
+            </w:r>
+            <w:r>
+              <w:t xml:space="preserve"> e armazená-los</w:t>
+            </w:r>
+          </w:p>
+          <w:p>
+            <w:pPr>
+              <w:pStyle w:val="PargrafodaLista"/>
+              <w:cnfStyle w:val="000000100000" w:firstRow="0" w:lastRow="0" w:firstColumn="0" w:lastColumn="0" w:oddVBand="0" w:evenVBand="0" w:oddHBand="1" w:evenHBand="0" w:firstRowFirstColumn="0" w:firstRowLastColumn="0" w:lastRowFirstColumn="0" w:lastRowLastColumn="0"/>
+              <w:rPr>
+                <w:rFonts w:ascii="Arial" w:hAnsi="Arial"/>
+              </w:rPr>
+            </w:pPr>
+          </w:p>
+        </w:tc>
+      </w:tr>
+    </w:tbl>
+    <w:p>
+      <w:pPr>
+        <w:tabs>
+          <w:tab w:val="left" w:pos="930"/>
+        </w:tabs>
+        <w:jc w:val="center"/>
+        <w:rPr>
+          <w:b/>
+          <w:sz w:val="28"/>
+          <w:szCs w:val="28"/>
+        </w:rPr>
+      </w:pPr>
+    </w:p>
+    <w:p>
+      <w:pPr>
+        <w:rPr>
+          <w:b/>
+          <w:sz w:val="28"/>
+          <w:szCs w:val="28"/>
+        </w:rPr>
+      </w:pPr>
+      <w:r>
+        <w:rPr>
+          <w:b/>
+          <w:sz w:val="28"/>
+          <w:szCs w:val="28"/>
+        </w:rPr>
+        <w:br w:type="page"/>
+      </w:r>
+    </w:p>
+    <w:p>
+      <w:pPr>
+        <w:tabs>
+          <w:tab w:val="left" w:pos="930"/>
+        </w:tabs>
+        <w:jc w:val="center"/>
+        <w:rPr>
+          <w:b/>
+          <w:sz w:val="28"/>
+          <w:szCs w:val="28"/>
+        </w:rPr>
+      </w:pPr>
+    </w:p>
+    <w:p>
+      <w:pPr>
+        <w:tabs>
+          <w:tab w:val="left" w:pos="930"/>
+        </w:tabs>
+        <w:jc w:val="center"/>
+        <w:rPr>
+          <w:b/>
+          <w:sz w:val="28"/>
+          <w:szCs w:val="28"/>
+        </w:rPr>
+      </w:pPr>
+    </w:p>
+    <w:tbl>
+      <w:tblPr>
+        <w:tblStyle w:val="TabeladeGrelha4-Destaque12"/>
+        <w:tblW w:w="0" w:type="auto"/>
+        <w:tblInd w:w="0" w:type="dxa"/>
+        <w:tblLook w:val="04A0" w:firstRow="1" w:lastRow="0" w:firstColumn="1" w:lastColumn="0" w:noHBand="0" w:noVBand="1"/>
+      </w:tblPr>
+      <w:tblGrid>
+        <w:gridCol w:w="4342"/>
+        <w:gridCol w:w="4378"/>
+      </w:tblGrid>
+      <w:tr>
+        <w:trPr>
+          <w:cnfStyle w:val="100000000000" w:firstRow="1" w:lastRow="0" w:firstColumn="0" w:lastColumn="0" w:oddVBand="0" w:evenVBand="0" w:oddHBand="0" w:evenHBand="0" w:firstRowFirstColumn="0" w:firstRowLastColumn="0" w:lastRowFirstColumn="0" w:lastRowLastColumn="0"/>
+          <w:trHeight w:val="418"/>
+        </w:trPr>
+        <w:tc>
+          <w:tcPr>
+            <w:cnfStyle w:val="001000000000" w:firstRow="0" w:lastRow="0" w:firstColumn="1" w:lastColumn="0" w:oddVBand="0" w:evenVBand="0" w:oddHBand="0" w:evenHBand="0" w:firstRowFirstColumn="0" w:firstRowLastColumn="0" w:lastRowFirstColumn="0" w:lastRowLastColumn="0"/>
+            <w:tcW w:w="4508" w:type="dxa"/>
+            <w:tcBorders>
+              <w:right w:val="nil"/>
+            </w:tcBorders>
+            <w:vAlign w:val="center"/>
+            <w:hideMark/>
+          </w:tcPr>
+          <w:p>
+            <w:pPr>
+              <w:rPr>
+                <w:rFonts w:ascii="Arial" w:hAnsi="Arial"/>
+              </w:rPr>
+            </w:pPr>
+            <w:r>
+              <w:t>Nome do caso de uso</w:t>
+            </w:r>
+          </w:p>
+        </w:tc>
+        <w:tc>
+          <w:tcPr>
+            <w:tcW w:w="4508" w:type="dxa"/>
+            <w:tcBorders>
+              <w:left w:val="nil"/>
+            </w:tcBorders>
+            <w:vAlign w:val="center"/>
+            <w:hideMark/>
+          </w:tcPr>
+          <w:p>
+            <w:pPr>
+              <w:pStyle w:val="PargrafodaLista"/>
+              <w:numPr>
+                <w:ilvl w:val="0"/>
+                <w:numId w:val="4"/>
+              </w:numPr>
+              <w:jc w:val="both"/>
+              <w:cnfStyle w:val="100000000000" w:firstRow="1" w:lastRow="0" w:firstColumn="0" w:lastColumn="0" w:oddVBand="0" w:evenVBand="0" w:oddHBand="0" w:evenHBand="0" w:firstRowFirstColumn="0" w:firstRowLastColumn="0" w:lastRowFirstColumn="0" w:lastRowLastColumn="0"/>
+            </w:pPr>
+            <w:r>
+              <w:t>Aviso antecipado para o pagamento</w:t>
+            </w:r>
+          </w:p>
+        </w:tc>
+      </w:tr>
+      <w:tr>
+        <w:trPr>
+          <w:cnfStyle w:val="000000100000" w:firstRow="0" w:lastRow="0" w:firstColumn="0" w:lastColumn="0" w:oddVBand="0" w:evenVBand="0" w:oddHBand="1" w:evenHBand="0" w:firstRowFirstColumn="0" w:firstRowLastColumn="0" w:lastRowFirstColumn="0" w:lastRowLastColumn="0"/>
+        </w:trPr>
+        <w:tc>
+          <w:tcPr>
+            <w:cnfStyle w:val="001000000000" w:firstRow="0" w:lastRow="0" w:firstColumn="1" w:lastColumn="0" w:oddVBand="0" w:evenVBand="0" w:oddHBand="0" w:evenHBand="0" w:firstRowFirstColumn="0" w:firstRowLastColumn="0" w:lastRowFirstColumn="0" w:lastRowLastColumn="0"/>
+            <w:tcW w:w="4508" w:type="dxa"/>
+            <w:tcBorders>
+              <w:top w:val="single" w:sz="4" w:space="0" w:color="95B3D7" w:themeColor="accent1" w:themeTint="99"/>
+              <w:left w:val="single" w:sz="4" w:space="0" w:color="95B3D7" w:themeColor="accent1" w:themeTint="99"/>
+              <w:bottom w:val="single" w:sz="4" w:space="0" w:color="95B3D7" w:themeColor="accent1" w:themeTint="99"/>
+              <w:right w:val="single" w:sz="4" w:space="0" w:color="95B3D7" w:themeColor="accent1" w:themeTint="99"/>
+            </w:tcBorders>
+            <w:vAlign w:val="center"/>
+            <w:hideMark/>
+          </w:tcPr>
+          <w:p>
+            <w:pPr>
+              <w:rPr>
+                <w:rFonts w:ascii="Arial" w:hAnsi="Arial"/>
+              </w:rPr>
+            </w:pPr>
+            <w:r>
+              <w:t>Autor</w:t>
+            </w:r>
+          </w:p>
+        </w:tc>
+        <w:tc>
+          <w:tcPr>
+            <w:tcW w:w="4508" w:type="dxa"/>
+            <w:tcBorders>
+              <w:top w:val="single" w:sz="4" w:space="0" w:color="95B3D7" w:themeColor="accent1" w:themeTint="99"/>
+              <w:left w:val="single" w:sz="4" w:space="0" w:color="95B3D7" w:themeColor="accent1" w:themeTint="99"/>
+              <w:bottom w:val="single" w:sz="4" w:space="0" w:color="95B3D7" w:themeColor="accent1" w:themeTint="99"/>
+              <w:right w:val="single" w:sz="4" w:space="0" w:color="95B3D7" w:themeColor="accent1" w:themeTint="99"/>
+            </w:tcBorders>
+            <w:vAlign w:val="center"/>
+            <w:hideMark/>
+          </w:tcPr>
+          <w:p>
+            <w:pPr>
+              <w:cnfStyle w:val="000000100000" w:firstRow="0" w:lastRow="0" w:firstColumn="0" w:lastColumn="0" w:oddVBand="0" w:evenVBand="0" w:oddHBand="1" w:evenHBand="0" w:firstRowFirstColumn="0" w:firstRowLastColumn="0" w:lastRowFirstColumn="0" w:lastRowLastColumn="0"/>
+              <w:rPr>
+                <w:rFonts w:ascii="Arial" w:hAnsi="Arial"/>
+              </w:rPr>
+            </w:pPr>
+            <w:proofErr w:type="spellStart"/>
+            <w:r>
+              <w:t>diretor</w:t>
+            </w:r>
+            <w:proofErr w:type="spellEnd"/>
+          </w:p>
+        </w:tc>
+      </w:tr>
+      <w:tr>
+        <w:tc>
+          <w:tcPr>
+            <w:cnfStyle w:val="001000000000" w:firstRow="0" w:lastRow="0" w:firstColumn="1" w:lastColumn="0" w:oddVBand="0" w:evenVBand="0" w:oddHBand="0" w:evenHBand="0" w:firstRowFirstColumn="0" w:firstRowLastColumn="0" w:lastRowFirstColumn="0" w:lastRowLastColumn="0"/>
+            <w:tcW w:w="4508" w:type="dxa"/>
+            <w:tcBorders>
+              <w:top w:val="single" w:sz="4" w:space="0" w:color="95B3D7" w:themeColor="accent1" w:themeTint="99"/>
+              <w:left w:val="single" w:sz="4" w:space="0" w:color="95B3D7" w:themeColor="accent1" w:themeTint="99"/>
+              <w:bottom w:val="single" w:sz="4" w:space="0" w:color="95B3D7" w:themeColor="accent1" w:themeTint="99"/>
+              <w:right w:val="single" w:sz="4" w:space="0" w:color="95B3D7" w:themeColor="accent1" w:themeTint="99"/>
+            </w:tcBorders>
+            <w:vAlign w:val="center"/>
+            <w:hideMark/>
+          </w:tcPr>
+          <w:p>
+            <w:pPr>
+              <w:rPr>
+                <w:rFonts w:ascii="Arial" w:hAnsi="Arial"/>
+              </w:rPr>
+            </w:pPr>
+            <w:r>
+              <w:t>Propósito</w:t>
+            </w:r>
+          </w:p>
+        </w:tc>
+        <w:tc>
+          <w:tcPr>
+            <w:tcW w:w="4508" w:type="dxa"/>
+            <w:tcBorders>
+              <w:top w:val="single" w:sz="4" w:space="0" w:color="95B3D7" w:themeColor="accent1" w:themeTint="99"/>
+              <w:left w:val="single" w:sz="4" w:space="0" w:color="95B3D7" w:themeColor="accent1" w:themeTint="99"/>
+              <w:bottom w:val="single" w:sz="4" w:space="0" w:color="95B3D7" w:themeColor="accent1" w:themeTint="99"/>
+              <w:right w:val="single" w:sz="4" w:space="0" w:color="95B3D7" w:themeColor="accent1" w:themeTint="99"/>
+            </w:tcBorders>
+            <w:vAlign w:val="center"/>
+            <w:hideMark/>
+          </w:tcPr>
+          <w:p>
+            <w:pPr>
+              <w:cnfStyle w:val="000000000000" w:firstRow="0" w:lastRow="0" w:firstColumn="0" w:lastColumn="0" w:oddVBand="0" w:evenVBand="0" w:oddHBand="0" w:evenHBand="0" w:firstRowFirstColumn="0" w:firstRowLastColumn="0" w:lastRowFirstColumn="0" w:lastRowLastColumn="0"/>
+              <w:rPr>
+                <w:rFonts w:ascii="Arial" w:hAnsi="Arial"/>
+              </w:rPr>
+            </w:pPr>
+            <w:r>
+              <w:t>Antecipar a data do pagamento</w:t>
+            </w:r>
+          </w:p>
+        </w:tc>
+      </w:tr>
+      <w:tr>
+        <w:trPr>
+          <w:cnfStyle w:val="000000100000" w:firstRow="0" w:lastRow="0" w:firstColumn="0" w:lastColumn="0" w:oddVBand="0" w:evenVBand="0" w:oddHBand="1" w:evenHBand="0" w:firstRowFirstColumn="0" w:firstRowLastColumn="0" w:lastRowFirstColumn="0" w:lastRowLastColumn="0"/>
+          <w:trHeight w:val="1593"/>
+        </w:trPr>
+        <w:tc>
+          <w:tcPr>
+            <w:cnfStyle w:val="001000000000" w:firstRow="0" w:lastRow="0" w:firstColumn="1" w:lastColumn="0" w:oddVBand="0" w:evenVBand="0" w:oddHBand="0" w:evenHBand="0" w:firstRowFirstColumn="0" w:firstRowLastColumn="0" w:lastRowFirstColumn="0" w:lastRowLastColumn="0"/>
+            <w:tcW w:w="9016" w:type="dxa"/>
+            <w:gridSpan w:val="2"/>
+            <w:tcBorders>
+              <w:top w:val="single" w:sz="4" w:space="0" w:color="95B3D7" w:themeColor="accent1" w:themeTint="99"/>
+              <w:left w:val="single" w:sz="4" w:space="0" w:color="95B3D7" w:themeColor="accent1" w:themeTint="99"/>
+              <w:bottom w:val="single" w:sz="4" w:space="0" w:color="95B3D7" w:themeColor="accent1" w:themeTint="99"/>
+              <w:right w:val="single" w:sz="4" w:space="0" w:color="95B3D7" w:themeColor="accent1" w:themeTint="99"/>
+            </w:tcBorders>
+            <w:vAlign w:val="center"/>
+            <w:hideMark/>
+          </w:tcPr>
+          <w:p>
+            <w:pPr>
+              <w:rPr>
+                <w:rFonts w:ascii="Arial" w:hAnsi="Arial"/>
+              </w:rPr>
+            </w:pPr>
+            <w:r>
+              <w:t xml:space="preserve">Resumo: </w:t>
+            </w:r>
+            <w:r>
+              <w:rPr>
+                <w:b w:val="0"/>
+                <w:bCs w:val="0"/>
+              </w:rPr>
+              <w:t>O director recebe uma notificação antecipada para o pagamento</w:t>
+            </w:r>
+            <w:r>
+              <w:rPr>
+                <w:b w:val="0"/>
+                <w:bCs w:val="0"/>
+              </w:rPr>
+              <w:t xml:space="preserve">. </w:t>
+            </w:r>
+          </w:p>
+        </w:tc>
+      </w:tr>
+      <w:tr>
+        <w:trPr>
+          <w:trHeight w:val="566"/>
+        </w:trPr>
+        <w:tc>
+          <w:tcPr>
+            <w:cnfStyle w:val="001000000000" w:firstRow="0" w:lastRow="0" w:firstColumn="1" w:lastColumn="0" w:oddVBand="0" w:evenVBand="0" w:oddHBand="0" w:evenHBand="0" w:firstRowFirstColumn="0" w:firstRowLastColumn="0" w:lastRowFirstColumn="0" w:lastRowLastColumn="0"/>
+            <w:tcW w:w="4508" w:type="dxa"/>
+            <w:tcBorders>
+              <w:top w:val="single" w:sz="4" w:space="0" w:color="95B3D7" w:themeColor="accent1" w:themeTint="99"/>
+              <w:left w:val="single" w:sz="4" w:space="0" w:color="95B3D7" w:themeColor="accent1" w:themeTint="99"/>
+              <w:bottom w:val="single" w:sz="4" w:space="0" w:color="95B3D7" w:themeColor="accent1" w:themeTint="99"/>
+              <w:right w:val="single" w:sz="4" w:space="0" w:color="95B3D7" w:themeColor="accent1" w:themeTint="99"/>
+            </w:tcBorders>
+            <w:vAlign w:val="center"/>
+            <w:hideMark/>
+          </w:tcPr>
+          <w:p>
+            <w:pPr>
+              <w:rPr>
+                <w:rFonts w:ascii="Arial" w:hAnsi="Arial"/>
+              </w:rPr>
+            </w:pPr>
+            <w:r>
+              <w:t>Pré-condições</w:t>
+            </w:r>
+          </w:p>
+        </w:tc>
+        <w:tc>
+          <w:tcPr>
+            <w:tcW w:w="4508" w:type="dxa"/>
+            <w:tcBorders>
+              <w:top w:val="single" w:sz="4" w:space="0" w:color="95B3D7" w:themeColor="accent1" w:themeTint="99"/>
+              <w:left w:val="single" w:sz="4" w:space="0" w:color="95B3D7" w:themeColor="accent1" w:themeTint="99"/>
+              <w:bottom w:val="single" w:sz="4" w:space="0" w:color="95B3D7" w:themeColor="accent1" w:themeTint="99"/>
+              <w:right w:val="single" w:sz="4" w:space="0" w:color="95B3D7" w:themeColor="accent1" w:themeTint="99"/>
+            </w:tcBorders>
+            <w:vAlign w:val="center"/>
+            <w:hideMark/>
+          </w:tcPr>
+          <w:p>
+            <w:pPr>
+              <w:cnfStyle w:val="000000000000" w:firstRow="0" w:lastRow="0" w:firstColumn="0" w:lastColumn="0" w:oddVBand="0" w:evenVBand="0" w:oddHBand="0" w:evenHBand="0" w:firstRowFirstColumn="0" w:firstRowLastColumn="0" w:lastRowFirstColumn="0" w:lastRowLastColumn="0"/>
+              <w:rPr>
+                <w:rFonts w:ascii="Arial" w:hAnsi="Arial"/>
+              </w:rPr>
+            </w:pPr>
+            <w:r>
+              <w:t xml:space="preserve">Ser </w:t>
+            </w:r>
+            <w:r>
+              <w:t>o director da empresa</w:t>
+            </w:r>
+          </w:p>
+        </w:tc>
+      </w:tr>
+      <w:tr>
+        <w:trPr>
+          <w:cnfStyle w:val="000000100000" w:firstRow="0" w:lastRow="0" w:firstColumn="0" w:lastColumn="0" w:oddVBand="0" w:evenVBand="0" w:oddHBand="1" w:evenHBand="0" w:firstRowFirstColumn="0" w:firstRowLastColumn="0" w:lastRowFirstColumn="0" w:lastRowLastColumn="0"/>
+          <w:trHeight w:val="566"/>
+        </w:trPr>
+        <w:tc>
+          <w:tcPr>
+            <w:cnfStyle w:val="001000000000" w:firstRow="0" w:lastRow="0" w:firstColumn="1" w:lastColumn="0" w:oddVBand="0" w:evenVBand="0" w:oddHBand="0" w:evenHBand="0" w:firstRowFirstColumn="0" w:firstRowLastColumn="0" w:lastRowFirstColumn="0" w:lastRowLastColumn="0"/>
+            <w:tcW w:w="9016" w:type="dxa"/>
+            <w:gridSpan w:val="2"/>
+            <w:tcBorders>
+              <w:top w:val="single" w:sz="4" w:space="0" w:color="95B3D7" w:themeColor="accent1" w:themeTint="99"/>
+              <w:left w:val="single" w:sz="4" w:space="0" w:color="95B3D7" w:themeColor="accent1" w:themeTint="99"/>
+              <w:bottom w:val="single" w:sz="4" w:space="0" w:color="95B3D7" w:themeColor="accent1" w:themeTint="99"/>
+              <w:right w:val="single" w:sz="4" w:space="0" w:color="95B3D7" w:themeColor="accent1" w:themeTint="99"/>
+            </w:tcBorders>
+            <w:vAlign w:val="center"/>
+            <w:hideMark/>
+          </w:tcPr>
+          <w:p>
+            <w:pPr>
+              <w:jc w:val="center"/>
+              <w:rPr>
+                <w:rFonts w:ascii="Arial" w:hAnsi="Arial"/>
+              </w:rPr>
+            </w:pPr>
+            <w:r>
+              <w:t>Fluxo Básico</w:t>
+            </w:r>
+          </w:p>
+        </w:tc>
+      </w:tr>
+      <w:tr>
+        <w:trPr>
+          <w:trHeight w:val="566"/>
+        </w:trPr>
+        <w:tc>
+          <w:tcPr>
+            <w:cnfStyle w:val="001000000000" w:firstRow="0" w:lastRow="0" w:firstColumn="1" w:lastColumn="0" w:oddVBand="0" w:evenVBand="0" w:oddHBand="0" w:evenHBand="0" w:firstRowFirstColumn="0" w:firstRowLastColumn="0" w:lastRowFirstColumn="0" w:lastRowLastColumn="0"/>
+            <w:tcW w:w="4508" w:type="dxa"/>
+            <w:tcBorders>
+              <w:top w:val="single" w:sz="4" w:space="0" w:color="95B3D7" w:themeColor="accent1" w:themeTint="99"/>
+              <w:left w:val="single" w:sz="4" w:space="0" w:color="95B3D7" w:themeColor="accent1" w:themeTint="99"/>
+              <w:bottom w:val="single" w:sz="4" w:space="0" w:color="95B3D7" w:themeColor="accent1" w:themeTint="99"/>
+              <w:right w:val="single" w:sz="4" w:space="0" w:color="95B3D7" w:themeColor="accent1" w:themeTint="99"/>
+            </w:tcBorders>
+            <w:vAlign w:val="center"/>
+            <w:hideMark/>
+          </w:tcPr>
+          <w:p>
+            <w:pPr>
+              <w:rPr>
+                <w:rFonts w:ascii="Arial" w:hAnsi="Arial"/>
+              </w:rPr>
+            </w:pPr>
+            <w:r>
+              <w:t>Acção do actor</w:t>
+            </w:r>
+          </w:p>
+        </w:tc>
+        <w:tc>
+          <w:tcPr>
+            <w:tcW w:w="4508" w:type="dxa"/>
+            <w:tcBorders>
+              <w:top w:val="single" w:sz="4" w:space="0" w:color="95B3D7" w:themeColor="accent1" w:themeTint="99"/>
+              <w:left w:val="single" w:sz="4" w:space="0" w:color="95B3D7" w:themeColor="accent1" w:themeTint="99"/>
+              <w:bottom w:val="single" w:sz="4" w:space="0" w:color="95B3D7" w:themeColor="accent1" w:themeTint="99"/>
+              <w:right w:val="single" w:sz="4" w:space="0" w:color="95B3D7" w:themeColor="accent1" w:themeTint="99"/>
+            </w:tcBorders>
+            <w:vAlign w:val="center"/>
+            <w:hideMark/>
+          </w:tcPr>
+          <w:p>
+            <w:pPr>
+              <w:cnfStyle w:val="000000000000" w:firstRow="0" w:lastRow="0" w:firstColumn="0" w:lastColumn="0" w:oddVBand="0" w:evenVBand="0" w:oddHBand="0" w:evenHBand="0" w:firstRowFirstColumn="0" w:firstRowLastColumn="0" w:lastRowFirstColumn="0" w:lastRowLastColumn="0"/>
+              <w:rPr>
+                <w:rFonts w:ascii="Arial" w:hAnsi="Arial"/>
+                <w:b/>
+                <w:bCs/>
+              </w:rPr>
+            </w:pPr>
+            <w:r>
+              <w:rPr>
+                <w:b/>
+                <w:bCs/>
+              </w:rPr>
+              <w:t>Resposta do Sistema</w:t>
+            </w:r>
+          </w:p>
+        </w:tc>
+      </w:tr>
+      <w:tr>
+        <w:trPr>
+          <w:cnfStyle w:val="000000100000" w:firstRow="0" w:lastRow="0" w:firstColumn="0" w:lastColumn="0" w:oddVBand="0" w:evenVBand="0" w:oddHBand="1" w:evenHBand="0" w:firstRowFirstColumn="0" w:firstRowLastColumn="0" w:lastRowFirstColumn="0" w:lastRowLastColumn="0"/>
+          <w:trHeight w:val="566"/>
+        </w:trPr>
+        <w:tc>
+          <w:tcPr>
+            <w:cnfStyle w:val="001000000000" w:firstRow="0" w:lastRow="0" w:firstColumn="1" w:lastColumn="0" w:oddVBand="0" w:evenVBand="0" w:oddHBand="0" w:evenHBand="0" w:firstRowFirstColumn="0" w:firstRowLastColumn="0" w:lastRowFirstColumn="0" w:lastRowLastColumn="0"/>
+            <w:tcW w:w="4508" w:type="dxa"/>
+            <w:tcBorders>
+              <w:top w:val="single" w:sz="4" w:space="0" w:color="95B3D7" w:themeColor="accent1" w:themeTint="99"/>
+              <w:left w:val="single" w:sz="4" w:space="0" w:color="95B3D7" w:themeColor="accent1" w:themeTint="99"/>
+              <w:bottom w:val="single" w:sz="4" w:space="0" w:color="95B3D7" w:themeColor="accent1" w:themeTint="99"/>
+              <w:right w:val="single" w:sz="4" w:space="0" w:color="95B3D7" w:themeColor="accent1" w:themeTint="99"/>
+            </w:tcBorders>
+            <w:vAlign w:val="center"/>
+          </w:tcPr>
+          <w:p>
+            <w:pPr>
+              <w:pStyle w:val="PargrafodaLista"/>
+              <w:numPr>
+                <w:ilvl w:val="0"/>
+                <w:numId w:val="10"/>
+              </w:numPr>
+              <w:rPr>
+                <w:rFonts w:cstheme="minorHAnsi"/>
+              </w:rPr>
+            </w:pPr>
+            <w:r>
+              <w:rPr>
+                <w:rFonts w:cstheme="minorHAnsi"/>
+              </w:rPr>
+              <w:t>Estar conectado a internet</w:t>
+            </w:r>
+          </w:p>
+        </w:tc>
+        <w:tc>
+          <w:tcPr>
+            <w:tcW w:w="4508" w:type="dxa"/>
+            <w:tcBorders>
+              <w:top w:val="single" w:sz="4" w:space="0" w:color="95B3D7" w:themeColor="accent1" w:themeTint="99"/>
+              <w:left w:val="single" w:sz="4" w:space="0" w:color="95B3D7" w:themeColor="accent1" w:themeTint="99"/>
+              <w:bottom w:val="single" w:sz="4" w:space="0" w:color="95B3D7" w:themeColor="accent1" w:themeTint="99"/>
+              <w:right w:val="single" w:sz="4" w:space="0" w:color="95B3D7" w:themeColor="accent1" w:themeTint="99"/>
+            </w:tcBorders>
+            <w:vAlign w:val="center"/>
+          </w:tcPr>
+          <w:p>
+            <w:pPr>
+              <w:pStyle w:val="PargrafodaLista"/>
+              <w:numPr>
+                <w:ilvl w:val="0"/>
+                <w:numId w:val="10"/>
+              </w:numPr>
+              <w:cnfStyle w:val="000000100000" w:firstRow="0" w:lastRow="0" w:firstColumn="0" w:lastColumn="0" w:oddVBand="0" w:evenVBand="0" w:oddHBand="1" w:evenHBand="0" w:firstRowFirstColumn="0" w:firstRowLastColumn="0" w:lastRowFirstColumn="0" w:lastRowLastColumn="0"/>
+              <w:rPr>
+                <w:rFonts w:ascii="Arial" w:hAnsi="Arial"/>
+              </w:rPr>
+            </w:pPr>
+            <w:r>
+              <w:t>Apresentar uma notificação do próximo pagamento</w:t>
+            </w:r>
+          </w:p>
+          <w:p>
+            <w:pPr>
+              <w:cnfStyle w:val="000000100000" w:firstRow="0" w:lastRow="0" w:firstColumn="0" w:lastColumn="0" w:oddVBand="0" w:evenVBand="0" w:oddHBand="1" w:evenHBand="0" w:firstRowFirstColumn="0" w:firstRowLastColumn="0" w:lastRowFirstColumn="0" w:lastRowLastColumn="0"/>
+              <w:rPr>
+                <w:rFonts w:ascii="Arial" w:hAnsi="Arial"/>
+              </w:rPr>
+            </w:pPr>
+          </w:p>
+        </w:tc>
+      </w:tr>
+    </w:tbl>
+    <w:p>
+      <w:pPr>
+        <w:tabs>
+          <w:tab w:val="left" w:pos="930"/>
+        </w:tabs>
+        <w:jc w:val="center"/>
+        <w:rPr>
+          <w:b/>
+          <w:sz w:val="28"/>
+          <w:szCs w:val="28"/>
+        </w:rPr>
+      </w:pPr>
+    </w:p>
+    <w:p>
+      <w:pPr>
+        <w:rPr>
+          <w:b/>
+          <w:sz w:val="28"/>
+          <w:szCs w:val="28"/>
+        </w:rPr>
+      </w:pPr>
+      <w:r>
+        <w:rPr>
+          <w:b/>
+          <w:sz w:val="28"/>
+          <w:szCs w:val="28"/>
+        </w:rPr>
+        <w:br w:type="page"/>
+      </w:r>
+    </w:p>
+    <w:p>
+      <w:pPr>
+        <w:tabs>
+          <w:tab w:val="left" w:pos="930"/>
+        </w:tabs>
+        <w:jc w:val="center"/>
+        <w:rPr>
+          <w:b/>
+          <w:sz w:val="28"/>
+          <w:szCs w:val="28"/>
+        </w:rPr>
+      </w:pPr>
+    </w:p>
+    <w:tbl>
+      <w:tblPr>
+        <w:tblStyle w:val="TabeladeGrelha4-Destaque12"/>
+        <w:tblW w:w="0" w:type="auto"/>
+        <w:tblInd w:w="0" w:type="dxa"/>
+        <w:tblLook w:val="04A0" w:firstRow="1" w:lastRow="0" w:firstColumn="1" w:lastColumn="0" w:noHBand="0" w:noVBand="1"/>
+      </w:tblPr>
+      <w:tblGrid>
+        <w:gridCol w:w="5180"/>
+        <w:gridCol w:w="3540"/>
+      </w:tblGrid>
+      <w:tr>
+        <w:trPr>
+          <w:cnfStyle w:val="100000000000" w:firstRow="1" w:lastRow="0" w:firstColumn="0" w:lastColumn="0" w:oddVBand="0" w:evenVBand="0" w:oddHBand="0" w:evenHBand="0" w:firstRowFirstColumn="0" w:firstRowLastColumn="0" w:lastRowFirstColumn="0" w:lastRowLastColumn="0"/>
+          <w:trHeight w:val="418"/>
+        </w:trPr>
+        <w:tc>
+          <w:tcPr>
+            <w:cnfStyle w:val="001000000000" w:firstRow="0" w:lastRow="0" w:firstColumn="1" w:lastColumn="0" w:oddVBand="0" w:evenVBand="0" w:oddHBand="0" w:evenHBand="0" w:firstRowFirstColumn="0" w:firstRowLastColumn="0" w:lastRowFirstColumn="0" w:lastRowLastColumn="0"/>
+            <w:tcW w:w="4508" w:type="dxa"/>
+            <w:tcBorders>
+              <w:right w:val="nil"/>
+            </w:tcBorders>
+            <w:vAlign w:val="center"/>
+            <w:hideMark/>
+          </w:tcPr>
+          <w:p>
+            <w:pPr>
+              <w:rPr>
+                <w:rFonts w:ascii="Arial" w:hAnsi="Arial"/>
+              </w:rPr>
+            </w:pPr>
+            <w:r>
+              <w:t>Nome do caso de uso</w:t>
+            </w:r>
+          </w:p>
+        </w:tc>
+        <w:tc>
+          <w:tcPr>
+            <w:tcW w:w="4508" w:type="dxa"/>
+            <w:tcBorders>
+              <w:left w:val="nil"/>
+            </w:tcBorders>
+            <w:vAlign w:val="center"/>
+            <w:hideMark/>
+          </w:tcPr>
+          <w:p>
+            <w:pPr>
+              <w:pStyle w:val="PargrafodaLista"/>
+              <w:numPr>
+                <w:ilvl w:val="0"/>
+                <w:numId w:val="4"/>
+              </w:numPr>
+              <w:jc w:val="both"/>
+              <w:cnfStyle w:val="100000000000" w:firstRow="1" w:lastRow="0" w:firstColumn="0" w:lastColumn="0" w:oddVBand="0" w:evenVBand="0" w:oddHBand="0" w:evenHBand="0" w:firstRowFirstColumn="0" w:firstRowLastColumn="0" w:lastRowFirstColumn="0" w:lastRowLastColumn="0"/>
+            </w:pPr>
+            <w:r>
+              <w:t>Extrair o relatório do consumo</w:t>
+            </w:r>
+          </w:p>
+        </w:tc>
+      </w:tr>
+      <w:tr>
+        <w:trPr>
+          <w:cnfStyle w:val="000000100000" w:firstRow="0" w:lastRow="0" w:firstColumn="0" w:lastColumn="0" w:oddVBand="0" w:evenVBand="0" w:oddHBand="1" w:evenHBand="0" w:firstRowFirstColumn="0" w:firstRowLastColumn="0" w:lastRowFirstColumn="0" w:lastRowLastColumn="0"/>
+        </w:trPr>
+        <w:tc>
+          <w:tcPr>
+            <w:cnfStyle w:val="001000000000" w:firstRow="0" w:lastRow="0" w:firstColumn="1" w:lastColumn="0" w:oddVBand="0" w:evenVBand="0" w:oddHBand="0" w:evenHBand="0" w:firstRowFirstColumn="0" w:firstRowLastColumn="0" w:lastRowFirstColumn="0" w:lastRowLastColumn="0"/>
+            <w:tcW w:w="4508" w:type="dxa"/>
+            <w:tcBorders>
+              <w:top w:val="single" w:sz="4" w:space="0" w:color="95B3D7" w:themeColor="accent1" w:themeTint="99"/>
+              <w:left w:val="single" w:sz="4" w:space="0" w:color="95B3D7" w:themeColor="accent1" w:themeTint="99"/>
+              <w:bottom w:val="single" w:sz="4" w:space="0" w:color="95B3D7" w:themeColor="accent1" w:themeTint="99"/>
+              <w:right w:val="single" w:sz="4" w:space="0" w:color="95B3D7" w:themeColor="accent1" w:themeTint="99"/>
+            </w:tcBorders>
+            <w:vAlign w:val="center"/>
+            <w:hideMark/>
+          </w:tcPr>
+          <w:p>
+            <w:pPr>
+              <w:rPr>
+                <w:rFonts w:ascii="Arial" w:hAnsi="Arial"/>
+              </w:rPr>
+            </w:pPr>
+            <w:r>
+              <w:t>Autor</w:t>
+            </w:r>
+          </w:p>
+        </w:tc>
+        <w:tc>
+          <w:tcPr>
+            <w:tcW w:w="4508" w:type="dxa"/>
+            <w:tcBorders>
+              <w:top w:val="single" w:sz="4" w:space="0" w:color="95B3D7" w:themeColor="accent1" w:themeTint="99"/>
+              <w:left w:val="single" w:sz="4" w:space="0" w:color="95B3D7" w:themeColor="accent1" w:themeTint="99"/>
+              <w:bottom w:val="single" w:sz="4" w:space="0" w:color="95B3D7" w:themeColor="accent1" w:themeTint="99"/>
+              <w:right w:val="single" w:sz="4" w:space="0" w:color="95B3D7" w:themeColor="accent1" w:themeTint="99"/>
+            </w:tcBorders>
+            <w:vAlign w:val="center"/>
+            <w:hideMark/>
+          </w:tcPr>
+          <w:p>
+            <w:pPr>
+              <w:cnfStyle w:val="000000100000" w:firstRow="0" w:lastRow="0" w:firstColumn="0" w:lastColumn="0" w:oddVBand="0" w:evenVBand="0" w:oddHBand="1" w:evenHBand="0" w:firstRowFirstColumn="0" w:firstRowLastColumn="0" w:lastRowFirstColumn="0" w:lastRowLastColumn="0"/>
+              <w:rPr>
+                <w:rFonts w:ascii="Arial" w:hAnsi="Arial"/>
+              </w:rPr>
+            </w:pPr>
+            <w:proofErr w:type="spellStart"/>
+            <w:r>
+              <w:t>diretor</w:t>
+            </w:r>
+            <w:proofErr w:type="spellEnd"/>
+          </w:p>
+        </w:tc>
+      </w:tr>
+      <w:tr>
+        <w:tc>
+          <w:tcPr>
+            <w:cnfStyle w:val="001000000000" w:firstRow="0" w:lastRow="0" w:firstColumn="1" w:lastColumn="0" w:oddVBand="0" w:evenVBand="0" w:oddHBand="0" w:evenHBand="0" w:firstRowFirstColumn="0" w:firstRowLastColumn="0" w:lastRowFirstColumn="0" w:lastRowLastColumn="0"/>
+            <w:tcW w:w="4508" w:type="dxa"/>
+            <w:tcBorders>
+              <w:top w:val="single" w:sz="4" w:space="0" w:color="95B3D7" w:themeColor="accent1" w:themeTint="99"/>
+              <w:left w:val="single" w:sz="4" w:space="0" w:color="95B3D7" w:themeColor="accent1" w:themeTint="99"/>
+              <w:bottom w:val="single" w:sz="4" w:space="0" w:color="95B3D7" w:themeColor="accent1" w:themeTint="99"/>
+              <w:right w:val="single" w:sz="4" w:space="0" w:color="95B3D7" w:themeColor="accent1" w:themeTint="99"/>
+            </w:tcBorders>
+            <w:vAlign w:val="center"/>
+            <w:hideMark/>
+          </w:tcPr>
+          <w:p>
+            <w:pPr>
+              <w:rPr>
+                <w:rFonts w:ascii="Arial" w:hAnsi="Arial"/>
+              </w:rPr>
+            </w:pPr>
+            <w:r>
+              <w:t>Propósito</w:t>
+            </w:r>
+          </w:p>
+        </w:tc>
+        <w:tc>
+          <w:tcPr>
+            <w:tcW w:w="4508" w:type="dxa"/>
+            <w:tcBorders>
+              <w:top w:val="single" w:sz="4" w:space="0" w:color="95B3D7" w:themeColor="accent1" w:themeTint="99"/>
+              <w:left w:val="single" w:sz="4" w:space="0" w:color="95B3D7" w:themeColor="accent1" w:themeTint="99"/>
+              <w:bottom w:val="single" w:sz="4" w:space="0" w:color="95B3D7" w:themeColor="accent1" w:themeTint="99"/>
+              <w:right w:val="single" w:sz="4" w:space="0" w:color="95B3D7" w:themeColor="accent1" w:themeTint="99"/>
+            </w:tcBorders>
+            <w:vAlign w:val="center"/>
+            <w:hideMark/>
+          </w:tcPr>
+          <w:p>
+            <w:pPr>
+              <w:cnfStyle w:val="000000000000" w:firstRow="0" w:lastRow="0" w:firstColumn="0" w:lastColumn="0" w:oddVBand="0" w:evenVBand="0" w:oddHBand="0" w:evenHBand="0" w:firstRowFirstColumn="0" w:firstRowLastColumn="0" w:lastRowFirstColumn="0" w:lastRowLastColumn="0"/>
+              <w:rPr>
+                <w:rFonts w:ascii="Arial" w:hAnsi="Arial"/>
+              </w:rPr>
+            </w:pPr>
+            <w:r>
+              <w:t>Monitorar a variação do consumo</w:t>
+            </w:r>
+            <w:r>
+              <w:t xml:space="preserve"> para determinar as causas da variação do consumo de energia</w:t>
+            </w:r>
+            <w:r>
+              <w:t xml:space="preserve"> </w:t>
+            </w:r>
+          </w:p>
+        </w:tc>
+      </w:tr>
+      <w:tr>
+        <w:trPr>
+          <w:cnfStyle w:val="000000100000" w:firstRow="0" w:lastRow="0" w:firstColumn="0" w:lastColumn="0" w:oddVBand="0" w:evenVBand="0" w:oddHBand="1" w:evenHBand="0" w:firstRowFirstColumn="0" w:firstRowLastColumn="0" w:lastRowFirstColumn="0" w:lastRowLastColumn="0"/>
+          <w:trHeight w:val="1593"/>
+        </w:trPr>
+        <w:tc>
+          <w:tcPr>
+            <w:cnfStyle w:val="001000000000" w:firstRow="0" w:lastRow="0" w:firstColumn="1" w:lastColumn="0" w:oddVBand="0" w:evenVBand="0" w:oddHBand="0" w:evenHBand="0" w:firstRowFirstColumn="0" w:firstRowLastColumn="0" w:lastRowFirstColumn="0" w:lastRowLastColumn="0"/>
+            <w:tcW w:w="9016" w:type="dxa"/>
+            <w:gridSpan w:val="2"/>
+            <w:tcBorders>
+              <w:top w:val="single" w:sz="4" w:space="0" w:color="95B3D7" w:themeColor="accent1" w:themeTint="99"/>
+              <w:left w:val="single" w:sz="4" w:space="0" w:color="95B3D7" w:themeColor="accent1" w:themeTint="99"/>
+              <w:bottom w:val="single" w:sz="4" w:space="0" w:color="95B3D7" w:themeColor="accent1" w:themeTint="99"/>
+              <w:right w:val="single" w:sz="4" w:space="0" w:color="95B3D7" w:themeColor="accent1" w:themeTint="99"/>
+            </w:tcBorders>
+            <w:vAlign w:val="center"/>
+            <w:hideMark/>
+          </w:tcPr>
+          <w:p>
+            <w:pPr>
+              <w:rPr>
+                <w:rFonts w:ascii="Arial" w:hAnsi="Arial"/>
+              </w:rPr>
+            </w:pPr>
+            <w:r>
+              <w:t xml:space="preserve">Resumo: </w:t>
+            </w:r>
+            <w:r>
+              <w:rPr>
+                <w:b w:val="0"/>
+                <w:bCs w:val="0"/>
+              </w:rPr>
+              <w:t xml:space="preserve">O director </w:t>
+            </w:r>
+            <w:r>
+              <w:rPr>
+                <w:b w:val="0"/>
+                <w:bCs w:val="0"/>
+              </w:rPr>
+              <w:t>deverá ter acesso ao relatório de consumo de energia</w:t>
+            </w:r>
+            <w:r>
+              <w:rPr>
+                <w:b w:val="0"/>
+                <w:bCs w:val="0"/>
+              </w:rPr>
+              <w:t>.</w:t>
+            </w:r>
+          </w:p>
+        </w:tc>
+      </w:tr>
+      <w:tr>
+        <w:trPr>
+          <w:trHeight w:val="566"/>
+        </w:trPr>
+        <w:tc>
+          <w:tcPr>
+            <w:cnfStyle w:val="001000000000" w:firstRow="0" w:lastRow="0" w:firstColumn="1" w:lastColumn="0" w:oddVBand="0" w:evenVBand="0" w:oddHBand="0" w:evenHBand="0" w:firstRowFirstColumn="0" w:firstRowLastColumn="0" w:lastRowFirstColumn="0" w:lastRowLastColumn="0"/>
+            <w:tcW w:w="4508" w:type="dxa"/>
+            <w:tcBorders>
+              <w:top w:val="single" w:sz="4" w:space="0" w:color="95B3D7" w:themeColor="accent1" w:themeTint="99"/>
+              <w:left w:val="single" w:sz="4" w:space="0" w:color="95B3D7" w:themeColor="accent1" w:themeTint="99"/>
+              <w:bottom w:val="single" w:sz="4" w:space="0" w:color="95B3D7" w:themeColor="accent1" w:themeTint="99"/>
+              <w:right w:val="single" w:sz="4" w:space="0" w:color="95B3D7" w:themeColor="accent1" w:themeTint="99"/>
+            </w:tcBorders>
+            <w:vAlign w:val="center"/>
+            <w:hideMark/>
+          </w:tcPr>
+          <w:p>
+            <w:pPr>
+              <w:rPr>
+                <w:rFonts w:ascii="Arial" w:hAnsi="Arial"/>
+              </w:rPr>
+            </w:pPr>
+            <w:r>
+              <w:t>Pré-condições</w:t>
+            </w:r>
+          </w:p>
+        </w:tc>
+        <w:tc>
+          <w:tcPr>
+            <w:tcW w:w="4508" w:type="dxa"/>
+            <w:tcBorders>
+              <w:top w:val="single" w:sz="4" w:space="0" w:color="95B3D7" w:themeColor="accent1" w:themeTint="99"/>
+              <w:left w:val="single" w:sz="4" w:space="0" w:color="95B3D7" w:themeColor="accent1" w:themeTint="99"/>
+              <w:bottom w:val="single" w:sz="4" w:space="0" w:color="95B3D7" w:themeColor="accent1" w:themeTint="99"/>
+              <w:right w:val="single" w:sz="4" w:space="0" w:color="95B3D7" w:themeColor="accent1" w:themeTint="99"/>
+            </w:tcBorders>
+            <w:vAlign w:val="center"/>
+            <w:hideMark/>
+          </w:tcPr>
+          <w:p>
+            <w:pPr>
+              <w:cnfStyle w:val="000000000000" w:firstRow="0" w:lastRow="0" w:firstColumn="0" w:lastColumn="0" w:oddVBand="0" w:evenVBand="0" w:oddHBand="0" w:evenHBand="0" w:firstRowFirstColumn="0" w:firstRowLastColumn="0" w:lastRowFirstColumn="0" w:lastRowLastColumn="0"/>
+              <w:rPr>
+                <w:rFonts w:ascii="Arial" w:hAnsi="Arial"/>
+              </w:rPr>
+            </w:pPr>
+            <w:r>
+              <w:t>Ser o director da empresa</w:t>
+            </w:r>
+          </w:p>
+        </w:tc>
+      </w:tr>
+      <w:tr>
+        <w:trPr>
+          <w:cnfStyle w:val="000000100000" w:firstRow="0" w:lastRow="0" w:firstColumn="0" w:lastColumn="0" w:oddVBand="0" w:evenVBand="0" w:oddHBand="1" w:evenHBand="0" w:firstRowFirstColumn="0" w:firstRowLastColumn="0" w:lastRowFirstColumn="0" w:lastRowLastColumn="0"/>
+          <w:trHeight w:val="566"/>
+        </w:trPr>
+        <w:tc>
+          <w:tcPr>
+            <w:cnfStyle w:val="001000000000" w:firstRow="0" w:lastRow="0" w:firstColumn="1" w:lastColumn="0" w:oddVBand="0" w:evenVBand="0" w:oddHBand="0" w:evenHBand="0" w:firstRowFirstColumn="0" w:firstRowLastColumn="0" w:lastRowFirstColumn="0" w:lastRowLastColumn="0"/>
+            <w:tcW w:w="9016" w:type="dxa"/>
+            <w:gridSpan w:val="2"/>
+            <w:tcBorders>
+              <w:top w:val="single" w:sz="4" w:space="0" w:color="95B3D7" w:themeColor="accent1" w:themeTint="99"/>
+              <w:left w:val="single" w:sz="4" w:space="0" w:color="95B3D7" w:themeColor="accent1" w:themeTint="99"/>
+              <w:bottom w:val="single" w:sz="4" w:space="0" w:color="95B3D7" w:themeColor="accent1" w:themeTint="99"/>
+              <w:right w:val="single" w:sz="4" w:space="0" w:color="95B3D7" w:themeColor="accent1" w:themeTint="99"/>
+            </w:tcBorders>
+            <w:vAlign w:val="center"/>
+            <w:hideMark/>
+          </w:tcPr>
+          <w:p>
+            <w:pPr>
+              <w:jc w:val="center"/>
+              <w:rPr>
+                <w:rFonts w:ascii="Arial" w:hAnsi="Arial"/>
+              </w:rPr>
+            </w:pPr>
+            <w:r>
+              <w:t>Fluxo Básico</w:t>
+            </w:r>
+          </w:p>
+        </w:tc>
+      </w:tr>
+      <w:tr>
+        <w:trPr>
+          <w:trHeight w:val="566"/>
+        </w:trPr>
+        <w:tc>
+          <w:tcPr>
+            <w:cnfStyle w:val="001000000000" w:firstRow="0" w:lastRow="0" w:firstColumn="1" w:lastColumn="0" w:oddVBand="0" w:evenVBand="0" w:oddHBand="0" w:evenHBand="0" w:firstRowFirstColumn="0" w:firstRowLastColumn="0" w:lastRowFirstColumn="0" w:lastRowLastColumn="0"/>
+            <w:tcW w:w="4508" w:type="dxa"/>
+            <w:tcBorders>
+              <w:top w:val="single" w:sz="4" w:space="0" w:color="95B3D7" w:themeColor="accent1" w:themeTint="99"/>
+              <w:left w:val="single" w:sz="4" w:space="0" w:color="95B3D7" w:themeColor="accent1" w:themeTint="99"/>
+              <w:bottom w:val="single" w:sz="4" w:space="0" w:color="95B3D7" w:themeColor="accent1" w:themeTint="99"/>
+              <w:right w:val="single" w:sz="4" w:space="0" w:color="95B3D7" w:themeColor="accent1" w:themeTint="99"/>
+            </w:tcBorders>
+            <w:vAlign w:val="center"/>
+            <w:hideMark/>
+          </w:tcPr>
+          <w:p>
+            <w:pPr>
+              <w:rPr>
+                <w:rFonts w:ascii="Arial" w:hAnsi="Arial"/>
+              </w:rPr>
+            </w:pPr>
+            <w:r>
+              <w:t>Acção do actor</w:t>
+            </w:r>
+          </w:p>
+        </w:tc>
+        <w:tc>
+          <w:tcPr>
+            <w:tcW w:w="4508" w:type="dxa"/>
+            <w:tcBorders>
+              <w:top w:val="single" w:sz="4" w:space="0" w:color="95B3D7" w:themeColor="accent1" w:themeTint="99"/>
+              <w:left w:val="single" w:sz="4" w:space="0" w:color="95B3D7" w:themeColor="accent1" w:themeTint="99"/>
+              <w:bottom w:val="single" w:sz="4" w:space="0" w:color="95B3D7" w:themeColor="accent1" w:themeTint="99"/>
+              <w:right w:val="single" w:sz="4" w:space="0" w:color="95B3D7" w:themeColor="accent1" w:themeTint="99"/>
+            </w:tcBorders>
+            <w:vAlign w:val="center"/>
+            <w:hideMark/>
+          </w:tcPr>
+          <w:p>
+            <w:pPr>
+              <w:cnfStyle w:val="000000000000" w:firstRow="0" w:lastRow="0" w:firstColumn="0" w:lastColumn="0" w:oddVBand="0" w:evenVBand="0" w:oddHBand="0" w:evenHBand="0" w:firstRowFirstColumn="0" w:firstRowLastColumn="0" w:lastRowFirstColumn="0" w:lastRowLastColumn="0"/>
+              <w:rPr>
+                <w:rFonts w:ascii="Arial" w:hAnsi="Arial"/>
+                <w:b/>
+                <w:bCs/>
+              </w:rPr>
+            </w:pPr>
+            <w:r>
+              <w:rPr>
+                <w:b/>
+                <w:bCs/>
+              </w:rPr>
+              <w:t>Resposta do Sistema</w:t>
+            </w:r>
+          </w:p>
+        </w:tc>
+      </w:tr>
+      <w:tr>
+        <w:trPr>
+          <w:cnfStyle w:val="000000100000" w:firstRow="0" w:lastRow="0" w:firstColumn="0" w:lastColumn="0" w:oddVBand="0" w:evenVBand="0" w:oddHBand="1" w:evenHBand="0" w:firstRowFirstColumn="0" w:firstRowLastColumn="0" w:lastRowFirstColumn="0" w:lastRowLastColumn="0"/>
+          <w:trHeight w:val="566"/>
+        </w:trPr>
+        <w:tc>
+          <w:tcPr>
+            <w:cnfStyle w:val="001000000000" w:firstRow="0" w:lastRow="0" w:firstColumn="1" w:lastColumn="0" w:oddVBand="0" w:evenVBand="0" w:oddHBand="0" w:evenHBand="0" w:firstRowFirstColumn="0" w:firstRowLastColumn="0" w:lastRowFirstColumn="0" w:lastRowLastColumn="0"/>
+            <w:tcW w:w="4508" w:type="dxa"/>
+            <w:tcBorders>
+              <w:top w:val="single" w:sz="4" w:space="0" w:color="95B3D7" w:themeColor="accent1" w:themeTint="99"/>
+              <w:left w:val="single" w:sz="4" w:space="0" w:color="95B3D7" w:themeColor="accent1" w:themeTint="99"/>
+              <w:bottom w:val="single" w:sz="4" w:space="0" w:color="95B3D7" w:themeColor="accent1" w:themeTint="99"/>
+              <w:right w:val="single" w:sz="4" w:space="0" w:color="95B3D7" w:themeColor="accent1" w:themeTint="99"/>
+            </w:tcBorders>
+            <w:vAlign w:val="center"/>
+          </w:tcPr>
+          <w:p>
+            <w:pPr>
+              <w:pStyle w:val="PargrafodaLista"/>
+              <w:numPr>
+                <w:ilvl w:val="2"/>
+                <w:numId w:val="10"/>
+              </w:numPr>
+              <w:rPr>
+                <w:rFonts w:cstheme="minorHAnsi"/>
+              </w:rPr>
+            </w:pPr>
+            <w:r>
+              <w:rPr>
+                <w:rFonts w:cstheme="minorHAnsi"/>
+              </w:rPr>
+              <w:t>Clicar em relatório de consumo</w:t>
+            </w:r>
+          </w:p>
+          <w:p>
+            <w:pPr>
+              <w:pStyle w:val="PargrafodaLista"/>
+              <w:numPr>
+                <w:ilvl w:val="2"/>
+                <w:numId w:val="10"/>
+              </w:numPr>
+              <w:rPr>
+                <w:rFonts w:cstheme="minorHAnsi"/>
+                <w:b w:val="0"/>
+                <w:bCs w:val="0"/>
+              </w:rPr>
+            </w:pPr>
+            <w:r>
+              <w:rPr>
+                <w:rFonts w:cstheme="minorHAnsi"/>
+                <w:b w:val="0"/>
+                <w:bCs w:val="0"/>
+              </w:rPr>
+              <w:t>Escolher a data</w:t>
+            </w:r>
+          </w:p>
+          <w:p>
+            <w:pPr>
+              <w:pStyle w:val="PargrafodaLista"/>
+              <w:numPr>
+                <w:ilvl w:val="2"/>
+                <w:numId w:val="10"/>
+              </w:numPr>
+              <w:rPr>
+                <w:rFonts w:cstheme="minorHAnsi"/>
+                <w:b w:val="0"/>
+                <w:bCs w:val="0"/>
+              </w:rPr>
+            </w:pPr>
+            <w:r>
+              <w:rPr>
+                <w:rFonts w:cstheme="minorHAnsi"/>
+                <w:b w:val="0"/>
+                <w:bCs w:val="0"/>
+              </w:rPr>
+              <w:t>Clicar em extrair relatório de consumo</w:t>
+            </w:r>
+          </w:p>
+        </w:tc>
+        <w:tc>
+          <w:tcPr>
+            <w:tcW w:w="4508" w:type="dxa"/>
+            <w:tcBorders>
+              <w:top w:val="single" w:sz="4" w:space="0" w:color="95B3D7" w:themeColor="accent1" w:themeTint="99"/>
+              <w:left w:val="single" w:sz="4" w:space="0" w:color="95B3D7" w:themeColor="accent1" w:themeTint="99"/>
+              <w:bottom w:val="single" w:sz="4" w:space="0" w:color="95B3D7" w:themeColor="accent1" w:themeTint="99"/>
+              <w:right w:val="single" w:sz="4" w:space="0" w:color="95B3D7" w:themeColor="accent1" w:themeTint="99"/>
+            </w:tcBorders>
+            <w:vAlign w:val="center"/>
+          </w:tcPr>
+          <w:p>
+            <w:pPr>
+              <w:pStyle w:val="PargrafodaLista"/>
+              <w:numPr>
+                <w:ilvl w:val="0"/>
+                <w:numId w:val="11"/>
+              </w:numPr>
+              <w:cnfStyle w:val="000000100000" w:firstRow="0" w:lastRow="0" w:firstColumn="0" w:lastColumn="0" w:oddVBand="0" w:evenVBand="0" w:oddHBand="1" w:evenHBand="0" w:firstRowFirstColumn="0" w:firstRowLastColumn="0" w:lastRowFirstColumn="0" w:lastRowLastColumn="0"/>
+              <w:rPr>
+                <w:rFonts w:ascii="Arial" w:hAnsi="Arial"/>
+              </w:rPr>
+            </w:pPr>
+            <w:r>
+              <w:t>Apresentar a área para extrair o consumo.</w:t>
+            </w:r>
+          </w:p>
+          <w:p>
+            <w:pPr>
+              <w:pStyle w:val="PargrafodaLista"/>
+              <w:numPr>
+                <w:ilvl w:val="0"/>
+                <w:numId w:val="11"/>
+              </w:numPr>
+              <w:cnfStyle w:val="000000100000" w:firstRow="0" w:lastRow="0" w:firstColumn="0" w:lastColumn="0" w:oddVBand="0" w:evenVBand="0" w:oddHBand="1" w:evenHBand="0" w:firstRowFirstColumn="0" w:firstRowLastColumn="0" w:lastRowFirstColumn="0" w:lastRowLastColumn="0"/>
+              <w:rPr>
+                <w:rFonts w:ascii="Arial" w:hAnsi="Arial"/>
+              </w:rPr>
+            </w:pPr>
+            <w:r>
+              <w:t>Filtrar a data</w:t>
+            </w:r>
+          </w:p>
+          <w:p>
+            <w:pPr>
+              <w:pStyle w:val="PargrafodaLista"/>
+              <w:numPr>
+                <w:ilvl w:val="0"/>
+                <w:numId w:val="11"/>
+              </w:numPr>
+              <w:cnfStyle w:val="000000100000" w:firstRow="0" w:lastRow="0" w:firstColumn="0" w:lastColumn="0" w:oddVBand="0" w:evenVBand="0" w:oddHBand="1" w:evenHBand="0" w:firstRowFirstColumn="0" w:firstRowLastColumn="0" w:lastRowFirstColumn="0" w:lastRowLastColumn="0"/>
+              <w:rPr>
+                <w:rFonts w:ascii="Arial" w:hAnsi="Arial"/>
+              </w:rPr>
+            </w:pPr>
+            <w:r>
+              <w:t>Apresentar o relatório de consumo</w:t>
+            </w:r>
+          </w:p>
+          <w:p>
+            <w:pPr>
+              <w:cnfStyle w:val="000000100000" w:firstRow="0" w:lastRow="0" w:firstColumn="0" w:lastColumn="0" w:oddVBand="0" w:evenVBand="0" w:oddHBand="1" w:evenHBand="0" w:firstRowFirstColumn="0" w:firstRowLastColumn="0" w:lastRowFirstColumn="0" w:lastRowLastColumn="0"/>
+              <w:rPr>
+                <w:rFonts w:ascii="Arial" w:hAnsi="Arial"/>
+              </w:rPr>
+            </w:pPr>
+          </w:p>
+        </w:tc>
+      </w:tr>
+    </w:tbl>
+    <w:p>
+      <w:pPr>
+        <w:tabs>
+          <w:tab w:val="left" w:pos="930"/>
+        </w:tabs>
+        <w:jc w:val="center"/>
+        <w:rPr>
+          <w:b/>
+          <w:sz w:val="28"/>
+          <w:szCs w:val="28"/>
+        </w:rPr>
+      </w:pPr>
+    </w:p>
+    <w:p>
+      <w:pPr>
+        <w:rPr>
+          <w:b/>
+          <w:sz w:val="28"/>
+          <w:szCs w:val="28"/>
+        </w:rPr>
+      </w:pPr>
+      <w:r>
+        <w:rPr>
+          <w:b/>
+          <w:sz w:val="28"/>
+          <w:szCs w:val="28"/>
+        </w:rPr>
+        <w:br w:type="page"/>
+      </w:r>
+    </w:p>
+    <w:p>
+      <w:pPr>
+        <w:tabs>
+          <w:tab w:val="left" w:pos="930"/>
+        </w:tabs>
+        <w:jc w:val="center"/>
+        <w:rPr>
+          <w:b/>
+          <w:sz w:val="28"/>
+          <w:szCs w:val="28"/>
+        </w:rPr>
+      </w:pPr>
+    </w:p>
+    <w:tbl>
+      <w:tblPr>
+        <w:tblStyle w:val="TabeladeGrelha4-Destaque12"/>
+        <w:tblW w:w="0" w:type="auto"/>
+        <w:tblInd w:w="0" w:type="dxa"/>
+        <w:tblLook w:val="04A0" w:firstRow="1" w:lastRow="0" w:firstColumn="1" w:lastColumn="0" w:noHBand="0" w:noVBand="1"/>
+      </w:tblPr>
+      <w:tblGrid>
+        <w:gridCol w:w="5180"/>
+        <w:gridCol w:w="3540"/>
+      </w:tblGrid>
+      <w:tr>
+        <w:trPr>
+          <w:cnfStyle w:val="100000000000" w:firstRow="1" w:lastRow="0" w:firstColumn="0" w:lastColumn="0" w:oddVBand="0" w:evenVBand="0" w:oddHBand="0" w:evenHBand="0" w:firstRowFirstColumn="0" w:firstRowLastColumn="0" w:lastRowFirstColumn="0" w:lastRowLastColumn="0"/>
+          <w:trHeight w:val="418"/>
+        </w:trPr>
+        <w:tc>
+          <w:tcPr>
+            <w:cnfStyle w:val="001000000000" w:firstRow="0" w:lastRow="0" w:firstColumn="1" w:lastColumn="0" w:oddVBand="0" w:evenVBand="0" w:oddHBand="0" w:evenHBand="0" w:firstRowFirstColumn="0" w:firstRowLastColumn="0" w:lastRowFirstColumn="0" w:lastRowLastColumn="0"/>
+            <w:tcW w:w="4508" w:type="dxa"/>
+            <w:tcBorders>
+              <w:right w:val="nil"/>
+            </w:tcBorders>
+            <w:vAlign w:val="center"/>
+            <w:hideMark/>
+          </w:tcPr>
+          <w:p>
+            <w:pPr>
+              <w:rPr>
+                <w:rFonts w:ascii="Arial" w:hAnsi="Arial"/>
+              </w:rPr>
+            </w:pPr>
+            <w:r>
+              <w:t>Nome do caso de uso</w:t>
+            </w:r>
+          </w:p>
+        </w:tc>
+        <w:tc>
+          <w:tcPr>
+            <w:tcW w:w="4508" w:type="dxa"/>
+            <w:tcBorders>
+              <w:left w:val="nil"/>
+            </w:tcBorders>
+            <w:vAlign w:val="center"/>
+            <w:hideMark/>
+          </w:tcPr>
+          <w:p>
+            <w:pPr>
+              <w:pStyle w:val="PargrafodaLista"/>
+              <w:numPr>
+                <w:ilvl w:val="0"/>
+                <w:numId w:val="4"/>
+              </w:numPr>
+              <w:jc w:val="both"/>
+              <w:cnfStyle w:val="100000000000" w:firstRow="1" w:lastRow="0" w:firstColumn="0" w:lastColumn="0" w:oddVBand="0" w:evenVBand="0" w:oddHBand="0" w:evenHBand="0" w:firstRowFirstColumn="0" w:firstRowLastColumn="0" w:lastRowFirstColumn="0" w:lastRowLastColumn="0"/>
+            </w:pPr>
+            <w:r>
+              <w:t>Extrair o relatório de</w:t>
+            </w:r>
+            <w:r>
+              <w:t xml:space="preserve"> </w:t>
+            </w:r>
+            <w:r>
+              <w:t>pagamento</w:t>
+            </w:r>
+          </w:p>
+        </w:tc>
+      </w:tr>
+      <w:tr>
+        <w:trPr>
+          <w:cnfStyle w:val="000000100000" w:firstRow="0" w:lastRow="0" w:firstColumn="0" w:lastColumn="0" w:oddVBand="0" w:evenVBand="0" w:oddHBand="1" w:evenHBand="0" w:firstRowFirstColumn="0" w:firstRowLastColumn="0" w:lastRowFirstColumn="0" w:lastRowLastColumn="0"/>
+        </w:trPr>
+        <w:tc>
+          <w:tcPr>
+            <w:cnfStyle w:val="001000000000" w:firstRow="0" w:lastRow="0" w:firstColumn="1" w:lastColumn="0" w:oddVBand="0" w:evenVBand="0" w:oddHBand="0" w:evenHBand="0" w:firstRowFirstColumn="0" w:firstRowLastColumn="0" w:lastRowFirstColumn="0" w:lastRowLastColumn="0"/>
+            <w:tcW w:w="4508" w:type="dxa"/>
+            <w:tcBorders>
+              <w:top w:val="single" w:sz="4" w:space="0" w:color="95B3D7" w:themeColor="accent1" w:themeTint="99"/>
+              <w:left w:val="single" w:sz="4" w:space="0" w:color="95B3D7" w:themeColor="accent1" w:themeTint="99"/>
+              <w:bottom w:val="single" w:sz="4" w:space="0" w:color="95B3D7" w:themeColor="accent1" w:themeTint="99"/>
+              <w:right w:val="single" w:sz="4" w:space="0" w:color="95B3D7" w:themeColor="accent1" w:themeTint="99"/>
+            </w:tcBorders>
+            <w:vAlign w:val="center"/>
+            <w:hideMark/>
+          </w:tcPr>
+          <w:p>
+            <w:pPr>
+              <w:rPr>
+                <w:rFonts w:ascii="Arial" w:hAnsi="Arial"/>
+              </w:rPr>
+            </w:pPr>
+            <w:r>
+              <w:t>Autor</w:t>
+            </w:r>
+          </w:p>
+        </w:tc>
+        <w:tc>
+          <w:tcPr>
+            <w:tcW w:w="4508" w:type="dxa"/>
+            <w:tcBorders>
+              <w:top w:val="single" w:sz="4" w:space="0" w:color="95B3D7" w:themeColor="accent1" w:themeTint="99"/>
+              <w:left w:val="single" w:sz="4" w:space="0" w:color="95B3D7" w:themeColor="accent1" w:themeTint="99"/>
+              <w:bottom w:val="single" w:sz="4" w:space="0" w:color="95B3D7" w:themeColor="accent1" w:themeTint="99"/>
+              <w:right w:val="single" w:sz="4" w:space="0" w:color="95B3D7" w:themeColor="accent1" w:themeTint="99"/>
+            </w:tcBorders>
+            <w:vAlign w:val="center"/>
+            <w:hideMark/>
+          </w:tcPr>
+          <w:p>
+            <w:pPr>
+              <w:cnfStyle w:val="000000100000" w:firstRow="0" w:lastRow="0" w:firstColumn="0" w:lastColumn="0" w:oddVBand="0" w:evenVBand="0" w:oddHBand="1" w:evenHBand="0" w:firstRowFirstColumn="0" w:firstRowLastColumn="0" w:lastRowFirstColumn="0" w:lastRowLastColumn="0"/>
+              <w:rPr>
+                <w:rFonts w:ascii="Arial" w:hAnsi="Arial"/>
+              </w:rPr>
+            </w:pPr>
+            <w:proofErr w:type="spellStart"/>
+            <w:r>
+              <w:t>diretor</w:t>
+            </w:r>
+            <w:proofErr w:type="spellEnd"/>
+          </w:p>
+        </w:tc>
+      </w:tr>
+      <w:tr>
+        <w:tc>
+          <w:tcPr>
+            <w:cnfStyle w:val="001000000000" w:firstRow="0" w:lastRow="0" w:firstColumn="1" w:lastColumn="0" w:oddVBand="0" w:evenVBand="0" w:oddHBand="0" w:evenHBand="0" w:firstRowFirstColumn="0" w:firstRowLastColumn="0" w:lastRowFirstColumn="0" w:lastRowLastColumn="0"/>
+            <w:tcW w:w="4508" w:type="dxa"/>
+            <w:tcBorders>
+              <w:top w:val="single" w:sz="4" w:space="0" w:color="95B3D7" w:themeColor="accent1" w:themeTint="99"/>
+              <w:left w:val="single" w:sz="4" w:space="0" w:color="95B3D7" w:themeColor="accent1" w:themeTint="99"/>
+              <w:bottom w:val="single" w:sz="4" w:space="0" w:color="95B3D7" w:themeColor="accent1" w:themeTint="99"/>
+              <w:right w:val="single" w:sz="4" w:space="0" w:color="95B3D7" w:themeColor="accent1" w:themeTint="99"/>
+            </w:tcBorders>
+            <w:vAlign w:val="center"/>
+            <w:hideMark/>
+          </w:tcPr>
+          <w:p>
+            <w:pPr>
+              <w:rPr>
+                <w:rFonts w:ascii="Arial" w:hAnsi="Arial"/>
+              </w:rPr>
+            </w:pPr>
+            <w:r>
+              <w:t>Propósito</w:t>
+            </w:r>
+          </w:p>
+        </w:tc>
+        <w:tc>
+          <w:tcPr>
+            <w:tcW w:w="4508" w:type="dxa"/>
+            <w:tcBorders>
+              <w:top w:val="single" w:sz="4" w:space="0" w:color="95B3D7" w:themeColor="accent1" w:themeTint="99"/>
+              <w:left w:val="single" w:sz="4" w:space="0" w:color="95B3D7" w:themeColor="accent1" w:themeTint="99"/>
+              <w:bottom w:val="single" w:sz="4" w:space="0" w:color="95B3D7" w:themeColor="accent1" w:themeTint="99"/>
+              <w:right w:val="single" w:sz="4" w:space="0" w:color="95B3D7" w:themeColor="accent1" w:themeTint="99"/>
+            </w:tcBorders>
+            <w:vAlign w:val="center"/>
+            <w:hideMark/>
+          </w:tcPr>
+          <w:p>
+            <w:pPr>
+              <w:cnfStyle w:val="000000000000" w:firstRow="0" w:lastRow="0" w:firstColumn="0" w:lastColumn="0" w:oddVBand="0" w:evenVBand="0" w:oddHBand="0" w:evenHBand="0" w:firstRowFirstColumn="0" w:firstRowLastColumn="0" w:lastRowFirstColumn="0" w:lastRowLastColumn="0"/>
+              <w:rPr>
+                <w:rFonts w:ascii="Arial" w:hAnsi="Arial"/>
+              </w:rPr>
+            </w:pPr>
+            <w:r>
+              <w:t>Monitorar a variação dos gastos</w:t>
+            </w:r>
+            <w:r>
+              <w:t xml:space="preserve"> </w:t>
+            </w:r>
+          </w:p>
+        </w:tc>
+      </w:tr>
+      <w:tr>
+        <w:trPr>
+          <w:cnfStyle w:val="000000100000" w:firstRow="0" w:lastRow="0" w:firstColumn="0" w:lastColumn="0" w:oddVBand="0" w:evenVBand="0" w:oddHBand="1" w:evenHBand="0" w:firstRowFirstColumn="0" w:firstRowLastColumn="0" w:lastRowFirstColumn="0" w:lastRowLastColumn="0"/>
+          <w:trHeight w:val="1593"/>
+        </w:trPr>
+        <w:tc>
+          <w:tcPr>
+            <w:cnfStyle w:val="001000000000" w:firstRow="0" w:lastRow="0" w:firstColumn="1" w:lastColumn="0" w:oddVBand="0" w:evenVBand="0" w:oddHBand="0" w:evenHBand="0" w:firstRowFirstColumn="0" w:firstRowLastColumn="0" w:lastRowFirstColumn="0" w:lastRowLastColumn="0"/>
+            <w:tcW w:w="9016" w:type="dxa"/>
+            <w:gridSpan w:val="2"/>
+            <w:tcBorders>
+              <w:top w:val="single" w:sz="4" w:space="0" w:color="95B3D7" w:themeColor="accent1" w:themeTint="99"/>
+              <w:left w:val="single" w:sz="4" w:space="0" w:color="95B3D7" w:themeColor="accent1" w:themeTint="99"/>
+              <w:bottom w:val="single" w:sz="4" w:space="0" w:color="95B3D7" w:themeColor="accent1" w:themeTint="99"/>
+              <w:right w:val="single" w:sz="4" w:space="0" w:color="95B3D7" w:themeColor="accent1" w:themeTint="99"/>
+            </w:tcBorders>
+            <w:vAlign w:val="center"/>
+            <w:hideMark/>
+          </w:tcPr>
+          <w:p>
+            <w:pPr>
+              <w:rPr>
+                <w:rFonts w:ascii="Arial" w:hAnsi="Arial"/>
+              </w:rPr>
+            </w:pPr>
+            <w:r>
+              <w:t xml:space="preserve">Resumo: </w:t>
+            </w:r>
+            <w:r>
+              <w:rPr>
+                <w:b w:val="0"/>
+                <w:bCs w:val="0"/>
+              </w:rPr>
+              <w:t xml:space="preserve">O director deverá </w:t>
+            </w:r>
+            <w:r>
+              <w:rPr>
+                <w:b w:val="0"/>
+                <w:bCs w:val="0"/>
+              </w:rPr>
+              <w:t xml:space="preserve">ter acesso ao relatório dos gastos de pagamento </w:t>
+            </w:r>
+            <w:r>
+              <w:rPr>
+                <w:b w:val="0"/>
+                <w:bCs w:val="0"/>
+              </w:rPr>
+              <w:t>de energia.</w:t>
+            </w:r>
+          </w:p>
+        </w:tc>
+      </w:tr>
+      <w:tr>
+        <w:trPr>
+          <w:trHeight w:val="566"/>
+        </w:trPr>
+        <w:tc>
+          <w:tcPr>
+            <w:cnfStyle w:val="001000000000" w:firstRow="0" w:lastRow="0" w:firstColumn="1" w:lastColumn="0" w:oddVBand="0" w:evenVBand="0" w:oddHBand="0" w:evenHBand="0" w:firstRowFirstColumn="0" w:firstRowLastColumn="0" w:lastRowFirstColumn="0" w:lastRowLastColumn="0"/>
+            <w:tcW w:w="4508" w:type="dxa"/>
+            <w:tcBorders>
+              <w:top w:val="single" w:sz="4" w:space="0" w:color="95B3D7" w:themeColor="accent1" w:themeTint="99"/>
+              <w:left w:val="single" w:sz="4" w:space="0" w:color="95B3D7" w:themeColor="accent1" w:themeTint="99"/>
+              <w:bottom w:val="single" w:sz="4" w:space="0" w:color="95B3D7" w:themeColor="accent1" w:themeTint="99"/>
+              <w:right w:val="single" w:sz="4" w:space="0" w:color="95B3D7" w:themeColor="accent1" w:themeTint="99"/>
+            </w:tcBorders>
+            <w:vAlign w:val="center"/>
+            <w:hideMark/>
+          </w:tcPr>
+          <w:p>
+            <w:pPr>
+              <w:rPr>
+                <w:rFonts w:ascii="Arial" w:hAnsi="Arial"/>
+              </w:rPr>
+            </w:pPr>
+            <w:r>
+              <w:t>Pré-condições</w:t>
+            </w:r>
+          </w:p>
+        </w:tc>
+        <w:tc>
+          <w:tcPr>
+            <w:tcW w:w="4508" w:type="dxa"/>
+            <w:tcBorders>
+              <w:top w:val="single" w:sz="4" w:space="0" w:color="95B3D7" w:themeColor="accent1" w:themeTint="99"/>
+              <w:left w:val="single" w:sz="4" w:space="0" w:color="95B3D7" w:themeColor="accent1" w:themeTint="99"/>
+              <w:bottom w:val="single" w:sz="4" w:space="0" w:color="95B3D7" w:themeColor="accent1" w:themeTint="99"/>
+              <w:right w:val="single" w:sz="4" w:space="0" w:color="95B3D7" w:themeColor="accent1" w:themeTint="99"/>
+            </w:tcBorders>
+            <w:vAlign w:val="center"/>
+            <w:hideMark/>
+          </w:tcPr>
+          <w:p>
+            <w:pPr>
+              <w:cnfStyle w:val="000000000000" w:firstRow="0" w:lastRow="0" w:firstColumn="0" w:lastColumn="0" w:oddVBand="0" w:evenVBand="0" w:oddHBand="0" w:evenHBand="0" w:firstRowFirstColumn="0" w:firstRowLastColumn="0" w:lastRowFirstColumn="0" w:lastRowLastColumn="0"/>
+              <w:rPr>
+                <w:rFonts w:ascii="Arial" w:hAnsi="Arial"/>
+              </w:rPr>
+            </w:pPr>
+            <w:r>
+              <w:t>Ser o director da empresa</w:t>
+            </w:r>
+          </w:p>
+        </w:tc>
+      </w:tr>
+      <w:tr>
+        <w:trPr>
+          <w:cnfStyle w:val="000000100000" w:firstRow="0" w:lastRow="0" w:firstColumn="0" w:lastColumn="0" w:oddVBand="0" w:evenVBand="0" w:oddHBand="1" w:evenHBand="0" w:firstRowFirstColumn="0" w:firstRowLastColumn="0" w:lastRowFirstColumn="0" w:lastRowLastColumn="0"/>
+          <w:trHeight w:val="566"/>
+        </w:trPr>
+        <w:tc>
+          <w:tcPr>
+            <w:cnfStyle w:val="001000000000" w:firstRow="0" w:lastRow="0" w:firstColumn="1" w:lastColumn="0" w:oddVBand="0" w:evenVBand="0" w:oddHBand="0" w:evenHBand="0" w:firstRowFirstColumn="0" w:firstRowLastColumn="0" w:lastRowFirstColumn="0" w:lastRowLastColumn="0"/>
+            <w:tcW w:w="9016" w:type="dxa"/>
+            <w:gridSpan w:val="2"/>
+            <w:tcBorders>
+              <w:top w:val="single" w:sz="4" w:space="0" w:color="95B3D7" w:themeColor="accent1" w:themeTint="99"/>
+              <w:left w:val="single" w:sz="4" w:space="0" w:color="95B3D7" w:themeColor="accent1" w:themeTint="99"/>
+              <w:bottom w:val="single" w:sz="4" w:space="0" w:color="95B3D7" w:themeColor="accent1" w:themeTint="99"/>
+              <w:right w:val="single" w:sz="4" w:space="0" w:color="95B3D7" w:themeColor="accent1" w:themeTint="99"/>
+            </w:tcBorders>
+            <w:vAlign w:val="center"/>
+            <w:hideMark/>
+          </w:tcPr>
+          <w:p>
+            <w:pPr>
+              <w:jc w:val="center"/>
+              <w:rPr>
+                <w:rFonts w:ascii="Arial" w:hAnsi="Arial"/>
+              </w:rPr>
+            </w:pPr>
+            <w:r>
+              <w:t>Fluxo Básico</w:t>
+            </w:r>
+          </w:p>
+        </w:tc>
+      </w:tr>
+      <w:tr>
+        <w:trPr>
+          <w:trHeight w:val="566"/>
+        </w:trPr>
+        <w:tc>
+          <w:tcPr>
+            <w:cnfStyle w:val="001000000000" w:firstRow="0" w:lastRow="0" w:firstColumn="1" w:lastColumn="0" w:oddVBand="0" w:evenVBand="0" w:oddHBand="0" w:evenHBand="0" w:firstRowFirstColumn="0" w:firstRowLastColumn="0" w:lastRowFirstColumn="0" w:lastRowLastColumn="0"/>
+            <w:tcW w:w="4508" w:type="dxa"/>
+            <w:tcBorders>
+              <w:top w:val="single" w:sz="4" w:space="0" w:color="95B3D7" w:themeColor="accent1" w:themeTint="99"/>
+              <w:left w:val="single" w:sz="4" w:space="0" w:color="95B3D7" w:themeColor="accent1" w:themeTint="99"/>
+              <w:bottom w:val="single" w:sz="4" w:space="0" w:color="95B3D7" w:themeColor="accent1" w:themeTint="99"/>
+              <w:right w:val="single" w:sz="4" w:space="0" w:color="95B3D7" w:themeColor="accent1" w:themeTint="99"/>
+            </w:tcBorders>
+            <w:vAlign w:val="center"/>
+            <w:hideMark/>
+          </w:tcPr>
+          <w:p>
+            <w:pPr>
+              <w:rPr>
+                <w:rFonts w:ascii="Arial" w:hAnsi="Arial"/>
+              </w:rPr>
+            </w:pPr>
+            <w:r>
+              <w:t>Acção do actor</w:t>
+            </w:r>
+          </w:p>
+        </w:tc>
+        <w:tc>
+          <w:tcPr>
+            <w:tcW w:w="4508" w:type="dxa"/>
+            <w:tcBorders>
+              <w:top w:val="single" w:sz="4" w:space="0" w:color="95B3D7" w:themeColor="accent1" w:themeTint="99"/>
+              <w:left w:val="single" w:sz="4" w:space="0" w:color="95B3D7" w:themeColor="accent1" w:themeTint="99"/>
+              <w:bottom w:val="single" w:sz="4" w:space="0" w:color="95B3D7" w:themeColor="accent1" w:themeTint="99"/>
+              <w:right w:val="single" w:sz="4" w:space="0" w:color="95B3D7" w:themeColor="accent1" w:themeTint="99"/>
+            </w:tcBorders>
+            <w:vAlign w:val="center"/>
+            <w:hideMark/>
+          </w:tcPr>
+          <w:p>
+            <w:pPr>
+              <w:cnfStyle w:val="000000000000" w:firstRow="0" w:lastRow="0" w:firstColumn="0" w:lastColumn="0" w:oddVBand="0" w:evenVBand="0" w:oddHBand="0" w:evenHBand="0" w:firstRowFirstColumn="0" w:firstRowLastColumn="0" w:lastRowFirstColumn="0" w:lastRowLastColumn="0"/>
+              <w:rPr>
+                <w:rFonts w:ascii="Arial" w:hAnsi="Arial"/>
+                <w:b/>
+                <w:bCs/>
+              </w:rPr>
+            </w:pPr>
+            <w:r>
+              <w:rPr>
+                <w:b/>
+                <w:bCs/>
+              </w:rPr>
+              <w:t>Resposta do Sistema</w:t>
+            </w:r>
+          </w:p>
+        </w:tc>
+      </w:tr>
+      <w:tr>
+        <w:trPr>
+          <w:cnfStyle w:val="000000100000" w:firstRow="0" w:lastRow="0" w:firstColumn="0" w:lastColumn="0" w:oddVBand="0" w:evenVBand="0" w:oddHBand="1" w:evenHBand="0" w:firstRowFirstColumn="0" w:firstRowLastColumn="0" w:lastRowFirstColumn="0" w:lastRowLastColumn="0"/>
+          <w:trHeight w:val="566"/>
+        </w:trPr>
+        <w:tc>
+          <w:tcPr>
+            <w:cnfStyle w:val="001000000000" w:firstRow="0" w:lastRow="0" w:firstColumn="1" w:lastColumn="0" w:oddVBand="0" w:evenVBand="0" w:oddHBand="0" w:evenHBand="0" w:firstRowFirstColumn="0" w:firstRowLastColumn="0" w:lastRowFirstColumn="0" w:lastRowLastColumn="0"/>
+            <w:tcW w:w="4508" w:type="dxa"/>
+            <w:tcBorders>
+              <w:top w:val="single" w:sz="4" w:space="0" w:color="95B3D7" w:themeColor="accent1" w:themeTint="99"/>
+              <w:left w:val="single" w:sz="4" w:space="0" w:color="95B3D7" w:themeColor="accent1" w:themeTint="99"/>
+              <w:bottom w:val="single" w:sz="4" w:space="0" w:color="95B3D7" w:themeColor="accent1" w:themeTint="99"/>
+              <w:right w:val="single" w:sz="4" w:space="0" w:color="95B3D7" w:themeColor="accent1" w:themeTint="99"/>
+            </w:tcBorders>
+            <w:vAlign w:val="center"/>
+          </w:tcPr>
+          <w:p>
+            <w:pPr>
+              <w:pStyle w:val="PargrafodaLista"/>
+              <w:numPr>
+                <w:ilvl w:val="2"/>
+                <w:numId w:val="11"/>
+              </w:numPr>
+              <w:rPr>
+                <w:rFonts w:cstheme="minorHAnsi"/>
+              </w:rPr>
+            </w:pPr>
+            <w:bookmarkStart w:id="0" w:name="_GoBack"/>
+            <w:bookmarkEnd w:id="0"/>
+            <w:r>
+              <w:rPr>
+                <w:rFonts w:cstheme="minorHAnsi"/>
+              </w:rPr>
+              <w:t xml:space="preserve">Clicar em relatório de </w:t>
+            </w:r>
+            <w:r>
+              <w:rPr>
+                <w:rFonts w:cstheme="minorHAnsi"/>
+              </w:rPr>
+              <w:t xml:space="preserve">pagamento energia </w:t>
+            </w:r>
+          </w:p>
+          <w:p>
+            <w:pPr>
+              <w:pStyle w:val="PargrafodaLista"/>
+              <w:numPr>
+                <w:ilvl w:val="2"/>
+                <w:numId w:val="11"/>
+              </w:numPr>
+              <w:rPr>
+                <w:rFonts w:cstheme="minorHAnsi"/>
+                <w:b w:val="0"/>
+                <w:bCs w:val="0"/>
+              </w:rPr>
+            </w:pPr>
+            <w:r>
+              <w:rPr>
+                <w:rFonts w:cstheme="minorHAnsi"/>
+                <w:b w:val="0"/>
+                <w:bCs w:val="0"/>
+              </w:rPr>
+              <w:t>Escolher a data</w:t>
+            </w:r>
+          </w:p>
+          <w:p>
+            <w:pPr>
+              <w:pStyle w:val="PargrafodaLista"/>
+              <w:numPr>
+                <w:ilvl w:val="2"/>
+                <w:numId w:val="11"/>
+              </w:numPr>
+              <w:rPr>
+                <w:rFonts w:cstheme="minorHAnsi"/>
+                <w:b w:val="0"/>
+                <w:bCs w:val="0"/>
+              </w:rPr>
+            </w:pPr>
+            <w:r>
+              <w:rPr>
+                <w:rFonts w:cstheme="minorHAnsi"/>
+                <w:b w:val="0"/>
+                <w:bCs w:val="0"/>
+              </w:rPr>
+              <w:t xml:space="preserve">Clicar em extrair relatório de </w:t>
+            </w:r>
+            <w:r>
+              <w:rPr>
+                <w:rFonts w:cstheme="minorHAnsi"/>
+                <w:b w:val="0"/>
+                <w:bCs w:val="0"/>
+              </w:rPr>
+              <w:t>pagamento de energia</w:t>
+            </w:r>
+          </w:p>
+        </w:tc>
+        <w:tc>
+          <w:tcPr>
+            <w:tcW w:w="4508" w:type="dxa"/>
+            <w:tcBorders>
+              <w:top w:val="single" w:sz="4" w:space="0" w:color="95B3D7" w:themeColor="accent1" w:themeTint="99"/>
+              <w:left w:val="single" w:sz="4" w:space="0" w:color="95B3D7" w:themeColor="accent1" w:themeTint="99"/>
+              <w:bottom w:val="single" w:sz="4" w:space="0" w:color="95B3D7" w:themeColor="accent1" w:themeTint="99"/>
+              <w:right w:val="single" w:sz="4" w:space="0" w:color="95B3D7" w:themeColor="accent1" w:themeTint="99"/>
+            </w:tcBorders>
+            <w:vAlign w:val="center"/>
+          </w:tcPr>
+          <w:p>
+            <w:pPr>
+              <w:pStyle w:val="PargrafodaLista"/>
+              <w:numPr>
+                <w:ilvl w:val="0"/>
+                <w:numId w:val="12"/>
+              </w:numPr>
+              <w:cnfStyle w:val="000000100000" w:firstRow="0" w:lastRow="0" w:firstColumn="0" w:lastColumn="0" w:oddVBand="0" w:evenVBand="0" w:oddHBand="1" w:evenHBand="0" w:firstRowFirstColumn="0" w:firstRowLastColumn="0" w:lastRowFirstColumn="0" w:lastRowLastColumn="0"/>
+              <w:rPr>
+                <w:rFonts w:ascii="Arial" w:hAnsi="Arial"/>
+              </w:rPr>
+            </w:pPr>
+            <w:r>
+              <w:t xml:space="preserve">Apresentar a área para extrair o </w:t>
+            </w:r>
+            <w:r>
+              <w:t>pagamento</w:t>
+            </w:r>
+            <w:r>
+              <w:t>.</w:t>
+            </w:r>
+          </w:p>
+          <w:p>
+            <w:pPr>
+              <w:pStyle w:val="PargrafodaLista"/>
+              <w:numPr>
+                <w:ilvl w:val="0"/>
+                <w:numId w:val="12"/>
+              </w:numPr>
+              <w:cnfStyle w:val="000000100000" w:firstRow="0" w:lastRow="0" w:firstColumn="0" w:lastColumn="0" w:oddVBand="0" w:evenVBand="0" w:oddHBand="1" w:evenHBand="0" w:firstRowFirstColumn="0" w:firstRowLastColumn="0" w:lastRowFirstColumn="0" w:lastRowLastColumn="0"/>
+              <w:rPr>
+                <w:rFonts w:ascii="Arial" w:hAnsi="Arial"/>
+              </w:rPr>
+            </w:pPr>
+            <w:r>
+              <w:t>Filtrar a data</w:t>
+            </w:r>
+          </w:p>
+          <w:p>
+            <w:pPr>
+              <w:pStyle w:val="PargrafodaLista"/>
+              <w:numPr>
+                <w:ilvl w:val="0"/>
+                <w:numId w:val="12"/>
+              </w:numPr>
+              <w:cnfStyle w:val="000000100000" w:firstRow="0" w:lastRow="0" w:firstColumn="0" w:lastColumn="0" w:oddVBand="0" w:evenVBand="0" w:oddHBand="1" w:evenHBand="0" w:firstRowFirstColumn="0" w:firstRowLastColumn="0" w:lastRowFirstColumn="0" w:lastRowLastColumn="0"/>
+              <w:rPr>
+                <w:rFonts w:ascii="Arial" w:hAnsi="Arial"/>
+              </w:rPr>
+            </w:pPr>
+            <w:r>
+              <w:t xml:space="preserve">Apresentar o relatório de </w:t>
+            </w:r>
+            <w:r>
+              <w:t>pagamento de energia</w:t>
+            </w:r>
+          </w:p>
+          <w:p>
+            <w:pPr>
+              <w:cnfStyle w:val="000000100000" w:firstRow="0" w:lastRow="0" w:firstColumn="0" w:lastColumn="0" w:oddVBand="0" w:evenVBand="0" w:oddHBand="1" w:evenHBand="0" w:firstRowFirstColumn="0" w:firstRowLastColumn="0" w:lastRowFirstColumn="0" w:lastRowLastColumn="0"/>
+              <w:rPr>
+                <w:rFonts w:ascii="Arial" w:hAnsi="Arial"/>
+              </w:rPr>
+            </w:pPr>
+          </w:p>
+        </w:tc>
+      </w:tr>
+    </w:tbl>
+    <w:p>
+      <w:pPr>
+        <w:tabs>
+          <w:tab w:val="left" w:pos="930"/>
+        </w:tabs>
+        <w:jc w:val="center"/>
+        <w:rPr>
+          <w:b/>
+          <w:sz w:val="28"/>
+          <w:szCs w:val="28"/>
+        </w:rPr>
+      </w:pPr>
     </w:p>
     <w:sectPr>
       <w:pgSz w:w="11906" w:h="16838"/>
@@ -802,6 +4248,192 @@
 <file path=word/numbering.xml><?xml version="1.0" encoding="utf-8"?>
 <w:numbering xmlns:wpc="http://schemas.microsoft.com/office/word/2010/wordprocessingCanvas" xmlns:mc="http://schemas.openxmlformats.org/markup-compatibility/2006" xmlns:o="urn:schemas-microsoft-com:office:office" xmlns:r="http://schemas.openxmlformats.org/officeDocument/2006/relationships" xmlns:m="http://schemas.openxmlformats.org/officeDocument/2006/math" xmlns:v="urn:schemas-microsoft-com:vml" xmlns:wp14="http://schemas.microsoft.com/office/word/2010/wordprocessingDrawing" xmlns:wp="http://schemas.openxmlformats.org/drawingml/2006/wordprocessingDrawing" xmlns:w10="urn:schemas-microsoft-com:office:word" xmlns:w="http://schemas.openxmlformats.org/wordprocessingml/2006/main" xmlns:w14="http://schemas.microsoft.com/office/word/2010/wordml" xmlns:wpg="http://schemas.microsoft.com/office/word/2010/wordprocessingGroup" xmlns:wpi="http://schemas.microsoft.com/office/word/2010/wordprocessingInk" xmlns:wne="http://schemas.microsoft.com/office/word/2006/wordml" xmlns:wps="http://schemas.microsoft.com/office/word/2010/wordprocessingShape" mc:Ignorable="w14 wp14">
   <w:abstractNum w:abstractNumId="0">
+    <w:nsid w:val="011403AD"/>
+    <w:multiLevelType w:val="multilevel"/>
+    <w:tmpl w:val="FF3AE1A2"/>
+    <w:lvl w:ilvl="0">
+      <w:start w:val="1"/>
+      <w:numFmt w:val="bullet"/>
+      <w:lvlText w:val=""/>
+      <w:lvlJc w:val="left"/>
+      <w:pPr>
+        <w:ind w:left="720" w:hanging="360"/>
+      </w:pPr>
+      <w:rPr>
+        <w:rFonts w:ascii="Symbol" w:hAnsi="Symbol" w:hint="default"/>
+      </w:rPr>
+    </w:lvl>
+    <w:lvl w:ilvl="1">
+      <w:start w:val="1"/>
+      <w:numFmt w:val="decimal"/>
+      <w:isLgl/>
+      <w:lvlText w:val="%1.%2"/>
+      <w:lvlJc w:val="left"/>
+      <w:pPr>
+        <w:ind w:left="720" w:hanging="360"/>
+      </w:pPr>
+    </w:lvl>
+    <w:lvl w:ilvl="2">
+      <w:start w:val="1"/>
+      <w:numFmt w:val="decimal"/>
+      <w:isLgl/>
+      <w:lvlText w:val="%1.%2.%3"/>
+      <w:lvlJc w:val="left"/>
+      <w:pPr>
+        <w:ind w:left="1080" w:hanging="720"/>
+      </w:pPr>
+    </w:lvl>
+    <w:lvl w:ilvl="3">
+      <w:start w:val="1"/>
+      <w:numFmt w:val="decimal"/>
+      <w:isLgl/>
+      <w:lvlText w:val="%1.%2.%3.%4"/>
+      <w:lvlJc w:val="left"/>
+      <w:pPr>
+        <w:ind w:left="1080" w:hanging="720"/>
+      </w:pPr>
+    </w:lvl>
+    <w:lvl w:ilvl="4">
+      <w:start w:val="1"/>
+      <w:numFmt w:val="decimal"/>
+      <w:isLgl/>
+      <w:lvlText w:val="%1.%2.%3.%4.%5"/>
+      <w:lvlJc w:val="left"/>
+      <w:pPr>
+        <w:ind w:left="1440" w:hanging="1080"/>
+      </w:pPr>
+    </w:lvl>
+    <w:lvl w:ilvl="5">
+      <w:start w:val="1"/>
+      <w:numFmt w:val="decimal"/>
+      <w:isLgl/>
+      <w:lvlText w:val="%1.%2.%3.%4.%5.%6"/>
+      <w:lvlJc w:val="left"/>
+      <w:pPr>
+        <w:ind w:left="1800" w:hanging="1440"/>
+      </w:pPr>
+    </w:lvl>
+    <w:lvl w:ilvl="6">
+      <w:start w:val="1"/>
+      <w:numFmt w:val="decimal"/>
+      <w:isLgl/>
+      <w:lvlText w:val="%1.%2.%3.%4.%5.%6.%7"/>
+      <w:lvlJc w:val="left"/>
+      <w:pPr>
+        <w:ind w:left="1800" w:hanging="1440"/>
+      </w:pPr>
+    </w:lvl>
+    <w:lvl w:ilvl="7">
+      <w:start w:val="1"/>
+      <w:numFmt w:val="decimal"/>
+      <w:isLgl/>
+      <w:lvlText w:val="%1.%2.%3.%4.%5.%6.%7.%8"/>
+      <w:lvlJc w:val="left"/>
+      <w:pPr>
+        <w:ind w:left="2160" w:hanging="1800"/>
+      </w:pPr>
+    </w:lvl>
+    <w:lvl w:ilvl="8">
+      <w:start w:val="1"/>
+      <w:numFmt w:val="decimal"/>
+      <w:isLgl/>
+      <w:lvlText w:val="%1.%2.%3.%4.%5.%6.%7.%8.%9"/>
+      <w:lvlJc w:val="left"/>
+      <w:pPr>
+        <w:ind w:left="2160" w:hanging="1800"/>
+      </w:pPr>
+    </w:lvl>
+  </w:abstractNum>
+  <w:abstractNum w:abstractNumId="1">
+    <w:nsid w:val="1AA97D9F"/>
+    <w:multiLevelType w:val="hybridMultilevel"/>
+    <w:tmpl w:val="ECE0F436"/>
+    <w:lvl w:ilvl="0" w:tplc="C1E6096C">
+      <w:start w:val="1"/>
+      <w:numFmt w:val="decimal"/>
+      <w:lvlText w:val="%1"/>
+      <w:lvlJc w:val="left"/>
+      <w:pPr>
+        <w:ind w:left="720" w:hanging="360"/>
+      </w:pPr>
+      <w:rPr>
+        <w:rFonts w:asciiTheme="minorHAnsi" w:hAnsiTheme="minorHAnsi" w:cstheme="minorHAnsi" w:hint="default"/>
+      </w:rPr>
+    </w:lvl>
+    <w:lvl w:ilvl="1" w:tplc="04160019" w:tentative="1">
+      <w:start w:val="1"/>
+      <w:numFmt w:val="lowerLetter"/>
+      <w:lvlText w:val="%2."/>
+      <w:lvlJc w:val="left"/>
+      <w:pPr>
+        <w:ind w:left="1440" w:hanging="360"/>
+      </w:pPr>
+    </w:lvl>
+    <w:lvl w:ilvl="2" w:tplc="0416001B">
+      <w:start w:val="1"/>
+      <w:numFmt w:val="lowerRoman"/>
+      <w:lvlText w:val="%3."/>
+      <w:lvlJc w:val="right"/>
+      <w:pPr>
+        <w:ind w:left="2160" w:hanging="180"/>
+      </w:pPr>
+    </w:lvl>
+    <w:lvl w:ilvl="3" w:tplc="0416000F" w:tentative="1">
+      <w:start w:val="1"/>
+      <w:numFmt w:val="decimal"/>
+      <w:lvlText w:val="%4."/>
+      <w:lvlJc w:val="left"/>
+      <w:pPr>
+        <w:ind w:left="2880" w:hanging="360"/>
+      </w:pPr>
+    </w:lvl>
+    <w:lvl w:ilvl="4" w:tplc="04160019" w:tentative="1">
+      <w:start w:val="1"/>
+      <w:numFmt w:val="lowerLetter"/>
+      <w:lvlText w:val="%5."/>
+      <w:lvlJc w:val="left"/>
+      <w:pPr>
+        <w:ind w:left="3600" w:hanging="360"/>
+      </w:pPr>
+    </w:lvl>
+    <w:lvl w:ilvl="5" w:tplc="0416001B" w:tentative="1">
+      <w:start w:val="1"/>
+      <w:numFmt w:val="lowerRoman"/>
+      <w:lvlText w:val="%6."/>
+      <w:lvlJc w:val="right"/>
+      <w:pPr>
+        <w:ind w:left="4320" w:hanging="180"/>
+      </w:pPr>
+    </w:lvl>
+    <w:lvl w:ilvl="6" w:tplc="0416000F" w:tentative="1">
+      <w:start w:val="1"/>
+      <w:numFmt w:val="decimal"/>
+      <w:lvlText w:val="%7."/>
+      <w:lvlJc w:val="left"/>
+      <w:pPr>
+        <w:ind w:left="5040" w:hanging="360"/>
+      </w:pPr>
+    </w:lvl>
+    <w:lvl w:ilvl="7" w:tplc="04160019" w:tentative="1">
+      <w:start w:val="1"/>
+      <w:numFmt w:val="lowerLetter"/>
+      <w:lvlText w:val="%8."/>
+      <w:lvlJc w:val="left"/>
+      <w:pPr>
+        <w:ind w:left="5760" w:hanging="360"/>
+      </w:pPr>
+    </w:lvl>
+    <w:lvl w:ilvl="8" w:tplc="0416001B" w:tentative="1">
+      <w:start w:val="1"/>
+      <w:numFmt w:val="lowerRoman"/>
+      <w:lvlText w:val="%9."/>
+      <w:lvlJc w:val="right"/>
+      <w:pPr>
+        <w:ind w:left="6480" w:hanging="180"/>
+      </w:pPr>
+    </w:lvl>
+  </w:abstractNum>
+  <w:abstractNum w:abstractNumId="2">
     <w:nsid w:val="34240D1B"/>
     <w:multiLevelType w:val="hybridMultilevel"/>
     <w:tmpl w:val="FC6205F0"/>
@@ -887,7 +4519,96 @@
       </w:pPr>
     </w:lvl>
   </w:abstractNum>
-  <w:abstractNum w:abstractNumId="1">
+  <w:abstractNum w:abstractNumId="3">
+    <w:nsid w:val="4A321D4A"/>
+    <w:multiLevelType w:val="hybridMultilevel"/>
+    <w:tmpl w:val="8A1CD872"/>
+    <w:lvl w:ilvl="0" w:tplc="0C000001">
+      <w:start w:val="1"/>
+      <w:numFmt w:val="bullet"/>
+      <w:lvlText w:val=""/>
+      <w:lvlJc w:val="left"/>
+      <w:pPr>
+        <w:ind w:left="360" w:hanging="360"/>
+      </w:pPr>
+      <w:rPr>
+        <w:rFonts w:ascii="Symbol" w:hAnsi="Symbol" w:hint="default"/>
+      </w:rPr>
+    </w:lvl>
+    <w:lvl w:ilvl="1" w:tplc="FFFFFFFF">
+      <w:start w:val="1"/>
+      <w:numFmt w:val="lowerLetter"/>
+      <w:lvlText w:val="%2."/>
+      <w:lvlJc w:val="left"/>
+      <w:pPr>
+        <w:ind w:left="1080" w:hanging="360"/>
+      </w:pPr>
+    </w:lvl>
+    <w:lvl w:ilvl="2" w:tplc="FFFFFFFF">
+      <w:start w:val="1"/>
+      <w:numFmt w:val="decimal"/>
+      <w:lvlText w:val="%3."/>
+      <w:lvlJc w:val="left"/>
+      <w:pPr>
+        <w:ind w:left="1980" w:hanging="360"/>
+      </w:pPr>
+    </w:lvl>
+    <w:lvl w:ilvl="3" w:tplc="FFFFFFFF">
+      <w:start w:val="2"/>
+      <w:numFmt w:val="decimal"/>
+      <w:lvlText w:val="%4"/>
+      <w:lvlJc w:val="left"/>
+      <w:pPr>
+        <w:ind w:left="2520" w:hanging="360"/>
+      </w:pPr>
+    </w:lvl>
+    <w:lvl w:ilvl="4" w:tplc="FFFFFFFF">
+      <w:start w:val="1"/>
+      <w:numFmt w:val="lowerLetter"/>
+      <w:lvlText w:val="%5."/>
+      <w:lvlJc w:val="left"/>
+      <w:pPr>
+        <w:ind w:left="3240" w:hanging="360"/>
+      </w:pPr>
+    </w:lvl>
+    <w:lvl w:ilvl="5" w:tplc="FFFFFFFF">
+      <w:start w:val="1"/>
+      <w:numFmt w:val="lowerRoman"/>
+      <w:lvlText w:val="%6."/>
+      <w:lvlJc w:val="right"/>
+      <w:pPr>
+        <w:ind w:left="3960" w:hanging="180"/>
+      </w:pPr>
+    </w:lvl>
+    <w:lvl w:ilvl="6" w:tplc="FFFFFFFF">
+      <w:start w:val="1"/>
+      <w:numFmt w:val="decimal"/>
+      <w:lvlText w:val="%7."/>
+      <w:lvlJc w:val="left"/>
+      <w:pPr>
+        <w:ind w:left="4680" w:hanging="360"/>
+      </w:pPr>
+    </w:lvl>
+    <w:lvl w:ilvl="7" w:tplc="FFFFFFFF">
+      <w:start w:val="1"/>
+      <w:numFmt w:val="lowerLetter"/>
+      <w:lvlText w:val="%8."/>
+      <w:lvlJc w:val="left"/>
+      <w:pPr>
+        <w:ind w:left="5400" w:hanging="360"/>
+      </w:pPr>
+    </w:lvl>
+    <w:lvl w:ilvl="8" w:tplc="FFFFFFFF">
+      <w:start w:val="1"/>
+      <w:numFmt w:val="lowerRoman"/>
+      <w:lvlText w:val="%9."/>
+      <w:lvlJc w:val="right"/>
+      <w:pPr>
+        <w:ind w:left="6120" w:hanging="180"/>
+      </w:pPr>
+    </w:lvl>
+  </w:abstractNum>
+  <w:abstractNum w:abstractNumId="4">
     <w:nsid w:val="53413D22"/>
     <w:multiLevelType w:val="hybridMultilevel"/>
     <w:tmpl w:val="668EB040"/>
@@ -976,7 +4697,458 @@
       </w:pPr>
     </w:lvl>
   </w:abstractNum>
-  <w:abstractNum w:abstractNumId="2">
+  <w:abstractNum w:abstractNumId="5">
+    <w:nsid w:val="5641400E"/>
+    <w:multiLevelType w:val="hybridMultilevel"/>
+    <w:tmpl w:val="1DE06EDA"/>
+    <w:lvl w:ilvl="0" w:tplc="0816000F">
+      <w:start w:val="1"/>
+      <w:numFmt w:val="decimal"/>
+      <w:lvlText w:val="%1."/>
+      <w:lvlJc w:val="left"/>
+      <w:pPr>
+        <w:ind w:left="720" w:hanging="360"/>
+      </w:pPr>
+    </w:lvl>
+    <w:lvl w:ilvl="1" w:tplc="08160019">
+      <w:start w:val="1"/>
+      <w:numFmt w:val="lowerLetter"/>
+      <w:lvlText w:val="%2."/>
+      <w:lvlJc w:val="left"/>
+      <w:pPr>
+        <w:ind w:left="1440" w:hanging="360"/>
+      </w:pPr>
+    </w:lvl>
+    <w:lvl w:ilvl="2" w:tplc="0816001B">
+      <w:start w:val="1"/>
+      <w:numFmt w:val="lowerRoman"/>
+      <w:lvlText w:val="%3."/>
+      <w:lvlJc w:val="right"/>
+      <w:pPr>
+        <w:ind w:left="2160" w:hanging="180"/>
+      </w:pPr>
+    </w:lvl>
+    <w:lvl w:ilvl="3" w:tplc="0816000F">
+      <w:start w:val="1"/>
+      <w:numFmt w:val="decimal"/>
+      <w:lvlText w:val="%4."/>
+      <w:lvlJc w:val="left"/>
+      <w:pPr>
+        <w:ind w:left="2880" w:hanging="360"/>
+      </w:pPr>
+    </w:lvl>
+    <w:lvl w:ilvl="4" w:tplc="08160019">
+      <w:start w:val="1"/>
+      <w:numFmt w:val="lowerLetter"/>
+      <w:lvlText w:val="%5."/>
+      <w:lvlJc w:val="left"/>
+      <w:pPr>
+        <w:ind w:left="3600" w:hanging="360"/>
+      </w:pPr>
+    </w:lvl>
+    <w:lvl w:ilvl="5" w:tplc="0816001B">
+      <w:start w:val="1"/>
+      <w:numFmt w:val="lowerRoman"/>
+      <w:lvlText w:val="%6."/>
+      <w:lvlJc w:val="right"/>
+      <w:pPr>
+        <w:ind w:left="4320" w:hanging="180"/>
+      </w:pPr>
+    </w:lvl>
+    <w:lvl w:ilvl="6" w:tplc="0816000F">
+      <w:start w:val="1"/>
+      <w:numFmt w:val="decimal"/>
+      <w:lvlText w:val="%7."/>
+      <w:lvlJc w:val="left"/>
+      <w:pPr>
+        <w:ind w:left="5040" w:hanging="360"/>
+      </w:pPr>
+    </w:lvl>
+    <w:lvl w:ilvl="7" w:tplc="08160019">
+      <w:start w:val="1"/>
+      <w:numFmt w:val="lowerLetter"/>
+      <w:lvlText w:val="%8."/>
+      <w:lvlJc w:val="left"/>
+      <w:pPr>
+        <w:ind w:left="5760" w:hanging="360"/>
+      </w:pPr>
+    </w:lvl>
+    <w:lvl w:ilvl="8" w:tplc="0816001B">
+      <w:start w:val="1"/>
+      <w:numFmt w:val="lowerRoman"/>
+      <w:lvlText w:val="%9."/>
+      <w:lvlJc w:val="right"/>
+      <w:pPr>
+        <w:ind w:left="6480" w:hanging="180"/>
+      </w:pPr>
+    </w:lvl>
+  </w:abstractNum>
+  <w:abstractNum w:abstractNumId="6">
+    <w:nsid w:val="69F53725"/>
+    <w:multiLevelType w:val="hybridMultilevel"/>
+    <w:tmpl w:val="4606C8EE"/>
+    <w:lvl w:ilvl="0" w:tplc="7FECE73A">
+      <w:start w:val="1"/>
+      <w:numFmt w:val="decimal"/>
+      <w:lvlText w:val="%1"/>
+      <w:lvlJc w:val="left"/>
+      <w:pPr>
+        <w:ind w:left="720" w:hanging="360"/>
+      </w:pPr>
+      <w:rPr>
+        <w:rFonts w:asciiTheme="minorHAnsi" w:hAnsiTheme="minorHAnsi" w:hint="default"/>
+      </w:rPr>
+    </w:lvl>
+    <w:lvl w:ilvl="1" w:tplc="04160019" w:tentative="1">
+      <w:start w:val="1"/>
+      <w:numFmt w:val="lowerLetter"/>
+      <w:lvlText w:val="%2."/>
+      <w:lvlJc w:val="left"/>
+      <w:pPr>
+        <w:ind w:left="1440" w:hanging="360"/>
+      </w:pPr>
+    </w:lvl>
+    <w:lvl w:ilvl="2" w:tplc="0416001B">
+      <w:start w:val="1"/>
+      <w:numFmt w:val="lowerRoman"/>
+      <w:lvlText w:val="%3."/>
+      <w:lvlJc w:val="right"/>
+      <w:pPr>
+        <w:ind w:left="2160" w:hanging="180"/>
+      </w:pPr>
+    </w:lvl>
+    <w:lvl w:ilvl="3" w:tplc="0416000F" w:tentative="1">
+      <w:start w:val="1"/>
+      <w:numFmt w:val="decimal"/>
+      <w:lvlText w:val="%4."/>
+      <w:lvlJc w:val="left"/>
+      <w:pPr>
+        <w:ind w:left="2880" w:hanging="360"/>
+      </w:pPr>
+    </w:lvl>
+    <w:lvl w:ilvl="4" w:tplc="04160019" w:tentative="1">
+      <w:start w:val="1"/>
+      <w:numFmt w:val="lowerLetter"/>
+      <w:lvlText w:val="%5."/>
+      <w:lvlJc w:val="left"/>
+      <w:pPr>
+        <w:ind w:left="3600" w:hanging="360"/>
+      </w:pPr>
+    </w:lvl>
+    <w:lvl w:ilvl="5" w:tplc="0416001B" w:tentative="1">
+      <w:start w:val="1"/>
+      <w:numFmt w:val="lowerRoman"/>
+      <w:lvlText w:val="%6."/>
+      <w:lvlJc w:val="right"/>
+      <w:pPr>
+        <w:ind w:left="4320" w:hanging="180"/>
+      </w:pPr>
+    </w:lvl>
+    <w:lvl w:ilvl="6" w:tplc="0416000F" w:tentative="1">
+      <w:start w:val="1"/>
+      <w:numFmt w:val="decimal"/>
+      <w:lvlText w:val="%7."/>
+      <w:lvlJc w:val="left"/>
+      <w:pPr>
+        <w:ind w:left="5040" w:hanging="360"/>
+      </w:pPr>
+    </w:lvl>
+    <w:lvl w:ilvl="7" w:tplc="04160019" w:tentative="1">
+      <w:start w:val="1"/>
+      <w:numFmt w:val="lowerLetter"/>
+      <w:lvlText w:val="%8."/>
+      <w:lvlJc w:val="left"/>
+      <w:pPr>
+        <w:ind w:left="5760" w:hanging="360"/>
+      </w:pPr>
+    </w:lvl>
+    <w:lvl w:ilvl="8" w:tplc="0416001B" w:tentative="1">
+      <w:start w:val="1"/>
+      <w:numFmt w:val="lowerRoman"/>
+      <w:lvlText w:val="%9."/>
+      <w:lvlJc w:val="right"/>
+      <w:pPr>
+        <w:ind w:left="6480" w:hanging="180"/>
+      </w:pPr>
+    </w:lvl>
+  </w:abstractNum>
+  <w:abstractNum w:abstractNumId="7">
+    <w:nsid w:val="6D022A5F"/>
+    <w:multiLevelType w:val="hybridMultilevel"/>
+    <w:tmpl w:val="16E491A4"/>
+    <w:lvl w:ilvl="0" w:tplc="5254F390">
+      <w:start w:val="1"/>
+      <w:numFmt w:val="decimal"/>
+      <w:lvlText w:val="%1"/>
+      <w:lvlJc w:val="left"/>
+      <w:pPr>
+        <w:ind w:left="720" w:hanging="360"/>
+      </w:pPr>
+      <w:rPr>
+        <w:rFonts w:asciiTheme="minorHAnsi" w:hAnsiTheme="minorHAnsi" w:hint="default"/>
+      </w:rPr>
+    </w:lvl>
+    <w:lvl w:ilvl="1" w:tplc="04160019" w:tentative="1">
+      <w:start w:val="1"/>
+      <w:numFmt w:val="lowerLetter"/>
+      <w:lvlText w:val="%2."/>
+      <w:lvlJc w:val="left"/>
+      <w:pPr>
+        <w:ind w:left="1440" w:hanging="360"/>
+      </w:pPr>
+    </w:lvl>
+    <w:lvl w:ilvl="2" w:tplc="B0100972">
+      <w:start w:val="1"/>
+      <w:numFmt w:val="decimal"/>
+      <w:lvlText w:val="%3"/>
+      <w:lvlJc w:val="right"/>
+      <w:pPr>
+        <w:ind w:left="2160" w:hanging="180"/>
+      </w:pPr>
+      <w:rPr>
+        <w:rFonts w:asciiTheme="minorHAnsi" w:eastAsiaTheme="minorHAnsi" w:hAnsiTheme="minorHAnsi" w:cstheme="minorHAnsi"/>
+      </w:rPr>
+    </w:lvl>
+    <w:lvl w:ilvl="3" w:tplc="0416000F" w:tentative="1">
+      <w:start w:val="1"/>
+      <w:numFmt w:val="decimal"/>
+      <w:lvlText w:val="%4."/>
+      <w:lvlJc w:val="left"/>
+      <w:pPr>
+        <w:ind w:left="2880" w:hanging="360"/>
+      </w:pPr>
+    </w:lvl>
+    <w:lvl w:ilvl="4" w:tplc="04160019" w:tentative="1">
+      <w:start w:val="1"/>
+      <w:numFmt w:val="lowerLetter"/>
+      <w:lvlText w:val="%5."/>
+      <w:lvlJc w:val="left"/>
+      <w:pPr>
+        <w:ind w:left="3600" w:hanging="360"/>
+      </w:pPr>
+    </w:lvl>
+    <w:lvl w:ilvl="5" w:tplc="0416001B" w:tentative="1">
+      <w:start w:val="1"/>
+      <w:numFmt w:val="lowerRoman"/>
+      <w:lvlText w:val="%6."/>
+      <w:lvlJc w:val="right"/>
+      <w:pPr>
+        <w:ind w:left="4320" w:hanging="180"/>
+      </w:pPr>
+    </w:lvl>
+    <w:lvl w:ilvl="6" w:tplc="0416000F" w:tentative="1">
+      <w:start w:val="1"/>
+      <w:numFmt w:val="decimal"/>
+      <w:lvlText w:val="%7."/>
+      <w:lvlJc w:val="left"/>
+      <w:pPr>
+        <w:ind w:left="5040" w:hanging="360"/>
+      </w:pPr>
+    </w:lvl>
+    <w:lvl w:ilvl="7" w:tplc="04160019" w:tentative="1">
+      <w:start w:val="1"/>
+      <w:numFmt w:val="lowerLetter"/>
+      <w:lvlText w:val="%8."/>
+      <w:lvlJc w:val="left"/>
+      <w:pPr>
+        <w:ind w:left="5760" w:hanging="360"/>
+      </w:pPr>
+    </w:lvl>
+    <w:lvl w:ilvl="8" w:tplc="0416001B" w:tentative="1">
+      <w:start w:val="1"/>
+      <w:numFmt w:val="lowerRoman"/>
+      <w:lvlText w:val="%9."/>
+      <w:lvlJc w:val="right"/>
+      <w:pPr>
+        <w:ind w:left="6480" w:hanging="180"/>
+      </w:pPr>
+    </w:lvl>
+  </w:abstractNum>
+  <w:abstractNum w:abstractNumId="8">
+    <w:nsid w:val="71291145"/>
+    <w:multiLevelType w:val="hybridMultilevel"/>
+    <w:tmpl w:val="5BE86E7E"/>
+    <w:lvl w:ilvl="0" w:tplc="89DAFE0A">
+      <w:start w:val="1"/>
+      <w:numFmt w:val="decimal"/>
+      <w:lvlText w:val="%1"/>
+      <w:lvlJc w:val="left"/>
+      <w:pPr>
+        <w:ind w:left="720" w:hanging="360"/>
+      </w:pPr>
+      <w:rPr>
+        <w:rFonts w:asciiTheme="minorHAnsi" w:hAnsiTheme="minorHAnsi" w:hint="default"/>
+      </w:rPr>
+    </w:lvl>
+    <w:lvl w:ilvl="1" w:tplc="04160019" w:tentative="1">
+      <w:start w:val="1"/>
+      <w:numFmt w:val="lowerLetter"/>
+      <w:lvlText w:val="%2."/>
+      <w:lvlJc w:val="left"/>
+      <w:pPr>
+        <w:ind w:left="1440" w:hanging="360"/>
+      </w:pPr>
+    </w:lvl>
+    <w:lvl w:ilvl="2" w:tplc="4D88E4D8">
+      <w:start w:val="1"/>
+      <w:numFmt w:val="decimal"/>
+      <w:lvlText w:val="%3"/>
+      <w:lvlJc w:val="right"/>
+      <w:pPr>
+        <w:ind w:left="2160" w:hanging="180"/>
+      </w:pPr>
+      <w:rPr>
+        <w:rFonts w:asciiTheme="minorHAnsi" w:eastAsiaTheme="minorHAnsi" w:hAnsiTheme="minorHAnsi" w:cstheme="minorHAnsi"/>
+      </w:rPr>
+    </w:lvl>
+    <w:lvl w:ilvl="3" w:tplc="0416000F" w:tentative="1">
+      <w:start w:val="1"/>
+      <w:numFmt w:val="decimal"/>
+      <w:lvlText w:val="%4."/>
+      <w:lvlJc w:val="left"/>
+      <w:pPr>
+        <w:ind w:left="2880" w:hanging="360"/>
+      </w:pPr>
+    </w:lvl>
+    <w:lvl w:ilvl="4" w:tplc="04160019" w:tentative="1">
+      <w:start w:val="1"/>
+      <w:numFmt w:val="lowerLetter"/>
+      <w:lvlText w:val="%5."/>
+      <w:lvlJc w:val="left"/>
+      <w:pPr>
+        <w:ind w:left="3600" w:hanging="360"/>
+      </w:pPr>
+    </w:lvl>
+    <w:lvl w:ilvl="5" w:tplc="0416001B" w:tentative="1">
+      <w:start w:val="1"/>
+      <w:numFmt w:val="lowerRoman"/>
+      <w:lvlText w:val="%6."/>
+      <w:lvlJc w:val="right"/>
+      <w:pPr>
+        <w:ind w:left="4320" w:hanging="180"/>
+      </w:pPr>
+    </w:lvl>
+    <w:lvl w:ilvl="6" w:tplc="0416000F" w:tentative="1">
+      <w:start w:val="1"/>
+      <w:numFmt w:val="decimal"/>
+      <w:lvlText w:val="%7."/>
+      <w:lvlJc w:val="left"/>
+      <w:pPr>
+        <w:ind w:left="5040" w:hanging="360"/>
+      </w:pPr>
+    </w:lvl>
+    <w:lvl w:ilvl="7" w:tplc="04160019" w:tentative="1">
+      <w:start w:val="1"/>
+      <w:numFmt w:val="lowerLetter"/>
+      <w:lvlText w:val="%8."/>
+      <w:lvlJc w:val="left"/>
+      <w:pPr>
+        <w:ind w:left="5760" w:hanging="360"/>
+      </w:pPr>
+    </w:lvl>
+    <w:lvl w:ilvl="8" w:tplc="0416001B" w:tentative="1">
+      <w:start w:val="1"/>
+      <w:numFmt w:val="lowerRoman"/>
+      <w:lvlText w:val="%9."/>
+      <w:lvlJc w:val="right"/>
+      <w:pPr>
+        <w:ind w:left="6480" w:hanging="180"/>
+      </w:pPr>
+    </w:lvl>
+  </w:abstractNum>
+  <w:abstractNum w:abstractNumId="9">
+    <w:nsid w:val="75ED497E"/>
+    <w:multiLevelType w:val="hybridMultilevel"/>
+    <w:tmpl w:val="37320A12"/>
+    <w:lvl w:ilvl="0" w:tplc="BA969FA2">
+      <w:start w:val="1"/>
+      <w:numFmt w:val="decimal"/>
+      <w:lvlText w:val="%1"/>
+      <w:lvlJc w:val="left"/>
+      <w:pPr>
+        <w:ind w:left="720" w:hanging="360"/>
+      </w:pPr>
+      <w:rPr>
+        <w:rFonts w:asciiTheme="minorHAnsi" w:hAnsiTheme="minorHAnsi" w:hint="default"/>
+      </w:rPr>
+    </w:lvl>
+    <w:lvl w:ilvl="1" w:tplc="04160019" w:tentative="1">
+      <w:start w:val="1"/>
+      <w:numFmt w:val="lowerLetter"/>
+      <w:lvlText w:val="%2."/>
+      <w:lvlJc w:val="left"/>
+      <w:pPr>
+        <w:ind w:left="1440" w:hanging="360"/>
+      </w:pPr>
+    </w:lvl>
+    <w:lvl w:ilvl="2" w:tplc="CE44ADCC">
+      <w:start w:val="1"/>
+      <w:numFmt w:val="decimal"/>
+      <w:lvlText w:val="%3"/>
+      <w:lvlJc w:val="right"/>
+      <w:pPr>
+        <w:ind w:left="2160" w:hanging="180"/>
+      </w:pPr>
+      <w:rPr>
+        <w:rFonts w:asciiTheme="minorHAnsi" w:eastAsiaTheme="minorHAnsi" w:hAnsiTheme="minorHAnsi" w:cstheme="minorHAnsi"/>
+      </w:rPr>
+    </w:lvl>
+    <w:lvl w:ilvl="3" w:tplc="0416000F" w:tentative="1">
+      <w:start w:val="1"/>
+      <w:numFmt w:val="decimal"/>
+      <w:lvlText w:val="%4."/>
+      <w:lvlJc w:val="left"/>
+      <w:pPr>
+        <w:ind w:left="2880" w:hanging="360"/>
+      </w:pPr>
+    </w:lvl>
+    <w:lvl w:ilvl="4" w:tplc="04160019" w:tentative="1">
+      <w:start w:val="1"/>
+      <w:numFmt w:val="lowerLetter"/>
+      <w:lvlText w:val="%5."/>
+      <w:lvlJc w:val="left"/>
+      <w:pPr>
+        <w:ind w:left="3600" w:hanging="360"/>
+      </w:pPr>
+    </w:lvl>
+    <w:lvl w:ilvl="5" w:tplc="0416001B" w:tentative="1">
+      <w:start w:val="1"/>
+      <w:numFmt w:val="lowerRoman"/>
+      <w:lvlText w:val="%6."/>
+      <w:lvlJc w:val="right"/>
+      <w:pPr>
+        <w:ind w:left="4320" w:hanging="180"/>
+      </w:pPr>
+    </w:lvl>
+    <w:lvl w:ilvl="6" w:tplc="0416000F" w:tentative="1">
+      <w:start w:val="1"/>
+      <w:numFmt w:val="decimal"/>
+      <w:lvlText w:val="%7."/>
+      <w:lvlJc w:val="left"/>
+      <w:pPr>
+        <w:ind w:left="5040" w:hanging="360"/>
+      </w:pPr>
+    </w:lvl>
+    <w:lvl w:ilvl="7" w:tplc="04160019" w:tentative="1">
+      <w:start w:val="1"/>
+      <w:numFmt w:val="lowerLetter"/>
+      <w:lvlText w:val="%8."/>
+      <w:lvlJc w:val="left"/>
+      <w:pPr>
+        <w:ind w:left="5760" w:hanging="360"/>
+      </w:pPr>
+    </w:lvl>
+    <w:lvl w:ilvl="8" w:tplc="0416001B" w:tentative="1">
+      <w:start w:val="1"/>
+      <w:numFmt w:val="lowerRoman"/>
+      <w:lvlText w:val="%9."/>
+      <w:lvlJc w:val="right"/>
+      <w:pPr>
+        <w:ind w:left="6480" w:hanging="180"/>
+      </w:pPr>
+    </w:lvl>
+  </w:abstractNum>
+  <w:abstractNum w:abstractNumId="10">
     <w:nsid w:val="76B12EA4"/>
     <w:multiLevelType w:val="hybridMultilevel"/>
     <w:tmpl w:val="E796EABA"/>
@@ -1089,14 +5261,207 @@
       </w:rPr>
     </w:lvl>
   </w:abstractNum>
+  <w:abstractNum w:abstractNumId="11">
+    <w:nsid w:val="79311FE4"/>
+    <w:multiLevelType w:val="hybridMultilevel"/>
+    <w:tmpl w:val="D1180322"/>
+    <w:lvl w:ilvl="0" w:tplc="42E6E10A">
+      <w:start w:val="1"/>
+      <w:numFmt w:val="decimal"/>
+      <w:lvlText w:val="%1"/>
+      <w:lvlJc w:val="left"/>
+      <w:pPr>
+        <w:ind w:left="720" w:hanging="360"/>
+      </w:pPr>
+      <w:rPr>
+        <w:rFonts w:asciiTheme="minorHAnsi" w:hAnsiTheme="minorHAnsi" w:hint="default"/>
+      </w:rPr>
+    </w:lvl>
+    <w:lvl w:ilvl="1" w:tplc="04160019" w:tentative="1">
+      <w:start w:val="1"/>
+      <w:numFmt w:val="lowerLetter"/>
+      <w:lvlText w:val="%2."/>
+      <w:lvlJc w:val="left"/>
+      <w:pPr>
+        <w:ind w:left="1440" w:hanging="360"/>
+      </w:pPr>
+    </w:lvl>
+    <w:lvl w:ilvl="2" w:tplc="0416001B" w:tentative="1">
+      <w:start w:val="1"/>
+      <w:numFmt w:val="lowerRoman"/>
+      <w:lvlText w:val="%3."/>
+      <w:lvlJc w:val="right"/>
+      <w:pPr>
+        <w:ind w:left="2160" w:hanging="180"/>
+      </w:pPr>
+    </w:lvl>
+    <w:lvl w:ilvl="3" w:tplc="0416000F" w:tentative="1">
+      <w:start w:val="1"/>
+      <w:numFmt w:val="decimal"/>
+      <w:lvlText w:val="%4."/>
+      <w:lvlJc w:val="left"/>
+      <w:pPr>
+        <w:ind w:left="2880" w:hanging="360"/>
+      </w:pPr>
+    </w:lvl>
+    <w:lvl w:ilvl="4" w:tplc="04160019" w:tentative="1">
+      <w:start w:val="1"/>
+      <w:numFmt w:val="lowerLetter"/>
+      <w:lvlText w:val="%5."/>
+      <w:lvlJc w:val="left"/>
+      <w:pPr>
+        <w:ind w:left="3600" w:hanging="360"/>
+      </w:pPr>
+    </w:lvl>
+    <w:lvl w:ilvl="5" w:tplc="0416001B" w:tentative="1">
+      <w:start w:val="1"/>
+      <w:numFmt w:val="lowerRoman"/>
+      <w:lvlText w:val="%6."/>
+      <w:lvlJc w:val="right"/>
+      <w:pPr>
+        <w:ind w:left="4320" w:hanging="180"/>
+      </w:pPr>
+    </w:lvl>
+    <w:lvl w:ilvl="6" w:tplc="0416000F" w:tentative="1">
+      <w:start w:val="1"/>
+      <w:numFmt w:val="decimal"/>
+      <w:lvlText w:val="%7."/>
+      <w:lvlJc w:val="left"/>
+      <w:pPr>
+        <w:ind w:left="5040" w:hanging="360"/>
+      </w:pPr>
+    </w:lvl>
+    <w:lvl w:ilvl="7" w:tplc="04160019" w:tentative="1">
+      <w:start w:val="1"/>
+      <w:numFmt w:val="lowerLetter"/>
+      <w:lvlText w:val="%8."/>
+      <w:lvlJc w:val="left"/>
+      <w:pPr>
+        <w:ind w:left="5760" w:hanging="360"/>
+      </w:pPr>
+    </w:lvl>
+    <w:lvl w:ilvl="8" w:tplc="0416001B" w:tentative="1">
+      <w:start w:val="1"/>
+      <w:numFmt w:val="lowerRoman"/>
+      <w:lvlText w:val="%9."/>
+      <w:lvlJc w:val="right"/>
+      <w:pPr>
+        <w:ind w:left="6480" w:hanging="180"/>
+      </w:pPr>
+    </w:lvl>
+  </w:abstractNum>
   <w:num w:numId="1">
-    <w:abstractNumId w:val="0"/>
+    <w:abstractNumId w:val="2"/>
   </w:num>
   <w:num w:numId="2">
+    <w:abstractNumId w:val="4"/>
+  </w:num>
+  <w:num w:numId="3">
+    <w:abstractNumId w:val="10"/>
+  </w:num>
+  <w:num w:numId="4">
+    <w:abstractNumId w:val="0"/>
+    <w:lvlOverride w:ilvl="0"/>
+    <w:lvlOverride w:ilvl="1">
+      <w:startOverride w:val="1"/>
+    </w:lvlOverride>
+    <w:lvlOverride w:ilvl="2">
+      <w:startOverride w:val="1"/>
+    </w:lvlOverride>
+    <w:lvlOverride w:ilvl="3">
+      <w:startOverride w:val="1"/>
+    </w:lvlOverride>
+    <w:lvlOverride w:ilvl="4">
+      <w:startOverride w:val="1"/>
+    </w:lvlOverride>
+    <w:lvlOverride w:ilvl="5">
+      <w:startOverride w:val="1"/>
+    </w:lvlOverride>
+    <w:lvlOverride w:ilvl="6">
+      <w:startOverride w:val="1"/>
+    </w:lvlOverride>
+    <w:lvlOverride w:ilvl="7">
+      <w:startOverride w:val="1"/>
+    </w:lvlOverride>
+    <w:lvlOverride w:ilvl="8">
+      <w:startOverride w:val="1"/>
+    </w:lvlOverride>
+  </w:num>
+  <w:num w:numId="5">
+    <w:abstractNumId w:val="3"/>
+    <w:lvlOverride w:ilvl="0"/>
+    <w:lvlOverride w:ilvl="1">
+      <w:startOverride w:val="1"/>
+    </w:lvlOverride>
+    <w:lvlOverride w:ilvl="2">
+      <w:startOverride w:val="1"/>
+    </w:lvlOverride>
+    <w:lvlOverride w:ilvl="3">
+      <w:startOverride w:val="2"/>
+    </w:lvlOverride>
+    <w:lvlOverride w:ilvl="4">
+      <w:startOverride w:val="1"/>
+    </w:lvlOverride>
+    <w:lvlOverride w:ilvl="5">
+      <w:startOverride w:val="1"/>
+    </w:lvlOverride>
+    <w:lvlOverride w:ilvl="6">
+      <w:startOverride w:val="1"/>
+    </w:lvlOverride>
+    <w:lvlOverride w:ilvl="7">
+      <w:startOverride w:val="1"/>
+    </w:lvlOverride>
+    <w:lvlOverride w:ilvl="8">
+      <w:startOverride w:val="1"/>
+    </w:lvlOverride>
+  </w:num>
+  <w:num w:numId="6">
+    <w:abstractNumId w:val="5"/>
+    <w:lvlOverride w:ilvl="0">
+      <w:startOverride w:val="1"/>
+    </w:lvlOverride>
+    <w:lvlOverride w:ilvl="1">
+      <w:startOverride w:val="1"/>
+    </w:lvlOverride>
+    <w:lvlOverride w:ilvl="2">
+      <w:startOverride w:val="1"/>
+    </w:lvlOverride>
+    <w:lvlOverride w:ilvl="3">
+      <w:startOverride w:val="1"/>
+    </w:lvlOverride>
+    <w:lvlOverride w:ilvl="4">
+      <w:startOverride w:val="1"/>
+    </w:lvlOverride>
+    <w:lvlOverride w:ilvl="5">
+      <w:startOverride w:val="1"/>
+    </w:lvlOverride>
+    <w:lvlOverride w:ilvl="6">
+      <w:startOverride w:val="1"/>
+    </w:lvlOverride>
+    <w:lvlOverride w:ilvl="7">
+      <w:startOverride w:val="1"/>
+    </w:lvlOverride>
+    <w:lvlOverride w:ilvl="8">
+      <w:startOverride w:val="1"/>
+    </w:lvlOverride>
+  </w:num>
+  <w:num w:numId="7">
+    <w:abstractNumId w:val="9"/>
+  </w:num>
+  <w:num w:numId="8">
     <w:abstractNumId w:val="1"/>
   </w:num>
-  <w:num w:numId="3">
-    <w:abstractNumId w:val="2"/>
+  <w:num w:numId="9">
+    <w:abstractNumId w:val="6"/>
+  </w:num>
+  <w:num w:numId="10">
+    <w:abstractNumId w:val="7"/>
+  </w:num>
+  <w:num w:numId="11">
+    <w:abstractNumId w:val="8"/>
+  </w:num>
+  <w:num w:numId="12">
+    <w:abstractNumId w:val="11"/>
   </w:num>
 </w:numbering>
 </file>
@@ -1260,6 +5625,7 @@
   <w:style w:type="paragraph" w:default="1" w:styleId="Normal">
     <w:name w:val="Normal"/>
     <w:qFormat/>
+    <w:rsid w:val="00E836AC"/>
   </w:style>
   <w:style w:type="character" w:default="1" w:styleId="Tipodeletrapredefinidodopargrafo">
     <w:name w:val="Default Paragraph Font"/>
@@ -1354,6 +5720,93 @@
       <w:sz w:val="16"/>
       <w:szCs w:val="16"/>
     </w:rPr>
+  </w:style>
+  <w:style w:type="table" w:customStyle="1" w:styleId="TabeladeGrelha4-Destaque12">
+    <w:name w:val="Tabela de Grelha 4 - Destaque 12"/>
+    <w:basedOn w:val="Tabelanormal"/>
+    <w:uiPriority w:val="49"/>
+    <w:rsid w:val="001A0AD1"/>
+    <w:pPr>
+      <w:spacing w:after="0" w:line="240" w:lineRule="auto"/>
+    </w:pPr>
+    <w:rPr>
+      <w:sz w:val="24"/>
+      <w:szCs w:val="24"/>
+      <w:lang w:val="pt-PT"/>
+    </w:rPr>
+    <w:tblPr>
+      <w:tblStyleRowBandSize w:val="1"/>
+      <w:tblStyleColBandSize w:val="1"/>
+      <w:tblBorders>
+        <w:top w:val="single" w:sz="4" w:space="0" w:color="95B3D7" w:themeColor="accent1" w:themeTint="99"/>
+        <w:left w:val="single" w:sz="4" w:space="0" w:color="95B3D7" w:themeColor="accent1" w:themeTint="99"/>
+        <w:bottom w:val="single" w:sz="4" w:space="0" w:color="95B3D7" w:themeColor="accent1" w:themeTint="99"/>
+        <w:right w:val="single" w:sz="4" w:space="0" w:color="95B3D7" w:themeColor="accent1" w:themeTint="99"/>
+        <w:insideH w:val="single" w:sz="4" w:space="0" w:color="95B3D7" w:themeColor="accent1" w:themeTint="99"/>
+        <w:insideV w:val="single" w:sz="4" w:space="0" w:color="95B3D7" w:themeColor="accent1" w:themeTint="99"/>
+      </w:tblBorders>
+      <w:tblCellMar>
+        <w:top w:w="0" w:type="dxa"/>
+        <w:left w:w="108" w:type="dxa"/>
+        <w:bottom w:w="0" w:type="dxa"/>
+        <w:right w:w="108" w:type="dxa"/>
+      </w:tblCellMar>
+    </w:tblPr>
+    <w:tblStylePr w:type="firstRow">
+      <w:rPr>
+        <w:b/>
+        <w:bCs/>
+        <w:color w:val="FFFFFF" w:themeColor="background1"/>
+      </w:rPr>
+      <w:tblPr/>
+      <w:tcPr>
+        <w:tcBorders>
+          <w:top w:val="single" w:sz="4" w:space="0" w:color="4F81BD" w:themeColor="accent1"/>
+          <w:left w:val="single" w:sz="4" w:space="0" w:color="4F81BD" w:themeColor="accent1"/>
+          <w:bottom w:val="single" w:sz="4" w:space="0" w:color="4F81BD" w:themeColor="accent1"/>
+          <w:right w:val="single" w:sz="4" w:space="0" w:color="4F81BD" w:themeColor="accent1"/>
+          <w:insideH w:val="nil"/>
+          <w:insideV w:val="nil"/>
+        </w:tcBorders>
+        <w:shd w:val="clear" w:color="auto" w:fill="4F81BD" w:themeFill="accent1"/>
+      </w:tcPr>
+    </w:tblStylePr>
+    <w:tblStylePr w:type="lastRow">
+      <w:rPr>
+        <w:b/>
+        <w:bCs/>
+      </w:rPr>
+      <w:tblPr/>
+      <w:tcPr>
+        <w:tcBorders>
+          <w:top w:val="double" w:sz="4" w:space="0" w:color="4F81BD" w:themeColor="accent1"/>
+        </w:tcBorders>
+      </w:tcPr>
+    </w:tblStylePr>
+    <w:tblStylePr w:type="firstCol">
+      <w:rPr>
+        <w:b/>
+        <w:bCs/>
+      </w:rPr>
+    </w:tblStylePr>
+    <w:tblStylePr w:type="lastCol">
+      <w:rPr>
+        <w:b/>
+        <w:bCs/>
+      </w:rPr>
+    </w:tblStylePr>
+    <w:tblStylePr w:type="band1Vert">
+      <w:tblPr/>
+      <w:tcPr>
+        <w:shd w:val="clear" w:color="auto" w:fill="DBE5F1" w:themeFill="accent1" w:themeFillTint="33"/>
+      </w:tcPr>
+    </w:tblStylePr>
+    <w:tblStylePr w:type="band1Horz">
+      <w:tblPr/>
+      <w:tcPr>
+        <w:shd w:val="clear" w:color="auto" w:fill="DBE5F1" w:themeFill="accent1" w:themeFillTint="33"/>
+      </w:tcPr>
+    </w:tblStylePr>
   </w:style>
 </w:styles>
 </file>
@@ -1517,6 +5970,7 @@
   <w:style w:type="paragraph" w:default="1" w:styleId="Normal">
     <w:name w:val="Normal"/>
     <w:qFormat/>
+    <w:rsid w:val="00E836AC"/>
   </w:style>
   <w:style w:type="character" w:default="1" w:styleId="Tipodeletrapredefinidodopargrafo">
     <w:name w:val="Default Paragraph Font"/>
@@ -1611,6 +6065,93 @@
       <w:sz w:val="16"/>
       <w:szCs w:val="16"/>
     </w:rPr>
+  </w:style>
+  <w:style w:type="table" w:customStyle="1" w:styleId="TabeladeGrelha4-Destaque12">
+    <w:name w:val="Tabela de Grelha 4 - Destaque 12"/>
+    <w:basedOn w:val="Tabelanormal"/>
+    <w:uiPriority w:val="49"/>
+    <w:rsid w:val="001A0AD1"/>
+    <w:pPr>
+      <w:spacing w:after="0" w:line="240" w:lineRule="auto"/>
+    </w:pPr>
+    <w:rPr>
+      <w:sz w:val="24"/>
+      <w:szCs w:val="24"/>
+      <w:lang w:val="pt-PT"/>
+    </w:rPr>
+    <w:tblPr>
+      <w:tblStyleRowBandSize w:val="1"/>
+      <w:tblStyleColBandSize w:val="1"/>
+      <w:tblBorders>
+        <w:top w:val="single" w:sz="4" w:space="0" w:color="95B3D7" w:themeColor="accent1" w:themeTint="99"/>
+        <w:left w:val="single" w:sz="4" w:space="0" w:color="95B3D7" w:themeColor="accent1" w:themeTint="99"/>
+        <w:bottom w:val="single" w:sz="4" w:space="0" w:color="95B3D7" w:themeColor="accent1" w:themeTint="99"/>
+        <w:right w:val="single" w:sz="4" w:space="0" w:color="95B3D7" w:themeColor="accent1" w:themeTint="99"/>
+        <w:insideH w:val="single" w:sz="4" w:space="0" w:color="95B3D7" w:themeColor="accent1" w:themeTint="99"/>
+        <w:insideV w:val="single" w:sz="4" w:space="0" w:color="95B3D7" w:themeColor="accent1" w:themeTint="99"/>
+      </w:tblBorders>
+      <w:tblCellMar>
+        <w:top w:w="0" w:type="dxa"/>
+        <w:left w:w="108" w:type="dxa"/>
+        <w:bottom w:w="0" w:type="dxa"/>
+        <w:right w:w="108" w:type="dxa"/>
+      </w:tblCellMar>
+    </w:tblPr>
+    <w:tblStylePr w:type="firstRow">
+      <w:rPr>
+        <w:b/>
+        <w:bCs/>
+        <w:color w:val="FFFFFF" w:themeColor="background1"/>
+      </w:rPr>
+      <w:tblPr/>
+      <w:tcPr>
+        <w:tcBorders>
+          <w:top w:val="single" w:sz="4" w:space="0" w:color="4F81BD" w:themeColor="accent1"/>
+          <w:left w:val="single" w:sz="4" w:space="0" w:color="4F81BD" w:themeColor="accent1"/>
+          <w:bottom w:val="single" w:sz="4" w:space="0" w:color="4F81BD" w:themeColor="accent1"/>
+          <w:right w:val="single" w:sz="4" w:space="0" w:color="4F81BD" w:themeColor="accent1"/>
+          <w:insideH w:val="nil"/>
+          <w:insideV w:val="nil"/>
+        </w:tcBorders>
+        <w:shd w:val="clear" w:color="auto" w:fill="4F81BD" w:themeFill="accent1"/>
+      </w:tcPr>
+    </w:tblStylePr>
+    <w:tblStylePr w:type="lastRow">
+      <w:rPr>
+        <w:b/>
+        <w:bCs/>
+      </w:rPr>
+      <w:tblPr/>
+      <w:tcPr>
+        <w:tcBorders>
+          <w:top w:val="double" w:sz="4" w:space="0" w:color="4F81BD" w:themeColor="accent1"/>
+        </w:tcBorders>
+      </w:tcPr>
+    </w:tblStylePr>
+    <w:tblStylePr w:type="firstCol">
+      <w:rPr>
+        <w:b/>
+        <w:bCs/>
+      </w:rPr>
+    </w:tblStylePr>
+    <w:tblStylePr w:type="lastCol">
+      <w:rPr>
+        <w:b/>
+        <w:bCs/>
+      </w:rPr>
+    </w:tblStylePr>
+    <w:tblStylePr w:type="band1Vert">
+      <w:tblPr/>
+      <w:tcPr>
+        <w:shd w:val="clear" w:color="auto" w:fill="DBE5F1" w:themeFill="accent1" w:themeFillTint="33"/>
+      </w:tcPr>
+    </w:tblStylePr>
+    <w:tblStylePr w:type="band1Horz">
+      <w:tblPr/>
+      <w:tcPr>
+        <w:shd w:val="clear" w:color="auto" w:fill="DBE5F1" w:themeFill="accent1" w:themeFillTint="33"/>
+      </w:tcPr>
+    </w:tblStylePr>
   </w:style>
 </w:styles>
 </file>

</xml_diff>

<commit_message>
fix: add the model extruture
</commit_message>
<xml_diff>
--- a/docs/Projecto de um contador de energia.docx
+++ b/docs/Projecto de um contador de energia.docx
@@ -839,7 +839,6 @@
       <w:tblPr>
         <w:tblStyle w:val="TabeladeGrelha4-Destaque12"/>
         <w:tblW w:w="0" w:type="auto"/>
-        <w:tblInd w:w="0" w:type="dxa"/>
         <w:tblLook w:val="04A0" w:firstRow="1" w:lastRow="0" w:firstColumn="1" w:lastColumn="0" w:noHBand="0" w:noVBand="1"/>
       </w:tblPr>
       <w:tblGrid>
@@ -855,9 +854,6 @@
           <w:tcPr>
             <w:cnfStyle w:val="001000000000" w:firstRow="0" w:lastRow="0" w:firstColumn="1" w:lastColumn="0" w:oddVBand="0" w:evenVBand="0" w:oddHBand="0" w:evenHBand="0" w:firstRowFirstColumn="0" w:firstRowLastColumn="0" w:lastRowFirstColumn="0" w:lastRowLastColumn="0"/>
             <w:tcW w:w="4508" w:type="dxa"/>
-            <w:tcBorders>
-              <w:right w:val="nil"/>
-            </w:tcBorders>
             <w:vAlign w:val="center"/>
             <w:hideMark/>
           </w:tcPr>
@@ -875,9 +871,6 @@
         <w:tc>
           <w:tcPr>
             <w:tcW w:w="4508" w:type="dxa"/>
-            <w:tcBorders>
-              <w:left w:val="nil"/>
-            </w:tcBorders>
             <w:vAlign w:val="center"/>
             <w:hideMark/>
           </w:tcPr>
@@ -1442,7 +1435,6 @@
       <w:tblPr>
         <w:tblStyle w:val="TabeladeGrelha4-Destaque12"/>
         <w:tblW w:w="0" w:type="auto"/>
-        <w:tblInd w:w="0" w:type="dxa"/>
         <w:tblLook w:val="04A0" w:firstRow="1" w:lastRow="0" w:firstColumn="1" w:lastColumn="0" w:noHBand="0" w:noVBand="1"/>
       </w:tblPr>
       <w:tblGrid>
@@ -1458,9 +1450,6 @@
           <w:tcPr>
             <w:cnfStyle w:val="001000000000" w:firstRow="0" w:lastRow="0" w:firstColumn="1" w:lastColumn="0" w:oddVBand="0" w:evenVBand="0" w:oddHBand="0" w:evenHBand="0" w:firstRowFirstColumn="0" w:firstRowLastColumn="0" w:lastRowFirstColumn="0" w:lastRowLastColumn="0"/>
             <w:tcW w:w="4508" w:type="dxa"/>
-            <w:tcBorders>
-              <w:right w:val="nil"/>
-            </w:tcBorders>
             <w:vAlign w:val="center"/>
             <w:hideMark/>
           </w:tcPr>
@@ -1478,9 +1467,6 @@
         <w:tc>
           <w:tcPr>
             <w:tcW w:w="4508" w:type="dxa"/>
-            <w:tcBorders>
-              <w:left w:val="nil"/>
-            </w:tcBorders>
             <w:vAlign w:val="center"/>
             <w:hideMark/>
           </w:tcPr>
@@ -1902,10 +1888,7 @@
               </w:rPr>
             </w:pPr>
             <w:r>
-              <w:t xml:space="preserve">Apresentar o campo de </w:t>
-            </w:r>
-            <w:r>
-              <w:t>in</w:t>
+              <w:t>Apresentar o campo de in</w:t>
             </w:r>
             <w:r>
               <w:t>í</w:t>
@@ -2029,7 +2012,6 @@
       <w:tblPr>
         <w:tblStyle w:val="TabeladeGrelha4-Destaque12"/>
         <w:tblW w:w="0" w:type="auto"/>
-        <w:tblInd w:w="0" w:type="dxa"/>
         <w:tblLook w:val="04A0" w:firstRow="1" w:lastRow="0" w:firstColumn="1" w:lastColumn="0" w:noHBand="0" w:noVBand="1"/>
       </w:tblPr>
       <w:tblGrid>
@@ -2045,9 +2027,6 @@
           <w:tcPr>
             <w:cnfStyle w:val="001000000000" w:firstRow="0" w:lastRow="0" w:firstColumn="1" w:lastColumn="0" w:oddVBand="0" w:evenVBand="0" w:oddHBand="0" w:evenHBand="0" w:firstRowFirstColumn="0" w:firstRowLastColumn="0" w:lastRowFirstColumn="0" w:lastRowLastColumn="0"/>
             <w:tcW w:w="4508" w:type="dxa"/>
-            <w:tcBorders>
-              <w:right w:val="nil"/>
-            </w:tcBorders>
             <w:vAlign w:val="center"/>
             <w:hideMark/>
           </w:tcPr>
@@ -2065,9 +2044,6 @@
         <w:tc>
           <w:tcPr>
             <w:tcW w:w="4508" w:type="dxa"/>
-            <w:tcBorders>
-              <w:left w:val="nil"/>
-            </w:tcBorders>
             <w:vAlign w:val="center"/>
             <w:hideMark/>
           </w:tcPr>
@@ -2292,13 +2268,7 @@
               </w:rPr>
             </w:pPr>
             <w:r>
-              <w:t xml:space="preserve">Ser </w:t>
-            </w:r>
-            <w:r>
-              <w:t>a</w:t>
-            </w:r>
-            <w:r>
-              <w:t xml:space="preserve"> secretaria</w:t>
+              <w:t>Ser a secretaria</w:t>
             </w:r>
           </w:p>
         </w:tc>
@@ -2426,13 +2396,7 @@
               <w:rPr>
                 <w:rFonts w:cstheme="minorHAnsi"/>
               </w:rPr>
-              <w:t xml:space="preserve">Clicar </w:t>
-            </w:r>
-            <w:r>
-              <w:rPr>
-                <w:rFonts w:cstheme="minorHAnsi"/>
-              </w:rPr>
-              <w:t>em registo de consumo de energia</w:t>
+              <w:t>Clicar em registo de consumo de energia</w:t>
             </w:r>
           </w:p>
           <w:p>
@@ -2536,10 +2500,7 @@
               </w:rPr>
             </w:pPr>
             <w:r>
-              <w:t xml:space="preserve">Apresentar o campo de </w:t>
-            </w:r>
-            <w:r>
-              <w:t xml:space="preserve">registo de consumo de </w:t>
+              <w:t xml:space="preserve">Apresentar o campo de registo de consumo de </w:t>
             </w:r>
             <w:proofErr w:type="spellStart"/>
             <w:r>
@@ -2560,10 +2521,7 @@
               </w:rPr>
             </w:pPr>
             <w:r>
-              <w:t>Validar os dados preenchidos</w:t>
-            </w:r>
-            <w:r>
-              <w:t>, fazendo análise do consumo anterior determinando se ouve um aumento ou queda no consumo</w:t>
+              <w:t>Validar os dados preenchidos, fazendo análise do consumo anterior determinando se ouve um aumento ou queda no consumo</w:t>
             </w:r>
             <w:r>
               <w:t xml:space="preserve"> e armazená-los</w:t>
@@ -2641,7 +2599,6 @@
       <w:tblPr>
         <w:tblStyle w:val="TabeladeGrelha4-Destaque12"/>
         <w:tblW w:w="0" w:type="auto"/>
-        <w:tblInd w:w="0" w:type="dxa"/>
         <w:tblLook w:val="04A0" w:firstRow="1" w:lastRow="0" w:firstColumn="1" w:lastColumn="0" w:noHBand="0" w:noVBand="1"/>
       </w:tblPr>
       <w:tblGrid>
@@ -2657,9 +2614,6 @@
           <w:tcPr>
             <w:cnfStyle w:val="001000000000" w:firstRow="0" w:lastRow="0" w:firstColumn="1" w:lastColumn="0" w:oddVBand="0" w:evenVBand="0" w:oddHBand="0" w:evenHBand="0" w:firstRowFirstColumn="0" w:firstRowLastColumn="0" w:lastRowFirstColumn="0" w:lastRowLastColumn="0"/>
             <w:tcW w:w="4508" w:type="dxa"/>
-            <w:tcBorders>
-              <w:right w:val="nil"/>
-            </w:tcBorders>
             <w:vAlign w:val="center"/>
             <w:hideMark/>
           </w:tcPr>
@@ -2677,9 +2631,6 @@
         <w:tc>
           <w:tcPr>
             <w:tcW w:w="4508" w:type="dxa"/>
-            <w:tcBorders>
-              <w:left w:val="nil"/>
-            </w:tcBorders>
             <w:vAlign w:val="center"/>
             <w:hideMark/>
           </w:tcPr>
@@ -3117,7 +3068,6 @@
       <w:tblPr>
         <w:tblStyle w:val="TabeladeGrelha4-Destaque12"/>
         <w:tblW w:w="0" w:type="auto"/>
-        <w:tblInd w:w="0" w:type="dxa"/>
         <w:tblLook w:val="04A0" w:firstRow="1" w:lastRow="0" w:firstColumn="1" w:lastColumn="0" w:noHBand="0" w:noVBand="1"/>
       </w:tblPr>
       <w:tblGrid>
@@ -3133,9 +3083,6 @@
           <w:tcPr>
             <w:cnfStyle w:val="001000000000" w:firstRow="0" w:lastRow="0" w:firstColumn="1" w:lastColumn="0" w:oddVBand="0" w:evenVBand="0" w:oddHBand="0" w:evenHBand="0" w:firstRowFirstColumn="0" w:firstRowLastColumn="0" w:lastRowFirstColumn="0" w:lastRowLastColumn="0"/>
             <w:tcW w:w="4508" w:type="dxa"/>
-            <w:tcBorders>
-              <w:right w:val="nil"/>
-            </w:tcBorders>
             <w:vAlign w:val="center"/>
             <w:hideMark/>
           </w:tcPr>
@@ -3153,9 +3100,6 @@
         <w:tc>
           <w:tcPr>
             <w:tcW w:w="4508" w:type="dxa"/>
-            <w:tcBorders>
-              <w:left w:val="nil"/>
-            </w:tcBorders>
             <w:vAlign w:val="center"/>
             <w:hideMark/>
           </w:tcPr>
@@ -3679,7 +3623,6 @@
       <w:tblPr>
         <w:tblStyle w:val="TabeladeGrelha4-Destaque12"/>
         <w:tblW w:w="0" w:type="auto"/>
-        <w:tblInd w:w="0" w:type="dxa"/>
         <w:tblLook w:val="04A0" w:firstRow="1" w:lastRow="0" w:firstColumn="1" w:lastColumn="0" w:noHBand="0" w:noVBand="1"/>
       </w:tblPr>
       <w:tblGrid>
@@ -3695,9 +3638,6 @@
           <w:tcPr>
             <w:cnfStyle w:val="001000000000" w:firstRow="0" w:lastRow="0" w:firstColumn="1" w:lastColumn="0" w:oddVBand="0" w:evenVBand="0" w:oddHBand="0" w:evenHBand="0" w:firstRowFirstColumn="0" w:firstRowLastColumn="0" w:lastRowFirstColumn="0" w:lastRowLastColumn="0"/>
             <w:tcW w:w="4508" w:type="dxa"/>
-            <w:tcBorders>
-              <w:right w:val="nil"/>
-            </w:tcBorders>
             <w:vAlign w:val="center"/>
             <w:hideMark/>
           </w:tcPr>
@@ -3715,9 +3655,6 @@
         <w:tc>
           <w:tcPr>
             <w:tcW w:w="4508" w:type="dxa"/>
-            <w:tcBorders>
-              <w:left w:val="nil"/>
-            </w:tcBorders>
             <w:vAlign w:val="center"/>
             <w:hideMark/>
           </w:tcPr>
@@ -3732,13 +3669,7 @@
               <w:cnfStyle w:val="100000000000" w:firstRow="1" w:lastRow="0" w:firstColumn="0" w:lastColumn="0" w:oddVBand="0" w:evenVBand="0" w:oddHBand="0" w:evenHBand="0" w:firstRowFirstColumn="0" w:firstRowLastColumn="0" w:lastRowFirstColumn="0" w:lastRowLastColumn="0"/>
             </w:pPr>
             <w:r>
-              <w:t>Extrair o relatório de</w:t>
-            </w:r>
-            <w:r>
-              <w:t xml:space="preserve"> </w:t>
-            </w:r>
-            <w:r>
-              <w:t>pagamento</w:t>
+              <w:t>Extrair o relatório de pagamento</w:t>
             </w:r>
           </w:p>
         </w:tc>
@@ -3843,10 +3774,7 @@
               </w:rPr>
             </w:pPr>
             <w:r>
-              <w:t>Monitorar a variação dos gastos</w:t>
-            </w:r>
-            <w:r>
-              <w:t xml:space="preserve"> </w:t>
+              <w:t xml:space="preserve">Monitorar a variação dos gastos </w:t>
             </w:r>
           </w:p>
         </w:tc>
@@ -3884,21 +3812,7 @@
                 <w:b w:val="0"/>
                 <w:bCs w:val="0"/>
               </w:rPr>
-              <w:t xml:space="preserve">O director deverá </w:t>
-            </w:r>
-            <w:r>
-              <w:rPr>
-                <w:b w:val="0"/>
-                <w:bCs w:val="0"/>
-              </w:rPr>
-              <w:t xml:space="preserve">ter acesso ao relatório dos gastos de pagamento </w:t>
-            </w:r>
-            <w:r>
-              <w:rPr>
-                <w:b w:val="0"/>
-                <w:bCs w:val="0"/>
-              </w:rPr>
-              <w:t>de energia.</w:t>
+              <w:t>O director deverá ter acesso ao relatório dos gastos de pagamento de energia.</w:t>
             </w:r>
           </w:p>
         </w:tc>
@@ -4075,19 +3989,11 @@
                 <w:rFonts w:cstheme="minorHAnsi"/>
               </w:rPr>
             </w:pPr>
-            <w:bookmarkStart w:id="0" w:name="_GoBack"/>
-            <w:bookmarkEnd w:id="0"/>
             <w:r>
               <w:rPr>
                 <w:rFonts w:cstheme="minorHAnsi"/>
               </w:rPr>
-              <w:t xml:space="preserve">Clicar em relatório de </w:t>
-            </w:r>
-            <w:r>
-              <w:rPr>
-                <w:rFonts w:cstheme="minorHAnsi"/>
-              </w:rPr>
-              <w:t xml:space="preserve">pagamento energia </w:t>
+              <w:t xml:space="preserve">Clicar em relatório de pagamento energia </w:t>
             </w:r>
           </w:p>
           <w:p>
@@ -4131,15 +4037,7 @@
                 <w:b w:val="0"/>
                 <w:bCs w:val="0"/>
               </w:rPr>
-              <w:t xml:space="preserve">Clicar em extrair relatório de </w:t>
-            </w:r>
-            <w:r>
-              <w:rPr>
-                <w:rFonts w:cstheme="minorHAnsi"/>
-                <w:b w:val="0"/>
-                <w:bCs w:val="0"/>
-              </w:rPr>
-              <w:t>pagamento de energia</w:t>
+              <w:t>Clicar em extrair relatório de pagamento de energia</w:t>
             </w:r>
           </w:p>
         </w:tc>
@@ -4167,13 +4065,7 @@
               </w:rPr>
             </w:pPr>
             <w:r>
-              <w:t xml:space="preserve">Apresentar a área para extrair o </w:t>
-            </w:r>
-            <w:r>
-              <w:t>pagamento</w:t>
-            </w:r>
-            <w:r>
-              <w:t>.</w:t>
+              <w:t>Apresentar a área para extrair o pagamento.</w:t>
             </w:r>
           </w:p>
           <w:p>
@@ -4205,10 +4097,7 @@
               </w:rPr>
             </w:pPr>
             <w:r>
-              <w:t xml:space="preserve">Apresentar o relatório de </w:t>
-            </w:r>
-            <w:r>
-              <w:t>pagamento de energia</w:t>
+              <w:t>Apresentar o relatório de pagamento de energia</w:t>
             </w:r>
           </w:p>
           <w:p>
@@ -4234,6 +4123,109 @@
           <w:szCs w:val="28"/>
         </w:rPr>
       </w:pPr>
+    </w:p>
+    <w:p>
+      <w:pPr>
+        <w:rPr>
+          <w:b/>
+          <w:sz w:val="28"/>
+          <w:szCs w:val="28"/>
+        </w:rPr>
+      </w:pPr>
+      <w:r>
+        <w:rPr>
+          <w:b/>
+          <w:sz w:val="28"/>
+          <w:szCs w:val="28"/>
+        </w:rPr>
+        <w:br w:type="page"/>
+      </w:r>
+    </w:p>
+    <w:p>
+      <w:pPr>
+        <w:tabs>
+          <w:tab w:val="left" w:pos="930"/>
+        </w:tabs>
+        <w:jc w:val="center"/>
+        <w:rPr>
+          <w:b/>
+          <w:sz w:val="28"/>
+          <w:szCs w:val="28"/>
+        </w:rPr>
+      </w:pPr>
+    </w:p>
+    <w:p>
+      <w:pPr>
+        <w:tabs>
+          <w:tab w:val="left" w:pos="930"/>
+        </w:tabs>
+        <w:jc w:val="center"/>
+        <w:rPr>
+          <w:b/>
+          <w:sz w:val="28"/>
+          <w:szCs w:val="28"/>
+        </w:rPr>
+      </w:pPr>
+      <w:bookmarkStart w:id="0" w:name="_GoBack"/>
+      <w:r>
+        <w:rPr>
+          <w:b/>
+          <w:noProof/>
+          <w:sz w:val="28"/>
+          <w:szCs w:val="28"/>
+          <w:lang w:eastAsia="pt-BR"/>
+        </w:rPr>
+        <w:drawing>
+          <wp:anchor distT="0" distB="0" distL="114300" distR="114300" simplePos="0" relativeHeight="251660288" behindDoc="0" locked="0" layoutInCell="1" allowOverlap="1">
+            <wp:simplePos x="1428750" y="1273175"/>
+            <wp:positionH relativeFrom="margin">
+              <wp:align>center</wp:align>
+            </wp:positionH>
+            <wp:positionV relativeFrom="margin">
+              <wp:align>center</wp:align>
+            </wp:positionV>
+            <wp:extent cx="4705350" cy="5248275"/>
+            <wp:effectExtent l="0" t="0" r="0" b="9525"/>
+            <wp:wrapSquare wrapText="bothSides"/>
+            <wp:docPr id="1" name="Imagem 1"/>
+            <wp:cNvGraphicFramePr>
+              <a:graphicFrameLocks xmlns:a="http://schemas.openxmlformats.org/drawingml/2006/main" noChangeAspect="1"/>
+            </wp:cNvGraphicFramePr>
+            <a:graphic xmlns:a="http://schemas.openxmlformats.org/drawingml/2006/main">
+              <a:graphicData uri="http://schemas.openxmlformats.org/drawingml/2006/picture">
+                <pic:pic xmlns:pic="http://schemas.openxmlformats.org/drawingml/2006/picture">
+                  <pic:nvPicPr>
+                    <pic:cNvPr id="0" name="Diagrama .drawio.png"/>
+                    <pic:cNvPicPr/>
+                  </pic:nvPicPr>
+                  <pic:blipFill>
+                    <a:blip r:embed="rId7">
+                      <a:extLst>
+                        <a:ext uri="{28A0092B-C50C-407E-A947-70E740481C1C}">
+                          <a14:useLocalDpi xmlns:a14="http://schemas.microsoft.com/office/drawing/2010/main" val="0"/>
+                        </a:ext>
+                      </a:extLst>
+                    </a:blip>
+                    <a:stretch>
+                      <a:fillRect/>
+                    </a:stretch>
+                  </pic:blipFill>
+                  <pic:spPr>
+                    <a:xfrm>
+                      <a:off x="0" y="0"/>
+                      <a:ext cx="4705350" cy="5248275"/>
+                    </a:xfrm>
+                    <a:prstGeom prst="rect">
+                      <a:avLst/>
+                    </a:prstGeom>
+                  </pic:spPr>
+                </pic:pic>
+              </a:graphicData>
+            </a:graphic>
+          </wp:anchor>
+        </w:drawing>
+      </w:r>
+      <w:bookmarkEnd w:id="0"/>
     </w:p>
     <w:sectPr>
       <w:pgSz w:w="11906" w:h="16838"/>
@@ -5737,6 +5729,7 @@
     <w:tblPr>
       <w:tblStyleRowBandSize w:val="1"/>
       <w:tblStyleColBandSize w:val="1"/>
+      <w:tblInd w:w="0" w:type="dxa"/>
       <w:tblBorders>
         <w:top w:val="single" w:sz="4" w:space="0" w:color="95B3D7" w:themeColor="accent1" w:themeTint="99"/>
         <w:left w:val="single" w:sz="4" w:space="0" w:color="95B3D7" w:themeColor="accent1" w:themeTint="99"/>
@@ -6082,6 +6075,7 @@
     <w:tblPr>
       <w:tblStyleRowBandSize w:val="1"/>
       <w:tblStyleColBandSize w:val="1"/>
+      <w:tblInd w:w="0" w:type="dxa"/>
       <w:tblBorders>
         <w:top w:val="single" w:sz="4" w:space="0" w:color="95B3D7" w:themeColor="accent1" w:themeTint="99"/>
         <w:left w:val="single" w:sz="4" w:space="0" w:color="95B3D7" w:themeColor="accent1" w:themeTint="99"/>

</xml_diff>